<commit_message>
Rename to ModeColle and redesign UI in CustomTkinter
- 名称を ModeColle (Model Collection) に統一（リポジトリ／起動ファイル／UI英語名）
- UIを CustomTkinter で全面刷新：白基調・角丸・操作ボタンの序列・空状態・検索・選択時フラッシュ
- リネーム／コピー／派生のダイアログをテーマ統一＋元の名前を初期表示
- 用途説明から個人ニックネームを除去
- 旧UI(modekore.py)は手元の残骸フォルダへ退役

Co-Authored-By: Claude Opus 4.8 <noreply@anthropic.com>
</commit_message>
<xml_diff>
--- a/マニュアル/もでコレ_マニュアル.docx
+++ b/マニュアル/もでコレ_マニュアル.docx
@@ -5,7 +5,7 @@
     <w:p>
       <w:pPr>
         <w:pStyle w:val="1"/>
-        <w:divId w:val="2030140560"/>
+        <w:divId w:val="83376929"/>
         <w:rPr>
           <w:rFonts w:ascii="Yu Gothic UI" w:eastAsia="Yu Gothic UI" w:hAnsi="Yu Gothic UI"/>
         </w:rPr>
@@ -32,7 +32,7 @@
     <w:p>
       <w:pPr>
         <w:pStyle w:val="2"/>
-        <w:divId w:val="2030140560"/>
+        <w:divId w:val="83376929"/>
         <w:rPr>
           <w:rFonts w:ascii="Yu Gothic UI" w:eastAsia="Yu Gothic UI" w:hAnsi="Yu Gothic UI" w:hint="eastAsia"/>
         </w:rPr>
@@ -53,7 +53,7 @@
     <w:p>
       <w:pPr>
         <w:pStyle w:val="Web"/>
-        <w:divId w:val="2030140560"/>
+        <w:divId w:val="83376929"/>
         <w:rPr>
           <w:rFonts w:ascii="Yu Gothic UI" w:eastAsia="Yu Gothic UI" w:hAnsi="Yu Gothic UI" w:hint="eastAsia"/>
           <w:color w:val="1E1E2E"/>
@@ -156,7 +156,7 @@
     <w:p>
       <w:pPr>
         <w:pStyle w:val="Web"/>
-        <w:divId w:val="2030140560"/>
+        <w:divId w:val="83376929"/>
         <w:rPr>
           <w:rFonts w:ascii="Yu Gothic UI" w:eastAsia="Yu Gothic UI" w:hAnsi="Yu Gothic UI" w:hint="eastAsia"/>
           <w:color w:val="1E1E2E"/>
@@ -286,7 +286,7 @@
     <w:p>
       <w:pPr>
         <w:pStyle w:val="Web"/>
-        <w:divId w:val="2030140560"/>
+        <w:divId w:val="83376929"/>
         <w:rPr>
           <w:rFonts w:ascii="Yu Gothic UI" w:eastAsia="Yu Gothic UI" w:hAnsi="Yu Gothic UI" w:hint="eastAsia"/>
           <w:color w:val="1E1E2E"/>
@@ -530,22 +530,22 @@
     <w:p>
       <w:pPr>
         <w:spacing w:before="330" w:after="330"/>
-        <w:divId w:val="2030140560"/>
-        <w:rPr>
-          <w:rFonts w:ascii="Yu Gothic UI" w:eastAsia="Yu Gothic UI" w:hAnsi="Yu Gothic UI" w:hint="eastAsia"/>
-          <w:color w:val="1E1E2E"/>
-          <w:sz w:val="22"/>
-          <w:szCs w:val="22"/>
-        </w:rPr>
-      </w:pPr>
-      <w:r>
-        <w:rPr>
-          <w:rFonts w:ascii="Yu Gothic UI" w:eastAsia="Yu Gothic UI" w:hAnsi="Yu Gothic UI" w:hint="eastAsia"/>
-          <w:color w:val="1E1E2E"/>
-          <w:sz w:val="22"/>
-          <w:szCs w:val="22"/>
-        </w:rPr>
-        <w:pict w14:anchorId="2463AA84">
+        <w:divId w:val="83376929"/>
+        <w:rPr>
+          <w:rFonts w:ascii="Yu Gothic UI" w:eastAsia="Yu Gothic UI" w:hAnsi="Yu Gothic UI" w:hint="eastAsia"/>
+          <w:color w:val="1E1E2E"/>
+          <w:sz w:val="22"/>
+          <w:szCs w:val="22"/>
+        </w:rPr>
+      </w:pPr>
+      <w:r>
+        <w:rPr>
+          <w:rFonts w:ascii="Yu Gothic UI" w:eastAsia="Yu Gothic UI" w:hAnsi="Yu Gothic UI" w:hint="eastAsia"/>
+          <w:color w:val="1E1E2E"/>
+          <w:sz w:val="22"/>
+          <w:szCs w:val="22"/>
+        </w:rPr>
+        <w:pict w14:anchorId="2EB43A68">
           <v:rect id="_x0000_i1025" style="width:0;height:1.5pt" o:hralign="center" o:hrstd="t" o:hr="t" fillcolor="#a0a0a0" stroked="f">
             <v:textbox inset="5.85pt,.7pt,5.85pt,.7pt"/>
           </v:rect>
@@ -555,7 +555,7 @@
     <w:p>
       <w:pPr>
         <w:pStyle w:val="Web"/>
-        <w:divId w:val="2030140560"/>
+        <w:divId w:val="83376929"/>
         <w:rPr>
           <w:rFonts w:ascii="Yu Gothic UI" w:eastAsia="Yu Gothic UI" w:hAnsi="Yu Gothic UI" w:hint="eastAsia"/>
           <w:color w:val="1E1E2E"/>
@@ -683,7 +683,7 @@
     <w:p>
       <w:pPr>
         <w:pStyle w:val="Web"/>
-        <w:divId w:val="2030140560"/>
+        <w:divId w:val="83376929"/>
         <w:rPr>
           <w:rFonts w:ascii="Yu Gothic UI" w:eastAsia="Yu Gothic UI" w:hAnsi="Yu Gothic UI" w:hint="eastAsia"/>
           <w:color w:val="1E1E2E"/>
@@ -722,22 +722,22 @@
     <w:p>
       <w:pPr>
         <w:spacing w:before="330" w:after="330"/>
-        <w:divId w:val="2030140560"/>
-        <w:rPr>
-          <w:rFonts w:ascii="Yu Gothic UI" w:eastAsia="Yu Gothic UI" w:hAnsi="Yu Gothic UI" w:hint="eastAsia"/>
-          <w:color w:val="1E1E2E"/>
-          <w:sz w:val="22"/>
-          <w:szCs w:val="22"/>
-        </w:rPr>
-      </w:pPr>
-      <w:r>
-        <w:rPr>
-          <w:rFonts w:ascii="Yu Gothic UI" w:eastAsia="Yu Gothic UI" w:hAnsi="Yu Gothic UI" w:hint="eastAsia"/>
-          <w:color w:val="1E1E2E"/>
-          <w:sz w:val="22"/>
-          <w:szCs w:val="22"/>
-        </w:rPr>
-        <w:pict w14:anchorId="1E91582E">
+        <w:divId w:val="83376929"/>
+        <w:rPr>
+          <w:rFonts w:ascii="Yu Gothic UI" w:eastAsia="Yu Gothic UI" w:hAnsi="Yu Gothic UI" w:hint="eastAsia"/>
+          <w:color w:val="1E1E2E"/>
+          <w:sz w:val="22"/>
+          <w:szCs w:val="22"/>
+        </w:rPr>
+      </w:pPr>
+      <w:r>
+        <w:rPr>
+          <w:rFonts w:ascii="Yu Gothic UI" w:eastAsia="Yu Gothic UI" w:hAnsi="Yu Gothic UI" w:hint="eastAsia"/>
+          <w:color w:val="1E1E2E"/>
+          <w:sz w:val="22"/>
+          <w:szCs w:val="22"/>
+        </w:rPr>
+        <w:pict w14:anchorId="53316EAA">
           <v:rect id="_x0000_i1026" style="width:0;height:1.5pt" o:hralign="center" o:hrstd="t" o:hr="t" fillcolor="#a0a0a0" stroked="f">
             <v:textbox inset="5.85pt,.7pt,5.85pt,.7pt"/>
           </v:rect>
@@ -747,7 +747,7 @@
     <w:p>
       <w:pPr>
         <w:pStyle w:val="2"/>
-        <w:divId w:val="2030140560"/>
+        <w:divId w:val="83376929"/>
         <w:rPr>
           <w:rFonts w:ascii="Yu Gothic UI" w:eastAsia="Yu Gothic UI" w:hAnsi="Yu Gothic UI" w:hint="eastAsia"/>
         </w:rPr>
@@ -766,7 +766,7 @@
           <w:numId w:val="1"/>
         </w:numPr>
         <w:spacing w:before="45" w:after="45"/>
-        <w:divId w:val="2030140560"/>
+        <w:divId w:val="83376929"/>
         <w:rPr>
           <w:rFonts w:ascii="Yu Gothic UI" w:eastAsia="Yu Gothic UI" w:hAnsi="Yu Gothic UI" w:hint="eastAsia"/>
           <w:color w:val="1E1E2E"/>
@@ -793,7 +793,7 @@
           <w:numId w:val="1"/>
         </w:numPr>
         <w:spacing w:before="45" w:after="45"/>
-        <w:divId w:val="2030140560"/>
+        <w:divId w:val="83376929"/>
         <w:rPr>
           <w:rFonts w:ascii="Yu Gothic UI" w:eastAsia="Yu Gothic UI" w:hAnsi="Yu Gothic UI" w:hint="eastAsia"/>
           <w:color w:val="1E1E2E"/>
@@ -820,7 +820,7 @@
           <w:numId w:val="1"/>
         </w:numPr>
         <w:spacing w:before="45" w:after="45"/>
-        <w:divId w:val="2030140560"/>
+        <w:divId w:val="83376929"/>
         <w:rPr>
           <w:rFonts w:ascii="Yu Gothic UI" w:eastAsia="Yu Gothic UI" w:hAnsi="Yu Gothic UI" w:hint="eastAsia"/>
           <w:color w:val="1E1E2E"/>
@@ -847,7 +847,7 @@
           <w:numId w:val="1"/>
         </w:numPr>
         <w:spacing w:before="45" w:after="45"/>
-        <w:divId w:val="2030140560"/>
+        <w:divId w:val="83376929"/>
         <w:rPr>
           <w:rFonts w:ascii="Yu Gothic UI" w:eastAsia="Yu Gothic UI" w:hAnsi="Yu Gothic UI" w:hint="eastAsia"/>
           <w:color w:val="1E1E2E"/>
@@ -874,7 +874,7 @@
           <w:numId w:val="1"/>
         </w:numPr>
         <w:spacing w:before="45" w:after="45"/>
-        <w:divId w:val="2030140560"/>
+        <w:divId w:val="83376929"/>
         <w:rPr>
           <w:rFonts w:ascii="Yu Gothic UI" w:eastAsia="Yu Gothic UI" w:hAnsi="Yu Gothic UI" w:hint="eastAsia"/>
           <w:color w:val="1E1E2E"/>
@@ -901,7 +901,7 @@
           <w:numId w:val="1"/>
         </w:numPr>
         <w:spacing w:before="45" w:after="45"/>
-        <w:divId w:val="2030140560"/>
+        <w:divId w:val="83376929"/>
         <w:rPr>
           <w:rFonts w:ascii="Yu Gothic UI" w:eastAsia="Yu Gothic UI" w:hAnsi="Yu Gothic UI" w:hint="eastAsia"/>
           <w:color w:val="1E1E2E"/>
@@ -928,7 +928,7 @@
           <w:numId w:val="1"/>
         </w:numPr>
         <w:spacing w:before="45" w:after="45"/>
-        <w:divId w:val="2030140560"/>
+        <w:divId w:val="83376929"/>
         <w:rPr>
           <w:rFonts w:ascii="Yu Gothic UI" w:eastAsia="Yu Gothic UI" w:hAnsi="Yu Gothic UI" w:hint="eastAsia"/>
           <w:color w:val="1E1E2E"/>
@@ -964,7 +964,7 @@
           <w:numId w:val="1"/>
         </w:numPr>
         <w:spacing w:before="45" w:after="45"/>
-        <w:divId w:val="2030140560"/>
+        <w:divId w:val="83376929"/>
         <w:rPr>
           <w:rFonts w:ascii="Yu Gothic UI" w:eastAsia="Yu Gothic UI" w:hAnsi="Yu Gothic UI" w:hint="eastAsia"/>
           <w:color w:val="1E1E2E"/>
@@ -991,7 +991,7 @@
           <w:numId w:val="1"/>
         </w:numPr>
         <w:spacing w:before="45" w:after="45"/>
-        <w:divId w:val="2030140560"/>
+        <w:divId w:val="83376929"/>
         <w:rPr>
           <w:rFonts w:ascii="Yu Gothic UI" w:eastAsia="Yu Gothic UI" w:hAnsi="Yu Gothic UI" w:hint="eastAsia"/>
           <w:color w:val="1E1E2E"/>
@@ -1018,7 +1018,7 @@
           <w:numId w:val="1"/>
         </w:numPr>
         <w:spacing w:before="45" w:after="45"/>
-        <w:divId w:val="2030140560"/>
+        <w:divId w:val="83376929"/>
         <w:rPr>
           <w:rFonts w:ascii="Yu Gothic UI" w:eastAsia="Yu Gothic UI" w:hAnsi="Yu Gothic UI" w:hint="eastAsia"/>
           <w:color w:val="1E1E2E"/>
@@ -1041,22 +1041,22 @@
     <w:p>
       <w:pPr>
         <w:spacing w:before="330" w:after="330"/>
-        <w:divId w:val="2030140560"/>
-        <w:rPr>
-          <w:rFonts w:ascii="Yu Gothic UI" w:eastAsia="Yu Gothic UI" w:hAnsi="Yu Gothic UI" w:hint="eastAsia"/>
-          <w:color w:val="1E1E2E"/>
-          <w:sz w:val="22"/>
-          <w:szCs w:val="22"/>
-        </w:rPr>
-      </w:pPr>
-      <w:r>
-        <w:rPr>
-          <w:rFonts w:ascii="Yu Gothic UI" w:eastAsia="Yu Gothic UI" w:hAnsi="Yu Gothic UI" w:hint="eastAsia"/>
-          <w:color w:val="1E1E2E"/>
-          <w:sz w:val="22"/>
-          <w:szCs w:val="22"/>
-        </w:rPr>
-        <w:pict w14:anchorId="48F0A877">
+        <w:divId w:val="83376929"/>
+        <w:rPr>
+          <w:rFonts w:ascii="Yu Gothic UI" w:eastAsia="Yu Gothic UI" w:hAnsi="Yu Gothic UI" w:hint="eastAsia"/>
+          <w:color w:val="1E1E2E"/>
+          <w:sz w:val="22"/>
+          <w:szCs w:val="22"/>
+        </w:rPr>
+      </w:pPr>
+      <w:r>
+        <w:rPr>
+          <w:rFonts w:ascii="Yu Gothic UI" w:eastAsia="Yu Gothic UI" w:hAnsi="Yu Gothic UI" w:hint="eastAsia"/>
+          <w:color w:val="1E1E2E"/>
+          <w:sz w:val="22"/>
+          <w:szCs w:val="22"/>
+        </w:rPr>
+        <w:pict w14:anchorId="2A6F4328">
           <v:rect id="_x0000_i1027" style="width:0;height:1.5pt" o:hralign="center" o:hrstd="t" o:hr="t" fillcolor="#a0a0a0" stroked="f">
             <v:textbox inset="5.85pt,.7pt,5.85pt,.7pt"/>
           </v:rect>
@@ -1066,7 +1066,7 @@
     <w:p>
       <w:pPr>
         <w:pStyle w:val="2"/>
-        <w:divId w:val="2030140560"/>
+        <w:divId w:val="83376929"/>
         <w:rPr>
           <w:rFonts w:ascii="Yu Gothic UI" w:eastAsia="Yu Gothic UI" w:hAnsi="Yu Gothic UI" w:hint="eastAsia"/>
         </w:rPr>
@@ -1095,7 +1095,7 @@
       </w:tblGrid>
       <w:tr>
         <w:trPr>
-          <w:divId w:val="2030140560"/>
+          <w:divId w:val="83376929"/>
           <w:tblHeader/>
         </w:trPr>
         <w:tc>
@@ -1187,7 +1187,7 @@
       </w:tr>
       <w:tr>
         <w:trPr>
-          <w:divId w:val="2030140560"/>
+          <w:divId w:val="83376929"/>
         </w:trPr>
         <w:tc>
           <w:tcPr>
@@ -1287,7 +1287,7 @@
       </w:tr>
       <w:tr>
         <w:trPr>
-          <w:divId w:val="2030140560"/>
+          <w:divId w:val="83376929"/>
         </w:trPr>
         <w:tc>
           <w:tcPr>
@@ -1387,7 +1387,7 @@
       </w:tr>
       <w:tr>
         <w:trPr>
-          <w:divId w:val="2030140560"/>
+          <w:divId w:val="83376929"/>
         </w:trPr>
         <w:tc>
           <w:tcPr>
@@ -1487,7 +1487,7 @@
       </w:tr>
       <w:tr>
         <w:trPr>
-          <w:divId w:val="2030140560"/>
+          <w:divId w:val="83376929"/>
         </w:trPr>
         <w:tc>
           <w:tcPr>
@@ -1587,7 +1587,7 @@
       </w:tr>
       <w:tr>
         <w:trPr>
-          <w:divId w:val="2030140560"/>
+          <w:divId w:val="83376929"/>
         </w:trPr>
         <w:tc>
           <w:tcPr>
@@ -1696,7 +1696,7 @@
       </w:tr>
       <w:tr>
         <w:trPr>
-          <w:divId w:val="2030140560"/>
+          <w:divId w:val="83376929"/>
         </w:trPr>
         <w:tc>
           <w:tcPr>
@@ -1814,7 +1814,7 @@
       </w:tr>
       <w:tr>
         <w:trPr>
-          <w:divId w:val="2030140560"/>
+          <w:divId w:val="83376929"/>
         </w:trPr>
         <w:tc>
           <w:tcPr>
@@ -1923,7 +1923,7 @@
       </w:tr>
       <w:tr>
         <w:trPr>
-          <w:divId w:val="2030140560"/>
+          <w:divId w:val="83376929"/>
         </w:trPr>
         <w:tc>
           <w:tcPr>
@@ -2024,7 +2024,7 @@
       </w:tr>
       <w:tr>
         <w:trPr>
-          <w:divId w:val="2030140560"/>
+          <w:divId w:val="83376929"/>
         </w:trPr>
         <w:tc>
           <w:tcPr>
@@ -2133,7 +2133,7 @@
       </w:tr>
       <w:tr>
         <w:trPr>
-          <w:divId w:val="2030140560"/>
+          <w:divId w:val="83376929"/>
         </w:trPr>
         <w:tc>
           <w:tcPr>
@@ -2270,7 +2270,7 @@
       </w:tr>
       <w:tr>
         <w:trPr>
-          <w:divId w:val="2030140560"/>
+          <w:divId w:val="83376929"/>
         </w:trPr>
         <w:tc>
           <w:tcPr>
@@ -2421,22 +2421,22 @@
     <w:p>
       <w:pPr>
         <w:spacing w:before="330" w:after="330"/>
-        <w:divId w:val="2030140560"/>
-        <w:rPr>
-          <w:rFonts w:ascii="Yu Gothic UI" w:eastAsia="Yu Gothic UI" w:hAnsi="Yu Gothic UI" w:hint="eastAsia"/>
-          <w:color w:val="1E1E2E"/>
-          <w:sz w:val="22"/>
-          <w:szCs w:val="22"/>
-        </w:rPr>
-      </w:pPr>
-      <w:r>
-        <w:rPr>
-          <w:rFonts w:ascii="Yu Gothic UI" w:eastAsia="Yu Gothic UI" w:hAnsi="Yu Gothic UI" w:hint="eastAsia"/>
-          <w:color w:val="1E1E2E"/>
-          <w:sz w:val="22"/>
-          <w:szCs w:val="22"/>
-        </w:rPr>
-        <w:pict w14:anchorId="537BA935">
+        <w:divId w:val="83376929"/>
+        <w:rPr>
+          <w:rFonts w:ascii="Yu Gothic UI" w:eastAsia="Yu Gothic UI" w:hAnsi="Yu Gothic UI" w:hint="eastAsia"/>
+          <w:color w:val="1E1E2E"/>
+          <w:sz w:val="22"/>
+          <w:szCs w:val="22"/>
+        </w:rPr>
+      </w:pPr>
+      <w:r>
+        <w:rPr>
+          <w:rFonts w:ascii="Yu Gothic UI" w:eastAsia="Yu Gothic UI" w:hAnsi="Yu Gothic UI" w:hint="eastAsia"/>
+          <w:color w:val="1E1E2E"/>
+          <w:sz w:val="22"/>
+          <w:szCs w:val="22"/>
+        </w:rPr>
+        <w:pict w14:anchorId="09700F61">
           <v:rect id="_x0000_i1028" style="width:0;height:1.5pt" o:hralign="center" o:hrstd="t" o:hr="t" fillcolor="#a0a0a0" stroked="f">
             <v:textbox inset="5.85pt,.7pt,5.85pt,.7pt"/>
           </v:rect>
@@ -2446,7 +2446,7 @@
     <w:p>
       <w:pPr>
         <w:pStyle w:val="2"/>
-        <w:divId w:val="2030140560"/>
+        <w:divId w:val="83376929"/>
         <w:rPr>
           <w:rFonts w:ascii="Yu Gothic UI" w:eastAsia="Yu Gothic UI" w:hAnsi="Yu Gothic UI" w:hint="eastAsia"/>
         </w:rPr>
@@ -2475,7 +2475,7 @@
       </w:tblGrid>
       <w:tr>
         <w:trPr>
-          <w:divId w:val="2030140560"/>
+          <w:divId w:val="83376929"/>
           <w:tblHeader/>
         </w:trPr>
         <w:tc>
@@ -2567,7 +2567,7 @@
       </w:tr>
       <w:tr>
         <w:trPr>
-          <w:divId w:val="2030140560"/>
+          <w:divId w:val="83376929"/>
         </w:trPr>
         <w:tc>
           <w:tcPr>
@@ -2658,7 +2658,7 @@
       </w:tr>
       <w:tr>
         <w:trPr>
-          <w:divId w:val="2030140560"/>
+          <w:divId w:val="83376929"/>
         </w:trPr>
         <w:tc>
           <w:tcPr>
@@ -2794,7 +2794,7 @@
       </w:tr>
       <w:tr>
         <w:trPr>
-          <w:divId w:val="2030140560"/>
+          <w:divId w:val="83376929"/>
         </w:trPr>
         <w:tc>
           <w:tcPr>
@@ -2900,7 +2900,7 @@
       </w:tr>
       <w:tr>
         <w:trPr>
-          <w:divId w:val="2030140560"/>
+          <w:divId w:val="83376929"/>
         </w:trPr>
         <w:tc>
           <w:tcPr>
@@ -2995,7 +2995,7 @@
       <w:pPr>
         <w:pStyle w:val="Web"/>
         <w:shd w:val="clear" w:color="auto" w:fill="FEF9F3"/>
-        <w:divId w:val="1786578675"/>
+        <w:divId w:val="43331503"/>
         <w:rPr>
           <w:rFonts w:ascii="Yu Gothic UI" w:eastAsia="Yu Gothic UI" w:hAnsi="Yu Gothic UI" w:hint="eastAsia"/>
           <w:color w:val="4C4F69"/>
@@ -3095,22 +3095,22 @@
     <w:p>
       <w:pPr>
         <w:spacing w:before="330" w:after="330"/>
-        <w:divId w:val="2030140560"/>
-        <w:rPr>
-          <w:rFonts w:ascii="Yu Gothic UI" w:eastAsia="Yu Gothic UI" w:hAnsi="Yu Gothic UI" w:hint="eastAsia"/>
-          <w:color w:val="1E1E2E"/>
-          <w:sz w:val="22"/>
-          <w:szCs w:val="22"/>
-        </w:rPr>
-      </w:pPr>
-      <w:r>
-        <w:rPr>
-          <w:rFonts w:ascii="Yu Gothic UI" w:eastAsia="Yu Gothic UI" w:hAnsi="Yu Gothic UI" w:hint="eastAsia"/>
-          <w:color w:val="1E1E2E"/>
-          <w:sz w:val="22"/>
-          <w:szCs w:val="22"/>
-        </w:rPr>
-        <w:pict w14:anchorId="4A173723">
+        <w:divId w:val="83376929"/>
+        <w:rPr>
+          <w:rFonts w:ascii="Yu Gothic UI" w:eastAsia="Yu Gothic UI" w:hAnsi="Yu Gothic UI" w:hint="eastAsia"/>
+          <w:color w:val="1E1E2E"/>
+          <w:sz w:val="22"/>
+          <w:szCs w:val="22"/>
+        </w:rPr>
+      </w:pPr>
+      <w:r>
+        <w:rPr>
+          <w:rFonts w:ascii="Yu Gothic UI" w:eastAsia="Yu Gothic UI" w:hAnsi="Yu Gothic UI" w:hint="eastAsia"/>
+          <w:color w:val="1E1E2E"/>
+          <w:sz w:val="22"/>
+          <w:szCs w:val="22"/>
+        </w:rPr>
+        <w:pict w14:anchorId="2B0AB868">
           <v:rect id="_x0000_i1029" style="width:0;height:1.5pt" o:hralign="center" o:hrstd="t" o:hr="t" fillcolor="#a0a0a0" stroked="f">
             <v:textbox inset="5.85pt,.7pt,5.85pt,.7pt"/>
           </v:rect>
@@ -3120,7 +3120,7 @@
     <w:p>
       <w:pPr>
         <w:pStyle w:val="2"/>
-        <w:divId w:val="2030140560"/>
+        <w:divId w:val="83376929"/>
         <w:rPr>
           <w:rFonts w:ascii="Yu Gothic UI" w:eastAsia="Yu Gothic UI" w:hAnsi="Yu Gothic UI" w:hint="eastAsia"/>
         </w:rPr>
@@ -3139,7 +3139,7 @@
           <w:ilvl w:val="0"/>
           <w:numId w:val="2"/>
         </w:numPr>
-        <w:divId w:val="2030140560"/>
+        <w:divId w:val="83376929"/>
         <w:rPr>
           <w:rFonts w:ascii="Yu Gothic UI" w:eastAsia="Yu Gothic UI" w:hAnsi="Yu Gothic UI" w:hint="eastAsia"/>
           <w:color w:val="1E1E2E"/>
@@ -3279,7 +3279,7 @@
           <w:ilvl w:val="0"/>
           <w:numId w:val="2"/>
         </w:numPr>
-        <w:divId w:val="2030140560"/>
+        <w:divId w:val="83376929"/>
         <w:rPr>
           <w:rFonts w:ascii="Yu Gothic UI" w:eastAsia="Yu Gothic UI" w:hAnsi="Yu Gothic UI" w:hint="eastAsia"/>
           <w:color w:val="1E1E2E"/>
@@ -3353,7 +3353,7 @@
           <w:ilvl w:val="0"/>
           <w:numId w:val="2"/>
         </w:numPr>
-        <w:divId w:val="2030140560"/>
+        <w:divId w:val="83376929"/>
         <w:rPr>
           <w:rFonts w:ascii="Yu Gothic UI" w:eastAsia="Yu Gothic UI" w:hAnsi="Yu Gothic UI" w:hint="eastAsia"/>
           <w:color w:val="1E1E2E"/>
@@ -3384,7 +3384,7 @@
         <w:rPr>
           <w:rStyle w:val="HTML"/>
         </w:rPr>
-        <w:t>modekore.py</w:t>
+        <w:t>ModeColle.py</w:t>
       </w:r>
       <w:r>
         <w:rPr>
@@ -3463,7 +3463,7 @@
           <w:ilvl w:val="0"/>
           <w:numId w:val="2"/>
         </w:numPr>
-        <w:divId w:val="2030140560"/>
+        <w:divId w:val="83376929"/>
         <w:rPr>
           <w:rFonts w:ascii="Yu Gothic UI" w:eastAsia="Yu Gothic UI" w:hAnsi="Yu Gothic UI" w:hint="eastAsia"/>
           <w:color w:val="1E1E2E"/>
@@ -3588,22 +3588,22 @@
     <w:p>
       <w:pPr>
         <w:spacing w:before="330" w:after="330"/>
-        <w:divId w:val="2030140560"/>
-        <w:rPr>
-          <w:rFonts w:ascii="Yu Gothic UI" w:eastAsia="Yu Gothic UI" w:hAnsi="Yu Gothic UI" w:hint="eastAsia"/>
-          <w:color w:val="1E1E2E"/>
-          <w:sz w:val="22"/>
-          <w:szCs w:val="22"/>
-        </w:rPr>
-      </w:pPr>
-      <w:r>
-        <w:rPr>
-          <w:rFonts w:ascii="Yu Gothic UI" w:eastAsia="Yu Gothic UI" w:hAnsi="Yu Gothic UI" w:hint="eastAsia"/>
-          <w:color w:val="1E1E2E"/>
-          <w:sz w:val="22"/>
-          <w:szCs w:val="22"/>
-        </w:rPr>
-        <w:pict w14:anchorId="77AB0E3B">
+        <w:divId w:val="83376929"/>
+        <w:rPr>
+          <w:rFonts w:ascii="Yu Gothic UI" w:eastAsia="Yu Gothic UI" w:hAnsi="Yu Gothic UI" w:hint="eastAsia"/>
+          <w:color w:val="1E1E2E"/>
+          <w:sz w:val="22"/>
+          <w:szCs w:val="22"/>
+        </w:rPr>
+      </w:pPr>
+      <w:r>
+        <w:rPr>
+          <w:rFonts w:ascii="Yu Gothic UI" w:eastAsia="Yu Gothic UI" w:hAnsi="Yu Gothic UI" w:hint="eastAsia"/>
+          <w:color w:val="1E1E2E"/>
+          <w:sz w:val="22"/>
+          <w:szCs w:val="22"/>
+        </w:rPr>
+        <w:pict w14:anchorId="55514226">
           <v:rect id="_x0000_i1030" style="width:0;height:1.5pt" o:hralign="center" o:hrstd="t" o:hr="t" fillcolor="#a0a0a0" stroked="f">
             <v:textbox inset="5.85pt,.7pt,5.85pt,.7pt"/>
           </v:rect>
@@ -3613,7 +3613,7 @@
     <w:p>
       <w:pPr>
         <w:pStyle w:val="2"/>
-        <w:divId w:val="2030140560"/>
+        <w:divId w:val="83376929"/>
         <w:rPr>
           <w:rFonts w:ascii="Yu Gothic UI" w:eastAsia="Yu Gothic UI" w:hAnsi="Yu Gothic UI" w:hint="eastAsia"/>
         </w:rPr>
@@ -3628,7 +3628,7 @@
     <w:p>
       <w:pPr>
         <w:pStyle w:val="Web"/>
-        <w:divId w:val="2030140560"/>
+        <w:divId w:val="83376929"/>
         <w:rPr>
           <w:rFonts w:ascii="Yu Gothic UI" w:eastAsia="Yu Gothic UI" w:hAnsi="Yu Gothic UI" w:hint="eastAsia"/>
           <w:color w:val="1E1E2E"/>
@@ -3693,7 +3693,7 @@
         <w:rPr>
           <w:rStyle w:val="HTML"/>
         </w:rPr>
-        <w:t>modekore.py</w:t>
+        <w:t>ModeColle.py</w:t>
       </w:r>
       <w:r>
         <w:rPr>
@@ -3717,7 +3717,7 @@
     <w:p>
       <w:pPr>
         <w:pStyle w:val="Web"/>
-        <w:divId w:val="2030140560"/>
+        <w:divId w:val="83376929"/>
         <w:rPr>
           <w:rFonts w:ascii="Yu Gothic UI" w:eastAsia="Yu Gothic UI" w:hAnsi="Yu Gothic UI" w:hint="eastAsia"/>
           <w:color w:val="1E1E2E"/>
@@ -3753,7 +3753,7 @@
     <w:p>
       <w:pPr>
         <w:pStyle w:val="Web"/>
-        <w:divId w:val="2030140560"/>
+        <w:divId w:val="83376929"/>
         <w:rPr>
           <w:rFonts w:ascii="Yu Gothic UI" w:eastAsia="Yu Gothic UI" w:hAnsi="Yu Gothic UI" w:hint="eastAsia"/>
           <w:color w:val="1E1E2E"/>
@@ -3775,7 +3775,7 @@
       <w:pPr>
         <w:pStyle w:val="Web"/>
         <w:shd w:val="clear" w:color="auto" w:fill="FEF9F3"/>
-        <w:divId w:val="1547521371"/>
+        <w:divId w:val="1380202469"/>
         <w:rPr>
           <w:rFonts w:ascii="Yu Gothic UI" w:eastAsia="Yu Gothic UI" w:hAnsi="Yu Gothic UI" w:hint="eastAsia"/>
           <w:color w:val="4C4F69"/>
@@ -3830,22 +3830,22 @@
     <w:p>
       <w:pPr>
         <w:spacing w:before="330" w:after="330"/>
-        <w:divId w:val="2030140560"/>
-        <w:rPr>
-          <w:rFonts w:ascii="Yu Gothic UI" w:eastAsia="Yu Gothic UI" w:hAnsi="Yu Gothic UI" w:hint="eastAsia"/>
-          <w:color w:val="1E1E2E"/>
-          <w:sz w:val="22"/>
-          <w:szCs w:val="22"/>
-        </w:rPr>
-      </w:pPr>
-      <w:r>
-        <w:rPr>
-          <w:rFonts w:ascii="Yu Gothic UI" w:eastAsia="Yu Gothic UI" w:hAnsi="Yu Gothic UI" w:hint="eastAsia"/>
-          <w:color w:val="1E1E2E"/>
-          <w:sz w:val="22"/>
-          <w:szCs w:val="22"/>
-        </w:rPr>
-        <w:pict w14:anchorId="784DE970">
+        <w:divId w:val="83376929"/>
+        <w:rPr>
+          <w:rFonts w:ascii="Yu Gothic UI" w:eastAsia="Yu Gothic UI" w:hAnsi="Yu Gothic UI" w:hint="eastAsia"/>
+          <w:color w:val="1E1E2E"/>
+          <w:sz w:val="22"/>
+          <w:szCs w:val="22"/>
+        </w:rPr>
+      </w:pPr>
+      <w:r>
+        <w:rPr>
+          <w:rFonts w:ascii="Yu Gothic UI" w:eastAsia="Yu Gothic UI" w:hAnsi="Yu Gothic UI" w:hint="eastAsia"/>
+          <w:color w:val="1E1E2E"/>
+          <w:sz w:val="22"/>
+          <w:szCs w:val="22"/>
+        </w:rPr>
+        <w:pict w14:anchorId="296399E0">
           <v:rect id="_x0000_i1031" style="width:0;height:1.5pt" o:hralign="center" o:hrstd="t" o:hr="t" fillcolor="#a0a0a0" stroked="f">
             <v:textbox inset="5.85pt,.7pt,5.85pt,.7pt"/>
           </v:rect>
@@ -3855,7 +3855,7 @@
     <w:p>
       <w:pPr>
         <w:pStyle w:val="2"/>
-        <w:divId w:val="2030140560"/>
+        <w:divId w:val="83376929"/>
         <w:rPr>
           <w:rFonts w:ascii="Yu Gothic UI" w:eastAsia="Yu Gothic UI" w:hAnsi="Yu Gothic UI" w:hint="eastAsia"/>
         </w:rPr>
@@ -3870,7 +3870,7 @@
     <w:p>
       <w:pPr>
         <w:pStyle w:val="Web"/>
-        <w:divId w:val="2030140560"/>
+        <w:divId w:val="83376929"/>
         <w:rPr>
           <w:rFonts w:ascii="Yu Gothic UI" w:eastAsia="Yu Gothic UI" w:hAnsi="Yu Gothic UI" w:hint="eastAsia"/>
           <w:color w:val="1E1E2E"/>
@@ -4020,7 +4020,7 @@
     <w:p>
       <w:pPr>
         <w:pStyle w:val="3"/>
-        <w:divId w:val="2030140560"/>
+        <w:divId w:val="83376929"/>
         <w:rPr>
           <w:rFonts w:ascii="Yu Gothic UI" w:eastAsia="Yu Gothic UI" w:hAnsi="Yu Gothic UI" w:hint="eastAsia"/>
         </w:rPr>
@@ -4039,7 +4039,7 @@
           <w:numId w:val="3"/>
         </w:numPr>
         <w:spacing w:before="45" w:after="45"/>
-        <w:divId w:val="2030140560"/>
+        <w:divId w:val="83376929"/>
         <w:rPr>
           <w:rFonts w:ascii="Yu Gothic UI" w:eastAsia="Yu Gothic UI" w:hAnsi="Yu Gothic UI" w:hint="eastAsia"/>
           <w:color w:val="1E1E2E"/>
@@ -4121,7 +4121,7 @@
           <w:numId w:val="3"/>
         </w:numPr>
         <w:spacing w:before="45" w:after="45"/>
-        <w:divId w:val="2030140560"/>
+        <w:divId w:val="83376929"/>
         <w:rPr>
           <w:rFonts w:ascii="Yu Gothic UI" w:eastAsia="Yu Gothic UI" w:hAnsi="Yu Gothic UI" w:hint="eastAsia"/>
           <w:color w:val="1E1E2E"/>
@@ -4183,7 +4183,7 @@
           <w:numId w:val="3"/>
         </w:numPr>
         <w:spacing w:before="45" w:after="45"/>
-        <w:divId w:val="2030140560"/>
+        <w:divId w:val="83376929"/>
         <w:rPr>
           <w:rFonts w:ascii="Yu Gothic UI" w:eastAsia="Yu Gothic UI" w:hAnsi="Yu Gothic UI" w:hint="eastAsia"/>
           <w:color w:val="1E1E2E"/>
@@ -4265,7 +4265,7 @@
           <w:numId w:val="3"/>
         </w:numPr>
         <w:spacing w:before="45" w:after="45"/>
-        <w:divId w:val="2030140560"/>
+        <w:divId w:val="83376929"/>
         <w:rPr>
           <w:rFonts w:ascii="Yu Gothic UI" w:eastAsia="Yu Gothic UI" w:hAnsi="Yu Gothic UI" w:hint="eastAsia"/>
           <w:color w:val="1E1E2E"/>
@@ -4347,7 +4347,7 @@
           <w:numId w:val="3"/>
         </w:numPr>
         <w:spacing w:before="45" w:after="45"/>
-        <w:divId w:val="2030140560"/>
+        <w:divId w:val="83376929"/>
         <w:rPr>
           <w:rFonts w:ascii="Yu Gothic UI" w:eastAsia="Yu Gothic UI" w:hAnsi="Yu Gothic UI" w:hint="eastAsia"/>
           <w:color w:val="1E1E2E"/>
@@ -4373,7 +4373,7 @@
           <w:numId w:val="3"/>
         </w:numPr>
         <w:spacing w:before="45" w:after="45"/>
-        <w:divId w:val="2030140560"/>
+        <w:divId w:val="83376929"/>
         <w:rPr>
           <w:rFonts w:ascii="Yu Gothic UI" w:eastAsia="Yu Gothic UI" w:hAnsi="Yu Gothic UI" w:hint="eastAsia"/>
           <w:color w:val="1E1E2E"/>
@@ -4416,7 +4416,7 @@
           <w:numId w:val="3"/>
         </w:numPr>
         <w:spacing w:before="45" w:after="45"/>
-        <w:divId w:val="2030140560"/>
+        <w:divId w:val="83376929"/>
         <w:rPr>
           <w:rFonts w:ascii="Yu Gothic UI" w:eastAsia="Yu Gothic UI" w:hAnsi="Yu Gothic UI" w:hint="eastAsia"/>
           <w:color w:val="1E1E2E"/>
@@ -4473,7 +4473,7 @@
     <w:p>
       <w:pPr>
         <w:pStyle w:val="3"/>
-        <w:divId w:val="2030140560"/>
+        <w:divId w:val="83376929"/>
         <w:rPr>
           <w:rFonts w:ascii="Yu Gothic UI" w:eastAsia="Yu Gothic UI" w:hAnsi="Yu Gothic UI" w:hint="eastAsia"/>
         </w:rPr>
@@ -4502,7 +4502,7 @@
       </w:tblGrid>
       <w:tr>
         <w:trPr>
-          <w:divId w:val="2030140560"/>
+          <w:divId w:val="83376929"/>
           <w:tblHeader/>
         </w:trPr>
         <w:tc>
@@ -4594,7 +4594,7 @@
       </w:tr>
       <w:tr>
         <w:trPr>
-          <w:divId w:val="2030140560"/>
+          <w:divId w:val="83376929"/>
         </w:trPr>
         <w:tc>
           <w:tcPr>
@@ -4685,7 +4685,7 @@
       </w:tr>
       <w:tr>
         <w:trPr>
-          <w:divId w:val="2030140560"/>
+          <w:divId w:val="83376929"/>
         </w:trPr>
         <w:tc>
           <w:tcPr>
@@ -4785,7 +4785,7 @@
       </w:tr>
       <w:tr>
         <w:trPr>
-          <w:divId w:val="2030140560"/>
+          <w:divId w:val="83376929"/>
         </w:trPr>
         <w:tc>
           <w:tcPr>
@@ -4925,7 +4925,7 @@
       </w:tr>
       <w:tr>
         <w:trPr>
-          <w:divId w:val="2030140560"/>
+          <w:divId w:val="83376929"/>
         </w:trPr>
         <w:tc>
           <w:tcPr>
@@ -5046,8 +5046,7 @@
     <w:p>
       <w:pPr>
         <w:pStyle w:val="Web"/>
-        <w:ind w:left="540" w:right="540"/>
-        <w:divId w:val="2030140560"/>
+        <w:divId w:val="83376929"/>
         <w:rPr>
           <w:rFonts w:ascii="Yu Gothic UI" w:eastAsia="Yu Gothic UI" w:hAnsi="Yu Gothic UI" w:hint="eastAsia"/>
           <w:color w:val="1E1E2E"/>
@@ -5068,7 +5067,7 @@
     <w:p>
       <w:pPr>
         <w:pStyle w:val="3"/>
-        <w:divId w:val="2030140560"/>
+        <w:divId w:val="83376929"/>
         <w:rPr>
           <w:rFonts w:ascii="Yu Gothic UI" w:eastAsia="Yu Gothic UI" w:hAnsi="Yu Gothic UI" w:hint="eastAsia"/>
         </w:rPr>
@@ -5088,7 +5087,7 @@
         </w:numPr>
         <w:spacing w:before="45" w:after="45"/>
         <w:ind w:left="1260" w:right="540"/>
-        <w:divId w:val="2030140560"/>
+        <w:divId w:val="83376929"/>
         <w:rPr>
           <w:rFonts w:ascii="Yu Gothic UI" w:eastAsia="Yu Gothic UI" w:hAnsi="Yu Gothic UI" w:hint="eastAsia"/>
           <w:color w:val="1E1E2E"/>
@@ -5123,50 +5122,6 @@
           <w:szCs w:val="22"/>
         </w:rPr>
         <w:t>正式名称</w:t>
-      </w:r>
-    </w:p>
-    <w:p>
-      <w:pPr>
-        <w:numPr>
-          <w:ilvl w:val="0"/>
-          <w:numId w:val="4"/>
-        </w:numPr>
-        <w:spacing w:before="45" w:after="45"/>
-        <w:divId w:val="2030140560"/>
-        <w:rPr>
-          <w:rFonts w:ascii="Yu Gothic UI" w:eastAsia="Yu Gothic UI" w:hAnsi="Yu Gothic UI" w:hint="eastAsia"/>
-          <w:color w:val="1E1E2E"/>
-          <w:sz w:val="22"/>
-          <w:szCs w:val="22"/>
-        </w:rPr>
-      </w:pPr>
-      <w:r>
-        <w:rPr>
-          <w:rFonts w:ascii="Segoe UI Emoji" w:eastAsia="Yu Gothic UI" w:hAnsi="Segoe UI Emoji" w:cs="Segoe UI Emoji"/>
-          <w:color w:val="1E1E2E"/>
-          <w:sz w:val="22"/>
-          <w:szCs w:val="22"/>
-        </w:rPr>
-        <w:t>💾</w:t>
-      </w:r>
-      <w:r>
-        <w:rPr>
-          <w:rFonts w:ascii="Yu Gothic UI" w:eastAsia="Yu Gothic UI" w:hAnsi="Yu Gothic UI" w:hint="eastAsia"/>
-          <w:color w:val="1E1E2E"/>
-          <w:sz w:val="22"/>
-          <w:szCs w:val="22"/>
-        </w:rPr>
-        <w:t xml:space="preserve"> </w:t>
-      </w:r>
-      <w:r>
-        <w:rPr>
-          <w:rStyle w:val="a5"/>
-          <w:rFonts w:ascii="Yu Gothic UI" w:eastAsia="Yu Gothic UI" w:hAnsi="Yu Gothic UI" w:hint="eastAsia"/>
-          <w:color w:val="1E1E2E"/>
-          <w:sz w:val="22"/>
-          <w:szCs w:val="22"/>
-        </w:rPr>
-        <w:t>容量</w:t>
       </w:r>
     </w:p>
     <w:p>
@@ -5177,7 +5132,7 @@
         </w:numPr>
         <w:spacing w:before="45" w:after="45"/>
         <w:ind w:left="1260" w:right="540"/>
-        <w:divId w:val="2030140560"/>
+        <w:divId w:val="83376929"/>
         <w:rPr>
           <w:rFonts w:ascii="Yu Gothic UI" w:eastAsia="Yu Gothic UI" w:hAnsi="Yu Gothic UI" w:hint="eastAsia"/>
           <w:color w:val="1E1E2E"/>
@@ -5192,6 +5147,50 @@
           <w:sz w:val="22"/>
           <w:szCs w:val="22"/>
         </w:rPr>
+        <w:t>💾</w:t>
+      </w:r>
+      <w:r>
+        <w:rPr>
+          <w:rFonts w:ascii="Yu Gothic UI" w:eastAsia="Yu Gothic UI" w:hAnsi="Yu Gothic UI" w:hint="eastAsia"/>
+          <w:color w:val="1E1E2E"/>
+          <w:sz w:val="22"/>
+          <w:szCs w:val="22"/>
+        </w:rPr>
+        <w:t xml:space="preserve"> </w:t>
+      </w:r>
+      <w:r>
+        <w:rPr>
+          <w:rStyle w:val="a5"/>
+          <w:rFonts w:ascii="Yu Gothic UI" w:eastAsia="Yu Gothic UI" w:hAnsi="Yu Gothic UI" w:hint="eastAsia"/>
+          <w:color w:val="1E1E2E"/>
+          <w:sz w:val="22"/>
+          <w:szCs w:val="22"/>
+        </w:rPr>
+        <w:t>容量</w:t>
+      </w:r>
+    </w:p>
+    <w:p>
+      <w:pPr>
+        <w:numPr>
+          <w:ilvl w:val="0"/>
+          <w:numId w:val="4"/>
+        </w:numPr>
+        <w:spacing w:before="45" w:after="45"/>
+        <w:divId w:val="83376929"/>
+        <w:rPr>
+          <w:rFonts w:ascii="Yu Gothic UI" w:eastAsia="Yu Gothic UI" w:hAnsi="Yu Gothic UI" w:hint="eastAsia"/>
+          <w:color w:val="1E1E2E"/>
+          <w:sz w:val="22"/>
+          <w:szCs w:val="22"/>
+        </w:rPr>
+      </w:pPr>
+      <w:r>
+        <w:rPr>
+          <w:rFonts w:ascii="Segoe UI Emoji" w:eastAsia="Yu Gothic UI" w:hAnsi="Segoe UI Emoji" w:cs="Segoe UI Emoji"/>
+          <w:color w:val="1E1E2E"/>
+          <w:sz w:val="22"/>
+          <w:szCs w:val="22"/>
+        </w:rPr>
         <w:t>🔑</w:t>
       </w:r>
       <w:r>
@@ -5221,6 +5220,59 @@
           <w:szCs w:val="22"/>
         </w:rPr>
         <w:t>（全体）</w:t>
+      </w:r>
+    </w:p>
+    <w:p>
+      <w:pPr>
+        <w:numPr>
+          <w:ilvl w:val="0"/>
+          <w:numId w:val="4"/>
+        </w:numPr>
+        <w:spacing w:before="45" w:after="45"/>
+        <w:divId w:val="83376929"/>
+        <w:rPr>
+          <w:rFonts w:ascii="Yu Gothic UI" w:eastAsia="Yu Gothic UI" w:hAnsi="Yu Gothic UI" w:hint="eastAsia"/>
+          <w:color w:val="1E1E2E"/>
+          <w:sz w:val="22"/>
+          <w:szCs w:val="22"/>
+        </w:rPr>
+      </w:pPr>
+      <w:r>
+        <w:rPr>
+          <w:rFonts w:ascii="Segoe UI Emoji" w:eastAsia="Yu Gothic UI" w:hAnsi="Segoe UI Emoji" w:cs="Segoe UI Emoji"/>
+          <w:color w:val="1E1E2E"/>
+          <w:sz w:val="22"/>
+          <w:szCs w:val="22"/>
+        </w:rPr>
+        <w:t>🎯</w:t>
+      </w:r>
+      <w:r>
+        <w:rPr>
+          <w:rFonts w:ascii="Yu Gothic UI" w:eastAsia="Yu Gothic UI" w:hAnsi="Yu Gothic UI" w:hint="eastAsia"/>
+          <w:color w:val="1E1E2E"/>
+          <w:sz w:val="22"/>
+          <w:szCs w:val="22"/>
+        </w:rPr>
+        <w:t xml:space="preserve"> </w:t>
+      </w:r>
+      <w:r>
+        <w:rPr>
+          <w:rStyle w:val="a5"/>
+          <w:rFonts w:ascii="Yu Gothic UI" w:eastAsia="Yu Gothic UI" w:hAnsi="Yu Gothic UI" w:hint="eastAsia"/>
+          <w:color w:val="1E1E2E"/>
+          <w:sz w:val="22"/>
+          <w:szCs w:val="22"/>
+        </w:rPr>
+        <w:t>おすすめ用途</w:t>
+      </w:r>
+      <w:r>
+        <w:rPr>
+          <w:rFonts w:ascii="Yu Gothic UI" w:eastAsia="Yu Gothic UI" w:hAnsi="Yu Gothic UI" w:hint="eastAsia"/>
+          <w:color w:val="1E1E2E"/>
+          <w:sz w:val="22"/>
+          <w:szCs w:val="22"/>
+        </w:rPr>
+        <w:t>（モデル名から自動判定）</w:t>
       </w:r>
     </w:p>
     <w:p>
@@ -5231,7 +5283,7 @@
         </w:numPr>
         <w:spacing w:before="45" w:after="45"/>
         <w:ind w:left="1260" w:right="540"/>
-        <w:divId w:val="2030140560"/>
+        <w:divId w:val="83376929"/>
         <w:rPr>
           <w:rFonts w:ascii="Yu Gothic UI" w:eastAsia="Yu Gothic UI" w:hAnsi="Yu Gothic UI" w:hint="eastAsia"/>
           <w:color w:val="1E1E2E"/>
@@ -5246,35 +5298,35 @@
           <w:sz w:val="22"/>
           <w:szCs w:val="22"/>
         </w:rPr>
-        <w:t>🎯</w:t>
-      </w:r>
-      <w:r>
-        <w:rPr>
-          <w:rFonts w:ascii="Yu Gothic UI" w:eastAsia="Yu Gothic UI" w:hAnsi="Yu Gothic UI" w:hint="eastAsia"/>
-          <w:color w:val="1E1E2E"/>
-          <w:sz w:val="22"/>
-          <w:szCs w:val="22"/>
-        </w:rPr>
-        <w:t xml:space="preserve"> </w:t>
-      </w:r>
-      <w:r>
-        <w:rPr>
-          <w:rStyle w:val="a5"/>
-          <w:rFonts w:ascii="Yu Gothic UI" w:eastAsia="Yu Gothic UI" w:hAnsi="Yu Gothic UI" w:hint="eastAsia"/>
-          <w:color w:val="1E1E2E"/>
-          <w:sz w:val="22"/>
-          <w:szCs w:val="22"/>
-        </w:rPr>
-        <w:t>おすすめ用途</w:t>
-      </w:r>
-      <w:r>
-        <w:rPr>
-          <w:rFonts w:ascii="Yu Gothic UI" w:eastAsia="Yu Gothic UI" w:hAnsi="Yu Gothic UI" w:hint="eastAsia"/>
-          <w:color w:val="1E1E2E"/>
-          <w:sz w:val="22"/>
-          <w:szCs w:val="22"/>
-        </w:rPr>
-        <w:t>（モデル名から自動判定）</w:t>
+        <w:t>📊</w:t>
+      </w:r>
+      <w:r>
+        <w:rPr>
+          <w:rFonts w:ascii="Yu Gothic UI" w:eastAsia="Yu Gothic UI" w:hAnsi="Yu Gothic UI" w:hint="eastAsia"/>
+          <w:color w:val="1E1E2E"/>
+          <w:sz w:val="22"/>
+          <w:szCs w:val="22"/>
+        </w:rPr>
+        <w:t xml:space="preserve"> </w:t>
+      </w:r>
+      <w:r>
+        <w:rPr>
+          <w:rStyle w:val="a5"/>
+          <w:rFonts w:ascii="Yu Gothic UI" w:eastAsia="Yu Gothic UI" w:hAnsi="Yu Gothic UI" w:hint="eastAsia"/>
+          <w:color w:val="1E1E2E"/>
+          <w:sz w:val="22"/>
+          <w:szCs w:val="22"/>
+        </w:rPr>
+        <w:t>モデル情報</w:t>
+      </w:r>
+      <w:r>
+        <w:rPr>
+          <w:rFonts w:ascii="Yu Gothic UI" w:eastAsia="Yu Gothic UI" w:hAnsi="Yu Gothic UI" w:hint="eastAsia"/>
+          <w:color w:val="1E1E2E"/>
+          <w:sz w:val="22"/>
+          <w:szCs w:val="22"/>
+        </w:rPr>
+        <w:t>（ファミリー・パラメータ数・量子化・形式）</w:t>
       </w:r>
     </w:p>
     <w:p>
@@ -5284,8 +5336,7 @@
           <w:numId w:val="4"/>
         </w:numPr>
         <w:spacing w:before="45" w:after="45"/>
-        <w:ind w:left="1260" w:right="540"/>
-        <w:divId w:val="2030140560"/>
+        <w:divId w:val="83376929"/>
         <w:rPr>
           <w:rFonts w:ascii="Yu Gothic UI" w:eastAsia="Yu Gothic UI" w:hAnsi="Yu Gothic UI" w:hint="eastAsia"/>
           <w:color w:val="1E1E2E"/>
@@ -5300,111 +5351,57 @@
           <w:sz w:val="22"/>
           <w:szCs w:val="22"/>
         </w:rPr>
-        <w:t>📊</w:t>
-      </w:r>
-      <w:r>
-        <w:rPr>
-          <w:rFonts w:ascii="Yu Gothic UI" w:eastAsia="Yu Gothic UI" w:hAnsi="Yu Gothic UI" w:hint="eastAsia"/>
-          <w:color w:val="1E1E2E"/>
-          <w:sz w:val="22"/>
-          <w:szCs w:val="22"/>
-        </w:rPr>
-        <w:t xml:space="preserve"> </w:t>
-      </w:r>
-      <w:r>
-        <w:rPr>
-          <w:rStyle w:val="a5"/>
-          <w:rFonts w:ascii="Yu Gothic UI" w:eastAsia="Yu Gothic UI" w:hAnsi="Yu Gothic UI" w:hint="eastAsia"/>
-          <w:color w:val="1E1E2E"/>
-          <w:sz w:val="22"/>
-          <w:szCs w:val="22"/>
-        </w:rPr>
-        <w:t>モデル情報</w:t>
-      </w:r>
-      <w:r>
-        <w:rPr>
-          <w:rFonts w:ascii="Yu Gothic UI" w:eastAsia="Yu Gothic UI" w:hAnsi="Yu Gothic UI" w:hint="eastAsia"/>
-          <w:color w:val="1E1E2E"/>
-          <w:sz w:val="22"/>
-          <w:szCs w:val="22"/>
-        </w:rPr>
-        <w:t>（ファミリー・パラメータ数・量子化・形式）</w:t>
+        <w:t>📋</w:t>
+      </w:r>
+      <w:r>
+        <w:rPr>
+          <w:rFonts w:ascii="Yu Gothic UI" w:eastAsia="Yu Gothic UI" w:hAnsi="Yu Gothic UI" w:hint="eastAsia"/>
+          <w:color w:val="1E1E2E"/>
+          <w:sz w:val="22"/>
+          <w:szCs w:val="22"/>
+        </w:rPr>
+        <w:t xml:space="preserve"> </w:t>
+      </w:r>
+      <w:r>
+        <w:rPr>
+          <w:rStyle w:val="a5"/>
+          <w:rFonts w:ascii="Yu Gothic UI" w:eastAsia="Yu Gothic UI" w:hAnsi="Yu Gothic UI" w:hint="eastAsia"/>
+          <w:color w:val="1E1E2E"/>
+          <w:sz w:val="22"/>
+          <w:szCs w:val="22"/>
+        </w:rPr>
+        <w:t>組み込みプロンプト</w:t>
+      </w:r>
+      <w:r>
+        <w:rPr>
+          <w:rFonts w:ascii="Yu Gothic UI" w:eastAsia="Yu Gothic UI" w:hAnsi="Yu Gothic UI" w:hint="eastAsia"/>
+          <w:color w:val="1E1E2E"/>
+          <w:sz w:val="22"/>
+          <w:szCs w:val="22"/>
+        </w:rPr>
+        <w:t>（そのモデルに埋め込まれているシステムプロンプト）</w:t>
       </w:r>
     </w:p>
     <w:p>
       <w:pPr>
-        <w:numPr>
-          <w:ilvl w:val="0"/>
-          <w:numId w:val="4"/>
-        </w:numPr>
-        <w:spacing w:before="45" w:after="45"/>
-        <w:ind w:left="1260" w:right="540"/>
-        <w:divId w:val="2030140560"/>
-        <w:rPr>
-          <w:rFonts w:ascii="Yu Gothic UI" w:eastAsia="Yu Gothic UI" w:hAnsi="Yu Gothic UI" w:hint="eastAsia"/>
-          <w:color w:val="1E1E2E"/>
-          <w:sz w:val="22"/>
-          <w:szCs w:val="22"/>
-        </w:rPr>
-      </w:pPr>
-      <w:r>
-        <w:rPr>
-          <w:rFonts w:ascii="Segoe UI Emoji" w:eastAsia="Yu Gothic UI" w:hAnsi="Segoe UI Emoji" w:cs="Segoe UI Emoji"/>
-          <w:color w:val="1E1E2E"/>
-          <w:sz w:val="22"/>
-          <w:szCs w:val="22"/>
-        </w:rPr>
-        <w:t>📋</w:t>
-      </w:r>
-      <w:r>
-        <w:rPr>
-          <w:rFonts w:ascii="Yu Gothic UI" w:eastAsia="Yu Gothic UI" w:hAnsi="Yu Gothic UI" w:hint="eastAsia"/>
-          <w:color w:val="1E1E2E"/>
-          <w:sz w:val="22"/>
-          <w:szCs w:val="22"/>
-        </w:rPr>
-        <w:t xml:space="preserve"> </w:t>
-      </w:r>
-      <w:r>
-        <w:rPr>
-          <w:rStyle w:val="a5"/>
-          <w:rFonts w:ascii="Yu Gothic UI" w:eastAsia="Yu Gothic UI" w:hAnsi="Yu Gothic UI" w:hint="eastAsia"/>
-          <w:color w:val="1E1E2E"/>
-          <w:sz w:val="22"/>
-          <w:szCs w:val="22"/>
-        </w:rPr>
-        <w:t>組み込みプロンプト</w:t>
-      </w:r>
-      <w:r>
-        <w:rPr>
-          <w:rFonts w:ascii="Yu Gothic UI" w:eastAsia="Yu Gothic UI" w:hAnsi="Yu Gothic UI" w:hint="eastAsia"/>
-          <w:color w:val="1E1E2E"/>
-          <w:sz w:val="22"/>
-          <w:szCs w:val="22"/>
-        </w:rPr>
-        <w:t>（そのモデルに埋め込まれているシステムプロンプト）</w:t>
-      </w:r>
-    </w:p>
-    <w:p>
-      <w:pPr>
         <w:spacing w:before="330" w:after="330"/>
         <w:ind w:left="540" w:right="540"/>
-        <w:divId w:val="2030140560"/>
-        <w:rPr>
-          <w:rFonts w:ascii="Yu Gothic UI" w:eastAsia="Yu Gothic UI" w:hAnsi="Yu Gothic UI" w:hint="eastAsia"/>
-          <w:color w:val="1E1E2E"/>
-          <w:sz w:val="22"/>
-          <w:szCs w:val="22"/>
-        </w:rPr>
-      </w:pPr>
-      <w:r>
-        <w:rPr>
-          <w:rFonts w:ascii="Yu Gothic UI" w:eastAsia="Yu Gothic UI" w:hAnsi="Yu Gothic UI" w:hint="eastAsia"/>
-          <w:color w:val="1E1E2E"/>
-          <w:sz w:val="22"/>
-          <w:szCs w:val="22"/>
-        </w:rPr>
-        <w:pict w14:anchorId="60015F34">
+        <w:divId w:val="83376929"/>
+        <w:rPr>
+          <w:rFonts w:ascii="Yu Gothic UI" w:eastAsia="Yu Gothic UI" w:hAnsi="Yu Gothic UI" w:hint="eastAsia"/>
+          <w:color w:val="1E1E2E"/>
+          <w:sz w:val="22"/>
+          <w:szCs w:val="22"/>
+        </w:rPr>
+      </w:pPr>
+      <w:r>
+        <w:rPr>
+          <w:rFonts w:ascii="Yu Gothic UI" w:eastAsia="Yu Gothic UI" w:hAnsi="Yu Gothic UI" w:hint="eastAsia"/>
+          <w:color w:val="1E1E2E"/>
+          <w:sz w:val="22"/>
+          <w:szCs w:val="22"/>
+        </w:rPr>
+        <w:pict w14:anchorId="6D12F9B1">
           <v:rect id="_x0000_i1032" style="width:0;height:1.5pt" o:hralign="center" o:hrstd="t" o:hr="t" fillcolor="#a0a0a0" stroked="f">
             <v:textbox inset="5.85pt,.7pt,5.85pt,.7pt"/>
           </v:rect>
@@ -5414,7 +5411,7 @@
     <w:p>
       <w:pPr>
         <w:pStyle w:val="2"/>
-        <w:divId w:val="2030140560"/>
+        <w:divId w:val="83376929"/>
         <w:rPr>
           <w:rFonts w:ascii="Yu Gothic UI" w:eastAsia="Yu Gothic UI" w:hAnsi="Yu Gothic UI" w:hint="eastAsia"/>
         </w:rPr>
@@ -5430,7 +5427,7 @@
       <w:pPr>
         <w:pStyle w:val="Web"/>
         <w:ind w:left="540" w:right="540"/>
-        <w:divId w:val="2030140560"/>
+        <w:divId w:val="83376929"/>
         <w:rPr>
           <w:rFonts w:ascii="Yu Gothic UI" w:eastAsia="Yu Gothic UI" w:hAnsi="Yu Gothic UI" w:hint="eastAsia"/>
           <w:color w:val="1E1E2E"/>
@@ -5508,7 +5505,7 @@
     <w:p>
       <w:pPr>
         <w:pStyle w:val="3"/>
-        <w:divId w:val="2030140560"/>
+        <w:divId w:val="83376929"/>
         <w:rPr>
           <w:rFonts w:ascii="Yu Gothic UI" w:eastAsia="Yu Gothic UI" w:hAnsi="Yu Gothic UI" w:hint="eastAsia"/>
         </w:rPr>
@@ -5541,8 +5538,7 @@
     <w:p>
       <w:pPr>
         <w:pStyle w:val="Web"/>
-        <w:ind w:left="540" w:right="540"/>
-        <w:divId w:val="2030140560"/>
+        <w:divId w:val="83376929"/>
         <w:rPr>
           <w:rFonts w:ascii="Yu Gothic UI" w:eastAsia="Yu Gothic UI" w:hAnsi="Yu Gothic UI" w:hint="eastAsia"/>
           <w:color w:val="1E1E2E"/>
@@ -5582,7 +5578,7 @@
     <w:p>
       <w:pPr>
         <w:pStyle w:val="3"/>
-        <w:divId w:val="2030140560"/>
+        <w:divId w:val="83376929"/>
         <w:rPr>
           <w:rFonts w:ascii="Yu Gothic UI" w:eastAsia="Yu Gothic UI" w:hAnsi="Yu Gothic UI" w:hint="eastAsia"/>
         </w:rPr>
@@ -5610,7 +5606,7 @@
       <w:pPr>
         <w:pStyle w:val="Web"/>
         <w:ind w:left="540" w:right="540"/>
-        <w:divId w:val="2030140560"/>
+        <w:divId w:val="83376929"/>
         <w:rPr>
           <w:rFonts w:ascii="Yu Gothic UI" w:eastAsia="Yu Gothic UI" w:hAnsi="Yu Gothic UI" w:hint="eastAsia"/>
           <w:color w:val="1E1E2E"/>
@@ -5740,7 +5736,7 @@
     <w:p>
       <w:pPr>
         <w:pStyle w:val="3"/>
-        <w:divId w:val="2030140560"/>
+        <w:divId w:val="83376929"/>
         <w:rPr>
           <w:rFonts w:ascii="Yu Gothic UI" w:eastAsia="Yu Gothic UI" w:hAnsi="Yu Gothic UI" w:hint="eastAsia"/>
         </w:rPr>
@@ -5774,7 +5770,7 @@
       <w:pPr>
         <w:pStyle w:val="Web"/>
         <w:ind w:left="540" w:right="540"/>
-        <w:divId w:val="2030140560"/>
+        <w:divId w:val="83376929"/>
         <w:rPr>
           <w:rFonts w:ascii="Yu Gothic UI" w:eastAsia="Yu Gothic UI" w:hAnsi="Yu Gothic UI" w:hint="eastAsia"/>
           <w:color w:val="1E1E2E"/>
@@ -5808,6 +5804,56 @@
           <w:szCs w:val="22"/>
         </w:rPr>
         <w:t>には直接の「改名」機能がないため、内部で次の安全手順を自動実行します。</w:t>
+      </w:r>
+    </w:p>
+    <w:p>
+      <w:pPr>
+        <w:numPr>
+          <w:ilvl w:val="0"/>
+          <w:numId w:val="5"/>
+        </w:numPr>
+        <w:spacing w:before="45" w:after="45"/>
+        <w:divId w:val="83376929"/>
+        <w:rPr>
+          <w:rFonts w:ascii="Yu Gothic UI" w:eastAsia="Yu Gothic UI" w:hAnsi="Yu Gothic UI" w:hint="eastAsia"/>
+          <w:color w:val="1E1E2E"/>
+          <w:sz w:val="22"/>
+          <w:szCs w:val="22"/>
+        </w:rPr>
+      </w:pPr>
+      <w:r>
+        <w:rPr>
+          <w:rFonts w:ascii="Yu Gothic UI" w:eastAsia="Yu Gothic UI" w:hAnsi="Yu Gothic UI" w:hint="eastAsia"/>
+          <w:color w:val="1E1E2E"/>
+          <w:sz w:val="22"/>
+          <w:szCs w:val="22"/>
+        </w:rPr>
+        <w:t>いったんバックアップ名でコピー</w:t>
+      </w:r>
+    </w:p>
+    <w:p>
+      <w:pPr>
+        <w:numPr>
+          <w:ilvl w:val="0"/>
+          <w:numId w:val="5"/>
+        </w:numPr>
+        <w:spacing w:before="45" w:after="45"/>
+        <w:divId w:val="83376929"/>
+        <w:rPr>
+          <w:rFonts w:ascii="Yu Gothic UI" w:eastAsia="Yu Gothic UI" w:hAnsi="Yu Gothic UI" w:hint="eastAsia"/>
+          <w:color w:val="1E1E2E"/>
+          <w:sz w:val="22"/>
+          <w:szCs w:val="22"/>
+        </w:rPr>
+      </w:pPr>
+      <w:r>
+        <w:rPr>
+          <w:rFonts w:ascii="Yu Gothic UI" w:eastAsia="Yu Gothic UI" w:hAnsi="Yu Gothic UI" w:hint="eastAsia"/>
+          <w:color w:val="1E1E2E"/>
+          <w:sz w:val="22"/>
+          <w:szCs w:val="22"/>
+        </w:rPr>
+        <w:t>元のモデルを削除</w:t>
       </w:r>
     </w:p>
     <w:p>
@@ -5818,22 +5864,22 @@
         </w:numPr>
         <w:spacing w:before="45" w:after="45"/>
         <w:ind w:left="1260" w:right="540"/>
-        <w:divId w:val="2030140560"/>
-        <w:rPr>
-          <w:rFonts w:ascii="Yu Gothic UI" w:eastAsia="Yu Gothic UI" w:hAnsi="Yu Gothic UI" w:hint="eastAsia"/>
-          <w:color w:val="1E1E2E"/>
-          <w:sz w:val="22"/>
-          <w:szCs w:val="22"/>
-        </w:rPr>
-      </w:pPr>
-      <w:r>
-        <w:rPr>
-          <w:rFonts w:ascii="Yu Gothic UI" w:eastAsia="Yu Gothic UI" w:hAnsi="Yu Gothic UI" w:hint="eastAsia"/>
-          <w:color w:val="1E1E2E"/>
-          <w:sz w:val="22"/>
-          <w:szCs w:val="22"/>
-        </w:rPr>
-        <w:t>いったんバックアップ名でコピー</w:t>
+        <w:divId w:val="83376929"/>
+        <w:rPr>
+          <w:rFonts w:ascii="Yu Gothic UI" w:eastAsia="Yu Gothic UI" w:hAnsi="Yu Gothic UI" w:hint="eastAsia"/>
+          <w:color w:val="1E1E2E"/>
+          <w:sz w:val="22"/>
+          <w:szCs w:val="22"/>
+        </w:rPr>
+      </w:pPr>
+      <w:r>
+        <w:rPr>
+          <w:rFonts w:ascii="Yu Gothic UI" w:eastAsia="Yu Gothic UI" w:hAnsi="Yu Gothic UI" w:hint="eastAsia"/>
+          <w:color w:val="1E1E2E"/>
+          <w:sz w:val="22"/>
+          <w:szCs w:val="22"/>
+        </w:rPr>
+        <w:t>バックアップを新しい名前でコピー</w:t>
       </w:r>
     </w:p>
     <w:p>
@@ -5844,130 +5890,76 @@
         </w:numPr>
         <w:spacing w:before="45" w:after="45"/>
         <w:ind w:left="1260" w:right="540"/>
-        <w:divId w:val="2030140560"/>
-        <w:rPr>
-          <w:rFonts w:ascii="Yu Gothic UI" w:eastAsia="Yu Gothic UI" w:hAnsi="Yu Gothic UI" w:hint="eastAsia"/>
-          <w:color w:val="1E1E2E"/>
-          <w:sz w:val="22"/>
-          <w:szCs w:val="22"/>
-        </w:rPr>
-      </w:pPr>
-      <w:r>
-        <w:rPr>
-          <w:rFonts w:ascii="Yu Gothic UI" w:eastAsia="Yu Gothic UI" w:hAnsi="Yu Gothic UI" w:hint="eastAsia"/>
-          <w:color w:val="1E1E2E"/>
-          <w:sz w:val="22"/>
-          <w:szCs w:val="22"/>
-        </w:rPr>
-        <w:t>元のモデルを削除</w:t>
+        <w:divId w:val="83376929"/>
+        <w:rPr>
+          <w:rFonts w:ascii="Yu Gothic UI" w:eastAsia="Yu Gothic UI" w:hAnsi="Yu Gothic UI" w:hint="eastAsia"/>
+          <w:color w:val="1E1E2E"/>
+          <w:sz w:val="22"/>
+          <w:szCs w:val="22"/>
+        </w:rPr>
+      </w:pPr>
+      <w:r>
+        <w:rPr>
+          <w:rFonts w:ascii="Yu Gothic UI" w:eastAsia="Yu Gothic UI" w:hAnsi="Yu Gothic UI" w:hint="eastAsia"/>
+          <w:color w:val="1E1E2E"/>
+          <w:sz w:val="22"/>
+          <w:szCs w:val="22"/>
+        </w:rPr>
+        <w:t>動作確認できたらバックアップを削除</w:t>
       </w:r>
     </w:p>
     <w:p>
       <w:pPr>
-        <w:numPr>
-          <w:ilvl w:val="0"/>
-          <w:numId w:val="5"/>
-        </w:numPr>
-        <w:spacing w:before="45" w:after="45"/>
-        <w:ind w:left="1260" w:right="540"/>
-        <w:divId w:val="2030140560"/>
-        <w:rPr>
-          <w:rFonts w:ascii="Yu Gothic UI" w:eastAsia="Yu Gothic UI" w:hAnsi="Yu Gothic UI" w:hint="eastAsia"/>
-          <w:color w:val="1E1E2E"/>
-          <w:sz w:val="22"/>
-          <w:szCs w:val="22"/>
-        </w:rPr>
-      </w:pPr>
-      <w:r>
-        <w:rPr>
-          <w:rFonts w:ascii="Yu Gothic UI" w:eastAsia="Yu Gothic UI" w:hAnsi="Yu Gothic UI" w:hint="eastAsia"/>
-          <w:color w:val="1E1E2E"/>
-          <w:sz w:val="22"/>
-          <w:szCs w:val="22"/>
-        </w:rPr>
-        <w:t>バックアップを新しい名前でコピー</w:t>
+        <w:pStyle w:val="Web"/>
+        <w:divId w:val="83376929"/>
+        <w:rPr>
+          <w:rFonts w:ascii="Yu Gothic UI" w:eastAsia="Yu Gothic UI" w:hAnsi="Yu Gothic UI" w:hint="eastAsia"/>
+          <w:color w:val="1E1E2E"/>
+          <w:sz w:val="22"/>
+          <w:szCs w:val="22"/>
+        </w:rPr>
+      </w:pPr>
+      <w:r>
+        <w:rPr>
+          <w:rFonts w:ascii="Yu Gothic UI" w:eastAsia="Yu Gothic UI" w:hAnsi="Yu Gothic UI" w:hint="eastAsia"/>
+          <w:color w:val="1E1E2E"/>
+          <w:sz w:val="22"/>
+          <w:szCs w:val="22"/>
+        </w:rPr>
+        <w:t>途中で失敗した場合は、バックアップが残ることでデータを失わないようになっています。</w:t>
       </w:r>
     </w:p>
     <w:p>
       <w:pPr>
-        <w:numPr>
-          <w:ilvl w:val="0"/>
-          <w:numId w:val="5"/>
-        </w:numPr>
-        <w:spacing w:before="45" w:after="45"/>
-        <w:ind w:left="1260" w:right="540"/>
-        <w:divId w:val="2030140560"/>
-        <w:rPr>
-          <w:rFonts w:ascii="Yu Gothic UI" w:eastAsia="Yu Gothic UI" w:hAnsi="Yu Gothic UI" w:hint="eastAsia"/>
-          <w:color w:val="1E1E2E"/>
-          <w:sz w:val="22"/>
-          <w:szCs w:val="22"/>
-        </w:rPr>
-      </w:pPr>
-      <w:r>
-        <w:rPr>
-          <w:rFonts w:ascii="Yu Gothic UI" w:eastAsia="Yu Gothic UI" w:hAnsi="Yu Gothic UI" w:hint="eastAsia"/>
-          <w:color w:val="1E1E2E"/>
-          <w:sz w:val="22"/>
-          <w:szCs w:val="22"/>
-        </w:rPr>
-        <w:t>動作確認できたらバックアップを削除</w:t>
+        <w:pStyle w:val="3"/>
+        <w:divId w:val="83376929"/>
+        <w:rPr>
+          <w:rFonts w:ascii="Yu Gothic UI" w:eastAsia="Yu Gothic UI" w:hAnsi="Yu Gothic UI" w:hint="eastAsia"/>
+        </w:rPr>
+      </w:pPr>
+      <w:r>
+        <w:rPr>
+          <w:rFonts w:ascii="Segoe UI Emoji" w:eastAsia="Yu Gothic UI" w:hAnsi="Segoe UI Emoji" w:cs="Segoe UI Emoji"/>
+        </w:rPr>
+        <w:t>🆕</w:t>
+      </w:r>
+      <w:r>
+        <w:rPr>
+          <w:rFonts w:ascii="Yu Gothic UI" w:eastAsia="Yu Gothic UI" w:hAnsi="Yu Gothic UI" w:hint="eastAsia"/>
+        </w:rPr>
+        <w:t xml:space="preserve"> </w:t>
+      </w:r>
+      <w:r>
+        <w:rPr>
+          <w:rFonts w:ascii="Yu Gothic UI" w:eastAsia="Yu Gothic UI" w:hAnsi="Yu Gothic UI" w:hint="eastAsia"/>
+        </w:rPr>
+        <w:t>派生登録</w:t>
       </w:r>
     </w:p>
     <w:p>
       <w:pPr>
         <w:pStyle w:val="Web"/>
-        <w:ind w:left="540" w:right="540"/>
-        <w:divId w:val="2030140560"/>
-        <w:rPr>
-          <w:rFonts w:ascii="Yu Gothic UI" w:eastAsia="Yu Gothic UI" w:hAnsi="Yu Gothic UI" w:hint="eastAsia"/>
-          <w:color w:val="1E1E2E"/>
-          <w:sz w:val="22"/>
-          <w:szCs w:val="22"/>
-        </w:rPr>
-      </w:pPr>
-      <w:r>
-        <w:rPr>
-          <w:rFonts w:ascii="Yu Gothic UI" w:eastAsia="Yu Gothic UI" w:hAnsi="Yu Gothic UI" w:hint="eastAsia"/>
-          <w:color w:val="1E1E2E"/>
-          <w:sz w:val="22"/>
-          <w:szCs w:val="22"/>
-        </w:rPr>
-        <w:t>途中で失敗した場合は、バックアップが残ることでデータを失わないようになっています。</w:t>
-      </w:r>
-    </w:p>
-    <w:p>
-      <w:pPr>
-        <w:pStyle w:val="3"/>
-        <w:divId w:val="2030140560"/>
-        <w:rPr>
-          <w:rFonts w:ascii="Yu Gothic UI" w:eastAsia="Yu Gothic UI" w:hAnsi="Yu Gothic UI" w:hint="eastAsia"/>
-        </w:rPr>
-      </w:pPr>
-      <w:r>
-        <w:rPr>
-          <w:rFonts w:ascii="Segoe UI Emoji" w:eastAsia="Yu Gothic UI" w:hAnsi="Segoe UI Emoji" w:cs="Segoe UI Emoji"/>
-        </w:rPr>
-        <w:t>🆕</w:t>
-      </w:r>
-      <w:r>
-        <w:rPr>
-          <w:rFonts w:ascii="Yu Gothic UI" w:eastAsia="Yu Gothic UI" w:hAnsi="Yu Gothic UI" w:hint="eastAsia"/>
-        </w:rPr>
-        <w:t xml:space="preserve"> </w:t>
-      </w:r>
-      <w:r>
-        <w:rPr>
-          <w:rFonts w:ascii="Yu Gothic UI" w:eastAsia="Yu Gothic UI" w:hAnsi="Yu Gothic UI" w:hint="eastAsia"/>
-        </w:rPr>
-        <w:t>派生登録</w:t>
-      </w:r>
-    </w:p>
-    <w:p>
-      <w:pPr>
-        <w:pStyle w:val="Web"/>
-        <w:ind w:left="540" w:right="540"/>
-        <w:divId w:val="2030140560"/>
+        <w:divId w:val="83376929"/>
         <w:rPr>
           <w:rFonts w:ascii="Yu Gothic UI" w:eastAsia="Yu Gothic UI" w:hAnsi="Yu Gothic UI" w:hint="eastAsia"/>
           <w:color w:val="1E1E2E"/>
@@ -6031,7 +6023,7 @@
         </w:numPr>
         <w:spacing w:before="45" w:after="45"/>
         <w:ind w:left="1260" w:right="540"/>
-        <w:divId w:val="2030140560"/>
+        <w:divId w:val="83376929"/>
         <w:rPr>
           <w:rFonts w:ascii="Yu Gothic UI" w:eastAsia="Yu Gothic UI" w:hAnsi="Yu Gothic UI" w:hint="eastAsia"/>
           <w:color w:val="1E1E2E"/>
@@ -6092,8 +6084,7 @@
           <w:numId w:val="6"/>
         </w:numPr>
         <w:spacing w:before="45" w:after="45"/>
-        <w:ind w:left="1260" w:right="540"/>
-        <w:divId w:val="2030140560"/>
+        <w:divId w:val="83376929"/>
         <w:rPr>
           <w:rFonts w:ascii="Yu Gothic UI" w:eastAsia="Yu Gothic UI" w:hAnsi="Yu Gothic UI" w:hint="eastAsia"/>
           <w:color w:val="1E1E2E"/>
@@ -6169,8 +6160,7 @@
           <w:numId w:val="6"/>
         </w:numPr>
         <w:spacing w:before="45" w:after="45"/>
-        <w:ind w:left="1260" w:right="540"/>
-        <w:divId w:val="2030140560"/>
+        <w:divId w:val="83376929"/>
         <w:rPr>
           <w:rFonts w:ascii="Yu Gothic UI" w:eastAsia="Yu Gothic UI" w:hAnsi="Yu Gothic UI" w:hint="eastAsia"/>
           <w:color w:val="1E1E2E"/>
@@ -6260,8 +6250,7 @@
           <w:numId w:val="6"/>
         </w:numPr>
         <w:spacing w:before="45" w:after="45"/>
-        <w:ind w:left="1260" w:right="540"/>
-        <w:divId w:val="2030140560"/>
+        <w:divId w:val="83376929"/>
         <w:rPr>
           <w:rFonts w:ascii="Yu Gothic UI" w:eastAsia="Yu Gothic UI" w:hAnsi="Yu Gothic UI" w:hint="eastAsia"/>
           <w:color w:val="1E1E2E"/>
@@ -6318,7 +6307,7 @@
     <w:p>
       <w:pPr>
         <w:pStyle w:val="3"/>
-        <w:divId w:val="2030140560"/>
+        <w:divId w:val="83376929"/>
         <w:rPr>
           <w:rFonts w:ascii="Yu Gothic UI" w:eastAsia="Yu Gothic UI" w:hAnsi="Yu Gothic UI" w:hint="eastAsia"/>
         </w:rPr>
@@ -6351,8 +6340,7 @@
     <w:p>
       <w:pPr>
         <w:pStyle w:val="Web"/>
-        <w:ind w:left="540" w:right="540"/>
-        <w:divId w:val="2030140560"/>
+        <w:divId w:val="83376929"/>
         <w:rPr>
           <w:rFonts w:ascii="Yu Gothic UI" w:eastAsia="Yu Gothic UI" w:hAnsi="Yu Gothic UI" w:hint="eastAsia"/>
           <w:color w:val="1E1E2E"/>
@@ -6420,22 +6408,22 @@
       <w:pPr>
         <w:spacing w:before="330" w:after="330"/>
         <w:ind w:left="540" w:right="540"/>
-        <w:divId w:val="2030140560"/>
-        <w:rPr>
-          <w:rFonts w:ascii="Yu Gothic UI" w:eastAsia="Yu Gothic UI" w:hAnsi="Yu Gothic UI" w:hint="eastAsia"/>
-          <w:color w:val="1E1E2E"/>
-          <w:sz w:val="22"/>
-          <w:szCs w:val="22"/>
-        </w:rPr>
-      </w:pPr>
-      <w:r>
-        <w:rPr>
-          <w:rFonts w:ascii="Yu Gothic UI" w:eastAsia="Yu Gothic UI" w:hAnsi="Yu Gothic UI" w:hint="eastAsia"/>
-          <w:color w:val="1E1E2E"/>
-          <w:sz w:val="22"/>
-          <w:szCs w:val="22"/>
-        </w:rPr>
-        <w:pict w14:anchorId="2FAE2EED">
+        <w:divId w:val="83376929"/>
+        <w:rPr>
+          <w:rFonts w:ascii="Yu Gothic UI" w:eastAsia="Yu Gothic UI" w:hAnsi="Yu Gothic UI" w:hint="eastAsia"/>
+          <w:color w:val="1E1E2E"/>
+          <w:sz w:val="22"/>
+          <w:szCs w:val="22"/>
+        </w:rPr>
+      </w:pPr>
+      <w:r>
+        <w:rPr>
+          <w:rFonts w:ascii="Yu Gothic UI" w:eastAsia="Yu Gothic UI" w:hAnsi="Yu Gothic UI" w:hint="eastAsia"/>
+          <w:color w:val="1E1E2E"/>
+          <w:sz w:val="22"/>
+          <w:szCs w:val="22"/>
+        </w:rPr>
+        <w:pict w14:anchorId="0C01FAE8">
           <v:rect id="_x0000_i1033" style="width:0;height:1.5pt" o:hralign="center" o:hrstd="t" o:hr="t" fillcolor="#a0a0a0" stroked="f">
             <v:textbox inset="5.85pt,.7pt,5.85pt,.7pt"/>
           </v:rect>
@@ -6445,7 +6433,7 @@
     <w:p>
       <w:pPr>
         <w:pStyle w:val="2"/>
-        <w:divId w:val="2030140560"/>
+        <w:divId w:val="83376929"/>
         <w:rPr>
           <w:rFonts w:ascii="Yu Gothic UI" w:eastAsia="Yu Gothic UI" w:hAnsi="Yu Gothic UI" w:hint="eastAsia"/>
         </w:rPr>
@@ -6466,7 +6454,7 @@
     <w:p>
       <w:pPr>
         <w:pStyle w:val="3"/>
-        <w:divId w:val="2030140560"/>
+        <w:divId w:val="83376929"/>
         <w:rPr>
           <w:rFonts w:ascii="Yu Gothic UI" w:eastAsia="Yu Gothic UI" w:hAnsi="Yu Gothic UI" w:hint="eastAsia"/>
         </w:rPr>
@@ -6481,8 +6469,7 @@
     <w:p>
       <w:pPr>
         <w:pStyle w:val="Web"/>
-        <w:ind w:left="540" w:right="540"/>
-        <w:divId w:val="2030140560"/>
+        <w:divId w:val="83376929"/>
         <w:rPr>
           <w:rFonts w:ascii="Yu Gothic UI" w:eastAsia="Yu Gothic UI" w:hAnsi="Yu Gothic UI" w:hint="eastAsia"/>
           <w:color w:val="1E1E2E"/>
@@ -6555,7 +6542,7 @@
       <w:pPr>
         <w:pStyle w:val="Web"/>
         <w:ind w:left="540" w:right="540"/>
-        <w:divId w:val="2030140560"/>
+        <w:divId w:val="83376929"/>
         <w:rPr>
           <w:rFonts w:ascii="Yu Gothic UI" w:eastAsia="Yu Gothic UI" w:hAnsi="Yu Gothic UI" w:hint="eastAsia"/>
           <w:color w:val="1E1E2E"/>
@@ -6678,7 +6665,7 @@
       <w:pPr>
         <w:pStyle w:val="Web"/>
         <w:ind w:left="540" w:right="540"/>
-        <w:divId w:val="2030140560"/>
+        <w:divId w:val="83376929"/>
         <w:rPr>
           <w:rFonts w:ascii="Yu Gothic UI" w:eastAsia="Yu Gothic UI" w:hAnsi="Yu Gothic UI" w:hint="eastAsia"/>
           <w:color w:val="1E1E2E"/>
@@ -6766,7 +6753,7 @@
     <w:p>
       <w:pPr>
         <w:pStyle w:val="3"/>
-        <w:divId w:val="2030140560"/>
+        <w:divId w:val="83376929"/>
         <w:rPr>
           <w:rFonts w:ascii="Yu Gothic UI" w:eastAsia="Yu Gothic UI" w:hAnsi="Yu Gothic UI" w:hint="eastAsia"/>
         </w:rPr>
@@ -6781,8 +6768,7 @@
     <w:p>
       <w:pPr>
         <w:pStyle w:val="Web"/>
-        <w:ind w:left="540" w:right="540"/>
-        <w:divId w:val="2030140560"/>
+        <w:divId w:val="83376929"/>
         <w:rPr>
           <w:rFonts w:ascii="Yu Gothic UI" w:eastAsia="Yu Gothic UI" w:hAnsi="Yu Gothic UI" w:hint="eastAsia"/>
           <w:color w:val="1E1E2E"/>
@@ -6870,8 +6856,7 @@
           <w:numId w:val="7"/>
         </w:numPr>
         <w:spacing w:before="45" w:after="45"/>
-        <w:ind w:left="1260" w:right="540"/>
-        <w:divId w:val="2030140560"/>
+        <w:divId w:val="83376929"/>
         <w:rPr>
           <w:rFonts w:ascii="Yu Gothic UI" w:eastAsia="Yu Gothic UI" w:hAnsi="Yu Gothic UI" w:hint="eastAsia"/>
           <w:color w:val="1E1E2E"/>
@@ -6925,7 +6910,7 @@
           <w:numId w:val="7"/>
         </w:numPr>
         <w:spacing w:before="45" w:after="45"/>
-        <w:divId w:val="2030140560"/>
+        <w:divId w:val="83376929"/>
         <w:rPr>
           <w:rFonts w:ascii="Yu Gothic UI" w:eastAsia="Yu Gothic UI" w:hAnsi="Yu Gothic UI" w:hint="eastAsia"/>
           <w:color w:val="1E1E2E"/>
@@ -6976,7 +6961,7 @@
       <w:pPr>
         <w:pStyle w:val="Web"/>
         <w:ind w:left="540" w:right="540"/>
-        <w:divId w:val="2030140560"/>
+        <w:divId w:val="83376929"/>
         <w:rPr>
           <w:rFonts w:ascii="Yu Gothic UI" w:eastAsia="Yu Gothic UI" w:hAnsi="Yu Gothic UI" w:hint="eastAsia"/>
           <w:color w:val="1E1E2E"/>
@@ -7075,303 +7060,6 @@
           <w:szCs w:val="22"/>
         </w:rPr>
         <w:t>の順に処理し、片方が失敗してももう片方の結果はきちんと報告します）</w:t>
-      </w:r>
-    </w:p>
-    <w:p>
-      <w:pPr>
-        <w:pStyle w:val="Web"/>
-        <w:shd w:val="clear" w:color="auto" w:fill="FEF9F3"/>
-        <w:divId w:val="771054293"/>
-        <w:rPr>
-          <w:rFonts w:ascii="Yu Gothic UI" w:eastAsia="Yu Gothic UI" w:hAnsi="Yu Gothic UI" w:hint="eastAsia"/>
-          <w:color w:val="4C4F69"/>
-          <w:sz w:val="22"/>
-          <w:szCs w:val="22"/>
-        </w:rPr>
-      </w:pPr>
-      <w:r>
-        <w:rPr>
-          <w:rFonts w:ascii="Yu Gothic UI" w:eastAsia="Yu Gothic UI" w:hAnsi="Yu Gothic UI" w:hint="eastAsia"/>
-          <w:color w:val="4C4F69"/>
-          <w:sz w:val="22"/>
-          <w:szCs w:val="22"/>
-        </w:rPr>
-        <w:t>「派生登録（新規作成）」では、</w:t>
-      </w:r>
-      <w:r>
-        <w:rPr>
-          <w:rFonts w:ascii="Yu Gothic UI" w:eastAsia="Yu Gothic UI" w:hAnsi="Yu Gothic UI" w:hint="eastAsia"/>
-          <w:color w:val="4C4F69"/>
-          <w:sz w:val="22"/>
-          <w:szCs w:val="22"/>
-        </w:rPr>
-        <w:t xml:space="preserve">Ollama </w:t>
-      </w:r>
-      <w:r>
-        <w:rPr>
-          <w:rFonts w:ascii="Yu Gothic UI" w:eastAsia="Yu Gothic UI" w:hAnsi="Yu Gothic UI" w:hint="eastAsia"/>
-          <w:color w:val="4C4F69"/>
-          <w:sz w:val="22"/>
-          <w:szCs w:val="22"/>
-        </w:rPr>
-        <w:t>への保存が必須のため</w:t>
-      </w:r>
-      <w:r>
-        <w:rPr>
-          <w:rFonts w:ascii="Yu Gothic UI" w:eastAsia="Yu Gothic UI" w:hAnsi="Yu Gothic UI" w:hint="eastAsia"/>
-          <w:color w:val="4C4F69"/>
-          <w:sz w:val="22"/>
-          <w:szCs w:val="22"/>
-        </w:rPr>
-        <w:t xml:space="preserve"> </w:t>
-      </w:r>
-      <w:r>
-        <w:rPr>
-          <w:rFonts w:ascii="Yu Gothic UI" w:eastAsia="Yu Gothic UI" w:hAnsi="Yu Gothic UI" w:hint="eastAsia"/>
-          <w:color w:val="4C4F69"/>
-          <w:sz w:val="22"/>
-          <w:szCs w:val="22"/>
-        </w:rPr>
-        <w:t>「</w:t>
-      </w:r>
-      <w:r>
-        <w:rPr>
-          <w:rFonts w:ascii="Yu Gothic UI" w:eastAsia="Yu Gothic UI" w:hAnsi="Yu Gothic UI" w:hint="eastAsia"/>
-          <w:color w:val="4C4F69"/>
-          <w:sz w:val="22"/>
-          <w:szCs w:val="22"/>
-        </w:rPr>
-        <w:t xml:space="preserve">Ollama </w:t>
-      </w:r>
-      <w:r>
-        <w:rPr>
-          <w:rFonts w:ascii="Yu Gothic UI" w:eastAsia="Yu Gothic UI" w:hAnsi="Yu Gothic UI" w:hint="eastAsia"/>
-          <w:color w:val="4C4F69"/>
-          <w:sz w:val="22"/>
-          <w:szCs w:val="22"/>
-        </w:rPr>
-        <w:t>に保存」は常に</w:t>
-      </w:r>
-      <w:r>
-        <w:rPr>
-          <w:rFonts w:ascii="Yu Gothic UI" w:eastAsia="Yu Gothic UI" w:hAnsi="Yu Gothic UI" w:hint="eastAsia"/>
-          <w:color w:val="4C4F69"/>
-          <w:sz w:val="22"/>
-          <w:szCs w:val="22"/>
-        </w:rPr>
-        <w:t xml:space="preserve"> ON</w:t>
-      </w:r>
-      <w:r>
-        <w:rPr>
-          <w:rFonts w:ascii="Yu Gothic UI" w:eastAsia="Yu Gothic UI" w:hAnsi="Yu Gothic UI" w:hint="eastAsia"/>
-          <w:color w:val="4C4F69"/>
-          <w:sz w:val="22"/>
-          <w:szCs w:val="22"/>
-        </w:rPr>
-        <w:t>（グレー表示）になっています。</w:t>
-      </w:r>
-    </w:p>
-    <w:p>
-      <w:pPr>
-        <w:pStyle w:val="3"/>
-        <w:divId w:val="2030140560"/>
-        <w:rPr>
-          <w:rFonts w:ascii="Yu Gothic UI" w:eastAsia="Yu Gothic UI" w:hAnsi="Yu Gothic UI" w:hint="eastAsia"/>
-        </w:rPr>
-      </w:pPr>
-      <w:r>
-        <w:rPr>
-          <w:rFonts w:ascii="Yu Gothic UI" w:eastAsia="Yu Gothic UI" w:hAnsi="Yu Gothic UI" w:hint="eastAsia"/>
-        </w:rPr>
-        <w:t xml:space="preserve">OpenWebUI </w:t>
-      </w:r>
-      <w:r>
-        <w:rPr>
-          <w:rFonts w:ascii="Yu Gothic UI" w:eastAsia="Yu Gothic UI" w:hAnsi="Yu Gothic UI" w:hint="eastAsia"/>
-        </w:rPr>
-        <w:t>側に「初めて」のモデルでも自動で登録されます</w:t>
-      </w:r>
-    </w:p>
-    <w:p>
-      <w:pPr>
-        <w:pStyle w:val="Web"/>
-        <w:ind w:left="540" w:right="540"/>
-        <w:divId w:val="2030140560"/>
-        <w:rPr>
-          <w:rFonts w:ascii="Yu Gothic UI" w:eastAsia="Yu Gothic UI" w:hAnsi="Yu Gothic UI" w:hint="eastAsia"/>
-          <w:color w:val="1E1E2E"/>
-          <w:sz w:val="22"/>
-          <w:szCs w:val="22"/>
-        </w:rPr>
-      </w:pPr>
-      <w:r>
-        <w:rPr>
-          <w:rFonts w:ascii="Yu Gothic UI" w:eastAsia="Yu Gothic UI" w:hAnsi="Yu Gothic UI" w:hint="eastAsia"/>
-          <w:color w:val="1E1E2E"/>
-          <w:sz w:val="22"/>
-          <w:szCs w:val="22"/>
-        </w:rPr>
-        <w:t xml:space="preserve">OpenWebUI </w:t>
-      </w:r>
-      <w:r>
-        <w:rPr>
-          <w:rFonts w:ascii="Yu Gothic UI" w:eastAsia="Yu Gothic UI" w:hAnsi="Yu Gothic UI" w:hint="eastAsia"/>
-          <w:color w:val="1E1E2E"/>
-          <w:sz w:val="22"/>
-          <w:szCs w:val="22"/>
-        </w:rPr>
-        <w:t>は、一度も管理画面で触れたことのないモデルを「知らないモデル」として扱います。</w:t>
-      </w:r>
-      <w:r>
-        <w:rPr>
-          <w:rFonts w:ascii="Yu Gothic UI" w:eastAsia="Yu Gothic UI" w:hAnsi="Yu Gothic UI" w:hint="eastAsia"/>
-          <w:color w:val="1E1E2E"/>
-          <w:sz w:val="22"/>
-          <w:szCs w:val="22"/>
-        </w:rPr>
-        <w:t xml:space="preserve"> </w:t>
-      </w:r>
-      <w:r>
-        <w:rPr>
-          <w:rFonts w:ascii="Yu Gothic UI" w:eastAsia="Yu Gothic UI" w:hAnsi="Yu Gothic UI" w:hint="eastAsia"/>
-          <w:color w:val="1E1E2E"/>
-          <w:sz w:val="22"/>
-          <w:szCs w:val="22"/>
-        </w:rPr>
-        <w:t>そのため以前は、新しいモデルに初めてプロンプトを送る前に、</w:t>
-      </w:r>
-      <w:r>
-        <w:rPr>
-          <w:rFonts w:ascii="Yu Gothic UI" w:eastAsia="Yu Gothic UI" w:hAnsi="Yu Gothic UI" w:hint="eastAsia"/>
-          <w:color w:val="1E1E2E"/>
-          <w:sz w:val="22"/>
-          <w:szCs w:val="22"/>
-        </w:rPr>
-        <w:t xml:space="preserve"> </w:t>
-      </w:r>
-      <w:r>
-        <w:rPr>
-          <w:rStyle w:val="a5"/>
-          <w:rFonts w:ascii="Yu Gothic UI" w:eastAsia="Yu Gothic UI" w:hAnsi="Yu Gothic UI" w:hint="eastAsia"/>
-          <w:color w:val="1E1E2E"/>
-          <w:sz w:val="22"/>
-          <w:szCs w:val="22"/>
-        </w:rPr>
-        <w:t xml:space="preserve">OpenWebUI </w:t>
-      </w:r>
-      <w:r>
-        <w:rPr>
-          <w:rStyle w:val="a5"/>
-          <w:rFonts w:ascii="Yu Gothic UI" w:eastAsia="Yu Gothic UI" w:hAnsi="Yu Gothic UI" w:hint="eastAsia"/>
-          <w:color w:val="1E1E2E"/>
-          <w:sz w:val="22"/>
-          <w:szCs w:val="22"/>
-        </w:rPr>
-        <w:t>の管理者パネルで一度手動保存しておく</w:t>
-      </w:r>
-      <w:r>
-        <w:rPr>
-          <w:rFonts w:ascii="Yu Gothic UI" w:eastAsia="Yu Gothic UI" w:hAnsi="Yu Gothic UI" w:hint="eastAsia"/>
-          <w:color w:val="1E1E2E"/>
-          <w:sz w:val="22"/>
-          <w:szCs w:val="22"/>
-        </w:rPr>
-        <w:t>必要がありました（いわゆる「初回登録」）。</w:t>
-      </w:r>
-    </w:p>
-    <w:p>
-      <w:pPr>
-        <w:pStyle w:val="Web"/>
-        <w:ind w:left="540" w:right="540"/>
-        <w:divId w:val="2030140560"/>
-        <w:rPr>
-          <w:rFonts w:ascii="Yu Gothic UI" w:eastAsia="Yu Gothic UI" w:hAnsi="Yu Gothic UI" w:hint="eastAsia"/>
-          <w:color w:val="1E1E2E"/>
-          <w:sz w:val="22"/>
-          <w:szCs w:val="22"/>
-        </w:rPr>
-      </w:pPr>
-      <w:r>
-        <w:rPr>
-          <w:rStyle w:val="a5"/>
-          <w:rFonts w:ascii="Yu Gothic UI" w:eastAsia="Yu Gothic UI" w:hAnsi="Yu Gothic UI" w:hint="eastAsia"/>
-          <w:color w:val="1E1E2E"/>
-          <w:sz w:val="22"/>
-          <w:szCs w:val="22"/>
-        </w:rPr>
-        <w:t>もでコレはこの手間を自動化しています。</w:t>
-      </w:r>
-      <w:r>
-        <w:rPr>
-          <w:rFonts w:ascii="Yu Gothic UI" w:eastAsia="Yu Gothic UI" w:hAnsi="Yu Gothic UI" w:hint="eastAsia"/>
-          <w:color w:val="1E1E2E"/>
-          <w:sz w:val="22"/>
-          <w:szCs w:val="22"/>
-        </w:rPr>
-        <w:t xml:space="preserve"> </w:t>
-      </w:r>
-      <w:r>
-        <w:rPr>
-          <w:rFonts w:ascii="Yu Gothic UI" w:eastAsia="Yu Gothic UI" w:hAnsi="Yu Gothic UI" w:hint="eastAsia"/>
-          <w:color w:val="1E1E2E"/>
-          <w:sz w:val="22"/>
-          <w:szCs w:val="22"/>
-        </w:rPr>
-        <w:t>保存しようとしたモデルが</w:t>
-      </w:r>
-      <w:r>
-        <w:rPr>
-          <w:rFonts w:ascii="Yu Gothic UI" w:eastAsia="Yu Gothic UI" w:hAnsi="Yu Gothic UI" w:hint="eastAsia"/>
-          <w:color w:val="1E1E2E"/>
-          <w:sz w:val="22"/>
-          <w:szCs w:val="22"/>
-        </w:rPr>
-        <w:t xml:space="preserve"> OpenWebUI </w:t>
-      </w:r>
-      <w:r>
-        <w:rPr>
-          <w:rFonts w:ascii="Yu Gothic UI" w:eastAsia="Yu Gothic UI" w:hAnsi="Yu Gothic UI" w:hint="eastAsia"/>
-          <w:color w:val="1E1E2E"/>
-          <w:sz w:val="22"/>
-          <w:szCs w:val="22"/>
-        </w:rPr>
-        <w:t>側にまだ無い場合は、もでコレが自動でそのモデルを登録してから</w:t>
-      </w:r>
-      <w:r>
-        <w:rPr>
-          <w:rFonts w:ascii="Yu Gothic UI" w:eastAsia="Yu Gothic UI" w:hAnsi="Yu Gothic UI" w:hint="eastAsia"/>
-          <w:color w:val="1E1E2E"/>
-          <w:sz w:val="22"/>
-          <w:szCs w:val="22"/>
-        </w:rPr>
-        <w:t xml:space="preserve"> </w:t>
-      </w:r>
-      <w:r>
-        <w:rPr>
-          <w:rFonts w:ascii="Yu Gothic UI" w:eastAsia="Yu Gothic UI" w:hAnsi="Yu Gothic UI" w:hint="eastAsia"/>
-          <w:color w:val="1E1E2E"/>
-          <w:sz w:val="22"/>
-          <w:szCs w:val="22"/>
-        </w:rPr>
-        <w:t>プロンプトを書き込みます。利用者が管理者パネルを開いて準備しておく必要はありません。</w:t>
-      </w:r>
-      <w:r>
-        <w:rPr>
-          <w:rFonts w:ascii="Yu Gothic UI" w:eastAsia="Yu Gothic UI" w:hAnsi="Yu Gothic UI" w:hint="eastAsia"/>
-          <w:color w:val="1E1E2E"/>
-          <w:sz w:val="22"/>
-          <w:szCs w:val="22"/>
-        </w:rPr>
-        <w:t xml:space="preserve"> </w:t>
-      </w:r>
-      <w:r>
-        <w:rPr>
-          <w:rFonts w:ascii="Yu Gothic UI" w:eastAsia="Yu Gothic UI" w:hAnsi="Yu Gothic UI" w:hint="eastAsia"/>
-          <w:color w:val="1E1E2E"/>
-          <w:sz w:val="22"/>
-          <w:szCs w:val="22"/>
-        </w:rPr>
-        <w:t>チェックを入れて保存するだけで完了します。</w:t>
       </w:r>
     </w:p>
     <w:p>
@@ -7379,7 +7067,304 @@
         <w:pStyle w:val="Web"/>
         <w:shd w:val="clear" w:color="auto" w:fill="FEF9F3"/>
         <w:ind w:left="540" w:right="540"/>
-        <w:divId w:val="1231816420"/>
+        <w:divId w:val="1636334072"/>
+        <w:rPr>
+          <w:rFonts w:ascii="Yu Gothic UI" w:eastAsia="Yu Gothic UI" w:hAnsi="Yu Gothic UI" w:hint="eastAsia"/>
+          <w:color w:val="4C4F69"/>
+          <w:sz w:val="22"/>
+          <w:szCs w:val="22"/>
+        </w:rPr>
+      </w:pPr>
+      <w:r>
+        <w:rPr>
+          <w:rFonts w:ascii="Yu Gothic UI" w:eastAsia="Yu Gothic UI" w:hAnsi="Yu Gothic UI" w:hint="eastAsia"/>
+          <w:color w:val="4C4F69"/>
+          <w:sz w:val="22"/>
+          <w:szCs w:val="22"/>
+        </w:rPr>
+        <w:t>「派生登録（新規作成）」では、</w:t>
+      </w:r>
+      <w:r>
+        <w:rPr>
+          <w:rFonts w:ascii="Yu Gothic UI" w:eastAsia="Yu Gothic UI" w:hAnsi="Yu Gothic UI" w:hint="eastAsia"/>
+          <w:color w:val="4C4F69"/>
+          <w:sz w:val="22"/>
+          <w:szCs w:val="22"/>
+        </w:rPr>
+        <w:t xml:space="preserve">Ollama </w:t>
+      </w:r>
+      <w:r>
+        <w:rPr>
+          <w:rFonts w:ascii="Yu Gothic UI" w:eastAsia="Yu Gothic UI" w:hAnsi="Yu Gothic UI" w:hint="eastAsia"/>
+          <w:color w:val="4C4F69"/>
+          <w:sz w:val="22"/>
+          <w:szCs w:val="22"/>
+        </w:rPr>
+        <w:t>への保存が必須のため</w:t>
+      </w:r>
+      <w:r>
+        <w:rPr>
+          <w:rFonts w:ascii="Yu Gothic UI" w:eastAsia="Yu Gothic UI" w:hAnsi="Yu Gothic UI" w:hint="eastAsia"/>
+          <w:color w:val="4C4F69"/>
+          <w:sz w:val="22"/>
+          <w:szCs w:val="22"/>
+        </w:rPr>
+        <w:t xml:space="preserve"> </w:t>
+      </w:r>
+      <w:r>
+        <w:rPr>
+          <w:rFonts w:ascii="Yu Gothic UI" w:eastAsia="Yu Gothic UI" w:hAnsi="Yu Gothic UI" w:hint="eastAsia"/>
+          <w:color w:val="4C4F69"/>
+          <w:sz w:val="22"/>
+          <w:szCs w:val="22"/>
+        </w:rPr>
+        <w:t>「</w:t>
+      </w:r>
+      <w:r>
+        <w:rPr>
+          <w:rFonts w:ascii="Yu Gothic UI" w:eastAsia="Yu Gothic UI" w:hAnsi="Yu Gothic UI" w:hint="eastAsia"/>
+          <w:color w:val="4C4F69"/>
+          <w:sz w:val="22"/>
+          <w:szCs w:val="22"/>
+        </w:rPr>
+        <w:t xml:space="preserve">Ollama </w:t>
+      </w:r>
+      <w:r>
+        <w:rPr>
+          <w:rFonts w:ascii="Yu Gothic UI" w:eastAsia="Yu Gothic UI" w:hAnsi="Yu Gothic UI" w:hint="eastAsia"/>
+          <w:color w:val="4C4F69"/>
+          <w:sz w:val="22"/>
+          <w:szCs w:val="22"/>
+        </w:rPr>
+        <w:t>に保存」は常に</w:t>
+      </w:r>
+      <w:r>
+        <w:rPr>
+          <w:rFonts w:ascii="Yu Gothic UI" w:eastAsia="Yu Gothic UI" w:hAnsi="Yu Gothic UI" w:hint="eastAsia"/>
+          <w:color w:val="4C4F69"/>
+          <w:sz w:val="22"/>
+          <w:szCs w:val="22"/>
+        </w:rPr>
+        <w:t xml:space="preserve"> ON</w:t>
+      </w:r>
+      <w:r>
+        <w:rPr>
+          <w:rFonts w:ascii="Yu Gothic UI" w:eastAsia="Yu Gothic UI" w:hAnsi="Yu Gothic UI" w:hint="eastAsia"/>
+          <w:color w:val="4C4F69"/>
+          <w:sz w:val="22"/>
+          <w:szCs w:val="22"/>
+        </w:rPr>
+        <w:t>（グレー表示）になっています。</w:t>
+      </w:r>
+    </w:p>
+    <w:p>
+      <w:pPr>
+        <w:pStyle w:val="3"/>
+        <w:divId w:val="83376929"/>
+        <w:rPr>
+          <w:rFonts w:ascii="Yu Gothic UI" w:eastAsia="Yu Gothic UI" w:hAnsi="Yu Gothic UI" w:hint="eastAsia"/>
+        </w:rPr>
+      </w:pPr>
+      <w:r>
+        <w:rPr>
+          <w:rFonts w:ascii="Yu Gothic UI" w:eastAsia="Yu Gothic UI" w:hAnsi="Yu Gothic UI" w:hint="eastAsia"/>
+        </w:rPr>
+        <w:t xml:space="preserve">OpenWebUI </w:t>
+      </w:r>
+      <w:r>
+        <w:rPr>
+          <w:rFonts w:ascii="Yu Gothic UI" w:eastAsia="Yu Gothic UI" w:hAnsi="Yu Gothic UI" w:hint="eastAsia"/>
+        </w:rPr>
+        <w:t>側に「初めて」のモデルでも自動で登録されます</w:t>
+      </w:r>
+    </w:p>
+    <w:p>
+      <w:pPr>
+        <w:pStyle w:val="Web"/>
+        <w:ind w:left="540" w:right="540"/>
+        <w:divId w:val="83376929"/>
+        <w:rPr>
+          <w:rFonts w:ascii="Yu Gothic UI" w:eastAsia="Yu Gothic UI" w:hAnsi="Yu Gothic UI" w:hint="eastAsia"/>
+          <w:color w:val="1E1E2E"/>
+          <w:sz w:val="22"/>
+          <w:szCs w:val="22"/>
+        </w:rPr>
+      </w:pPr>
+      <w:r>
+        <w:rPr>
+          <w:rFonts w:ascii="Yu Gothic UI" w:eastAsia="Yu Gothic UI" w:hAnsi="Yu Gothic UI" w:hint="eastAsia"/>
+          <w:color w:val="1E1E2E"/>
+          <w:sz w:val="22"/>
+          <w:szCs w:val="22"/>
+        </w:rPr>
+        <w:t xml:space="preserve">OpenWebUI </w:t>
+      </w:r>
+      <w:r>
+        <w:rPr>
+          <w:rFonts w:ascii="Yu Gothic UI" w:eastAsia="Yu Gothic UI" w:hAnsi="Yu Gothic UI" w:hint="eastAsia"/>
+          <w:color w:val="1E1E2E"/>
+          <w:sz w:val="22"/>
+          <w:szCs w:val="22"/>
+        </w:rPr>
+        <w:t>は、一度も管理画面で触れたことのないモデルを「知らないモデル」として扱います。</w:t>
+      </w:r>
+      <w:r>
+        <w:rPr>
+          <w:rFonts w:ascii="Yu Gothic UI" w:eastAsia="Yu Gothic UI" w:hAnsi="Yu Gothic UI" w:hint="eastAsia"/>
+          <w:color w:val="1E1E2E"/>
+          <w:sz w:val="22"/>
+          <w:szCs w:val="22"/>
+        </w:rPr>
+        <w:t xml:space="preserve"> </w:t>
+      </w:r>
+      <w:r>
+        <w:rPr>
+          <w:rFonts w:ascii="Yu Gothic UI" w:eastAsia="Yu Gothic UI" w:hAnsi="Yu Gothic UI" w:hint="eastAsia"/>
+          <w:color w:val="1E1E2E"/>
+          <w:sz w:val="22"/>
+          <w:szCs w:val="22"/>
+        </w:rPr>
+        <w:t>そのため以前は、新しいモデルに初めてプロンプトを送る前に、</w:t>
+      </w:r>
+      <w:r>
+        <w:rPr>
+          <w:rFonts w:ascii="Yu Gothic UI" w:eastAsia="Yu Gothic UI" w:hAnsi="Yu Gothic UI" w:hint="eastAsia"/>
+          <w:color w:val="1E1E2E"/>
+          <w:sz w:val="22"/>
+          <w:szCs w:val="22"/>
+        </w:rPr>
+        <w:t xml:space="preserve"> </w:t>
+      </w:r>
+      <w:r>
+        <w:rPr>
+          <w:rStyle w:val="a5"/>
+          <w:rFonts w:ascii="Yu Gothic UI" w:eastAsia="Yu Gothic UI" w:hAnsi="Yu Gothic UI" w:hint="eastAsia"/>
+          <w:color w:val="1E1E2E"/>
+          <w:sz w:val="22"/>
+          <w:szCs w:val="22"/>
+        </w:rPr>
+        <w:t xml:space="preserve">OpenWebUI </w:t>
+      </w:r>
+      <w:r>
+        <w:rPr>
+          <w:rStyle w:val="a5"/>
+          <w:rFonts w:ascii="Yu Gothic UI" w:eastAsia="Yu Gothic UI" w:hAnsi="Yu Gothic UI" w:hint="eastAsia"/>
+          <w:color w:val="1E1E2E"/>
+          <w:sz w:val="22"/>
+          <w:szCs w:val="22"/>
+        </w:rPr>
+        <w:t>の管理者パネルで一度手動保存しておく</w:t>
+      </w:r>
+      <w:r>
+        <w:rPr>
+          <w:rFonts w:ascii="Yu Gothic UI" w:eastAsia="Yu Gothic UI" w:hAnsi="Yu Gothic UI" w:hint="eastAsia"/>
+          <w:color w:val="1E1E2E"/>
+          <w:sz w:val="22"/>
+          <w:szCs w:val="22"/>
+        </w:rPr>
+        <w:t>必要がありました（いわゆる「初回登録」）。</w:t>
+      </w:r>
+    </w:p>
+    <w:p>
+      <w:pPr>
+        <w:pStyle w:val="Web"/>
+        <w:ind w:left="540" w:right="540"/>
+        <w:divId w:val="83376929"/>
+        <w:rPr>
+          <w:rFonts w:ascii="Yu Gothic UI" w:eastAsia="Yu Gothic UI" w:hAnsi="Yu Gothic UI" w:hint="eastAsia"/>
+          <w:color w:val="1E1E2E"/>
+          <w:sz w:val="22"/>
+          <w:szCs w:val="22"/>
+        </w:rPr>
+      </w:pPr>
+      <w:r>
+        <w:rPr>
+          <w:rStyle w:val="a5"/>
+          <w:rFonts w:ascii="Yu Gothic UI" w:eastAsia="Yu Gothic UI" w:hAnsi="Yu Gothic UI" w:hint="eastAsia"/>
+          <w:color w:val="1E1E2E"/>
+          <w:sz w:val="22"/>
+          <w:szCs w:val="22"/>
+        </w:rPr>
+        <w:t>もでコレはこの手間を自動化しています。</w:t>
+      </w:r>
+      <w:r>
+        <w:rPr>
+          <w:rFonts w:ascii="Yu Gothic UI" w:eastAsia="Yu Gothic UI" w:hAnsi="Yu Gothic UI" w:hint="eastAsia"/>
+          <w:color w:val="1E1E2E"/>
+          <w:sz w:val="22"/>
+          <w:szCs w:val="22"/>
+        </w:rPr>
+        <w:t xml:space="preserve"> </w:t>
+      </w:r>
+      <w:r>
+        <w:rPr>
+          <w:rFonts w:ascii="Yu Gothic UI" w:eastAsia="Yu Gothic UI" w:hAnsi="Yu Gothic UI" w:hint="eastAsia"/>
+          <w:color w:val="1E1E2E"/>
+          <w:sz w:val="22"/>
+          <w:szCs w:val="22"/>
+        </w:rPr>
+        <w:t>保存しようとしたモデルが</w:t>
+      </w:r>
+      <w:r>
+        <w:rPr>
+          <w:rFonts w:ascii="Yu Gothic UI" w:eastAsia="Yu Gothic UI" w:hAnsi="Yu Gothic UI" w:hint="eastAsia"/>
+          <w:color w:val="1E1E2E"/>
+          <w:sz w:val="22"/>
+          <w:szCs w:val="22"/>
+        </w:rPr>
+        <w:t xml:space="preserve"> OpenWebUI </w:t>
+      </w:r>
+      <w:r>
+        <w:rPr>
+          <w:rFonts w:ascii="Yu Gothic UI" w:eastAsia="Yu Gothic UI" w:hAnsi="Yu Gothic UI" w:hint="eastAsia"/>
+          <w:color w:val="1E1E2E"/>
+          <w:sz w:val="22"/>
+          <w:szCs w:val="22"/>
+        </w:rPr>
+        <w:t>側にまだ無い場合は、もでコレが自動でそのモデルを登録してから</w:t>
+      </w:r>
+      <w:r>
+        <w:rPr>
+          <w:rFonts w:ascii="Yu Gothic UI" w:eastAsia="Yu Gothic UI" w:hAnsi="Yu Gothic UI" w:hint="eastAsia"/>
+          <w:color w:val="1E1E2E"/>
+          <w:sz w:val="22"/>
+          <w:szCs w:val="22"/>
+        </w:rPr>
+        <w:t xml:space="preserve"> </w:t>
+      </w:r>
+      <w:r>
+        <w:rPr>
+          <w:rFonts w:ascii="Yu Gothic UI" w:eastAsia="Yu Gothic UI" w:hAnsi="Yu Gothic UI" w:hint="eastAsia"/>
+          <w:color w:val="1E1E2E"/>
+          <w:sz w:val="22"/>
+          <w:szCs w:val="22"/>
+        </w:rPr>
+        <w:t>プロンプトを書き込みます。利用者が管理者パネルを開いて準備しておく必要はありません。</w:t>
+      </w:r>
+      <w:r>
+        <w:rPr>
+          <w:rFonts w:ascii="Yu Gothic UI" w:eastAsia="Yu Gothic UI" w:hAnsi="Yu Gothic UI" w:hint="eastAsia"/>
+          <w:color w:val="1E1E2E"/>
+          <w:sz w:val="22"/>
+          <w:szCs w:val="22"/>
+        </w:rPr>
+        <w:t xml:space="preserve"> </w:t>
+      </w:r>
+      <w:r>
+        <w:rPr>
+          <w:rFonts w:ascii="Yu Gothic UI" w:eastAsia="Yu Gothic UI" w:hAnsi="Yu Gothic UI" w:hint="eastAsia"/>
+          <w:color w:val="1E1E2E"/>
+          <w:sz w:val="22"/>
+          <w:szCs w:val="22"/>
+        </w:rPr>
+        <w:t>チェックを入れて保存するだけで完了します。</w:t>
+      </w:r>
+    </w:p>
+    <w:p>
+      <w:pPr>
+        <w:pStyle w:val="Web"/>
+        <w:shd w:val="clear" w:color="auto" w:fill="FEF9F3"/>
+        <w:divId w:val="1456368906"/>
         <w:rPr>
           <w:rFonts w:ascii="Yu Gothic UI" w:eastAsia="Yu Gothic UI" w:hAnsi="Yu Gothic UI" w:hint="eastAsia"/>
           <w:color w:val="4C4F69"/>
@@ -7674,7 +7659,7 @@
     <w:p>
       <w:pPr>
         <w:pStyle w:val="3"/>
-        <w:divId w:val="2030140560"/>
+        <w:divId w:val="83376929"/>
         <w:rPr>
           <w:rFonts w:ascii="Yu Gothic UI" w:eastAsia="Yu Gothic UI" w:hAnsi="Yu Gothic UI" w:hint="eastAsia"/>
         </w:rPr>
@@ -7689,8 +7674,7 @@
     <w:p>
       <w:pPr>
         <w:pStyle w:val="Web"/>
-        <w:ind w:left="540" w:right="540"/>
-        <w:divId w:val="2030140560"/>
+        <w:divId w:val="83376929"/>
         <w:rPr>
           <w:rFonts w:ascii="Yu Gothic UI" w:eastAsia="Yu Gothic UI" w:hAnsi="Yu Gothic UI" w:hint="eastAsia"/>
           <w:color w:val="1E1E2E"/>
@@ -7782,7 +7766,7 @@
       </w:tblGrid>
       <w:tr>
         <w:trPr>
-          <w:divId w:val="2030140560"/>
+          <w:divId w:val="83376929"/>
           <w:tblHeader/>
         </w:trPr>
         <w:tc>
@@ -7917,7 +7901,7 @@
       </w:tr>
       <w:tr>
         <w:trPr>
-          <w:divId w:val="2030140560"/>
+          <w:divId w:val="83376929"/>
         </w:trPr>
         <w:tc>
           <w:tcPr>
@@ -8039,7 +8023,7 @@
       </w:tr>
       <w:tr>
         <w:trPr>
-          <w:divId w:val="2030140560"/>
+          <w:divId w:val="83376929"/>
         </w:trPr>
         <w:tc>
           <w:tcPr>
@@ -8161,7 +8145,7 @@
       </w:tr>
       <w:tr>
         <w:trPr>
-          <w:divId w:val="2030140560"/>
+          <w:divId w:val="83376929"/>
         </w:trPr>
         <w:tc>
           <w:tcPr>
@@ -8276,7 +8260,8 @@
     <w:p>
       <w:pPr>
         <w:pStyle w:val="Web"/>
-        <w:divId w:val="2030140560"/>
+        <w:ind w:left="540" w:right="540"/>
+        <w:divId w:val="83376929"/>
         <w:rPr>
           <w:rFonts w:ascii="Yu Gothic UI" w:eastAsia="Yu Gothic UI" w:hAnsi="Yu Gothic UI" w:hint="eastAsia"/>
           <w:color w:val="1E1E2E"/>
@@ -8333,7 +8318,7 @@
         <w:pStyle w:val="Web"/>
         <w:shd w:val="clear" w:color="auto" w:fill="FEF9F3"/>
         <w:ind w:left="540" w:right="540"/>
-        <w:divId w:val="723910781"/>
+        <w:divId w:val="2087263710"/>
         <w:rPr>
           <w:rFonts w:ascii="Yu Gothic UI" w:eastAsia="Yu Gothic UI" w:hAnsi="Yu Gothic UI" w:hint="eastAsia"/>
           <w:color w:val="4C4F69"/>
@@ -8530,7 +8515,7 @@
     <w:p>
       <w:pPr>
         <w:pStyle w:val="3"/>
-        <w:divId w:val="2030140560"/>
+        <w:divId w:val="83376929"/>
         <w:rPr>
           <w:rFonts w:ascii="Yu Gothic UI" w:eastAsia="Yu Gothic UI" w:hAnsi="Yu Gothic UI" w:hint="eastAsia"/>
         </w:rPr>
@@ -8546,7 +8531,7 @@
       <w:pPr>
         <w:pStyle w:val="Web"/>
         <w:ind w:left="540" w:right="540"/>
-        <w:divId w:val="2030140560"/>
+        <w:divId w:val="83376929"/>
         <w:rPr>
           <w:rFonts w:ascii="Yu Gothic UI" w:eastAsia="Yu Gothic UI" w:hAnsi="Yu Gothic UI" w:hint="eastAsia"/>
           <w:color w:val="1E1E2E"/>
@@ -8602,8 +8587,7 @@
     <w:p>
       <w:pPr>
         <w:pStyle w:val="HTML0"/>
-        <w:ind w:left="540" w:right="540"/>
-        <w:divId w:val="2030140560"/>
+        <w:divId w:val="83376929"/>
         <w:rPr>
           <w:rFonts w:ascii="Consolas" w:hAnsi="Consolas"/>
           <w:sz w:val="20"/>
@@ -8622,7 +8606,8 @@
     <w:p>
       <w:pPr>
         <w:pStyle w:val="HTML0"/>
-        <w:divId w:val="2030140560"/>
+        <w:ind w:left="540" w:right="540"/>
+        <w:divId w:val="83376929"/>
         <w:rPr>
           <w:rFonts w:ascii="Consolas" w:hAnsi="Consolas"/>
           <w:sz w:val="20"/>
@@ -8642,7 +8627,7 @@
       <w:pPr>
         <w:pStyle w:val="HTML0"/>
         <w:ind w:left="540" w:right="540"/>
-        <w:divId w:val="2030140560"/>
+        <w:divId w:val="83376929"/>
         <w:rPr>
           <w:rFonts w:ascii="Consolas" w:hAnsi="Consolas"/>
           <w:sz w:val="20"/>
@@ -8693,7 +8678,8 @@
     <w:p>
       <w:pPr>
         <w:pStyle w:val="HTML0"/>
-        <w:divId w:val="2030140560"/>
+        <w:ind w:left="540" w:right="540"/>
+        <w:divId w:val="83376929"/>
         <w:rPr>
           <w:rFonts w:ascii="Consolas" w:hAnsi="Consolas"/>
           <w:sz w:val="20"/>
@@ -8717,7 +8703,7 @@
         </w:numPr>
         <w:spacing w:before="45" w:after="45"/>
         <w:ind w:left="1260" w:right="540"/>
-        <w:divId w:val="2030140560"/>
+        <w:divId w:val="83376929"/>
         <w:rPr>
           <w:rFonts w:ascii="Yu Gothic UI" w:eastAsia="Yu Gothic UI" w:hAnsi="Yu Gothic UI" w:hint="eastAsia"/>
           <w:color w:val="1E1E2E"/>
@@ -8812,8 +8798,7 @@
           <w:numId w:val="8"/>
         </w:numPr>
         <w:spacing w:before="45" w:after="45"/>
-        <w:ind w:left="1260" w:right="540"/>
-        <w:divId w:val="2030140560"/>
+        <w:divId w:val="83376929"/>
         <w:rPr>
           <w:rFonts w:ascii="Yu Gothic UI" w:eastAsia="Yu Gothic UI" w:hAnsi="Yu Gothic UI" w:hint="eastAsia"/>
           <w:color w:val="1E1E2E"/>
@@ -8890,7 +8875,7 @@
       <w:pPr>
         <w:pStyle w:val="Web"/>
         <w:ind w:left="540" w:right="540"/>
-        <w:divId w:val="2030140560"/>
+        <w:divId w:val="83376929"/>
         <w:rPr>
           <w:rFonts w:ascii="Yu Gothic UI" w:eastAsia="Yu Gothic UI" w:hAnsi="Yu Gothic UI" w:hint="eastAsia"/>
           <w:color w:val="1E1E2E"/>
@@ -9055,6 +9040,287 @@
           <w:szCs w:val="22"/>
         </w:rPr>
         <w:t>から発行できます。</w:t>
+      </w:r>
+    </w:p>
+    <w:p>
+      <w:pPr>
+        <w:pStyle w:val="Web"/>
+        <w:shd w:val="clear" w:color="auto" w:fill="FEF9F3"/>
+        <w:divId w:val="210382312"/>
+        <w:rPr>
+          <w:rFonts w:ascii="Yu Gothic UI" w:eastAsia="Yu Gothic UI" w:hAnsi="Yu Gothic UI" w:hint="eastAsia"/>
+          <w:color w:val="4C4F69"/>
+          <w:sz w:val="22"/>
+          <w:szCs w:val="22"/>
+        </w:rPr>
+      </w:pPr>
+      <w:r>
+        <w:rPr>
+          <w:rFonts w:ascii="Segoe UI Emoji" w:eastAsia="Yu Gothic UI" w:hAnsi="Segoe UI Emoji" w:cs="Segoe UI Emoji"/>
+          <w:color w:val="4C4F69"/>
+          <w:sz w:val="22"/>
+          <w:szCs w:val="22"/>
+        </w:rPr>
+        <w:t>⚠</w:t>
+      </w:r>
+      <w:r>
+        <w:rPr>
+          <w:rFonts w:ascii="Segoe UI Emoji" w:eastAsia="Yu Gothic UI" w:hAnsi="Segoe UI Emoji" w:cs="Segoe UI Emoji"/>
+          <w:color w:val="4C4F69"/>
+          <w:sz w:val="22"/>
+          <w:szCs w:val="22"/>
+        </w:rPr>
+        <w:t>️</w:t>
+      </w:r>
+      <w:r>
+        <w:rPr>
+          <w:rFonts w:ascii="Yu Gothic UI" w:eastAsia="Yu Gothic UI" w:hAnsi="Yu Gothic UI" w:hint="eastAsia"/>
+          <w:color w:val="4C4F69"/>
+          <w:sz w:val="22"/>
+          <w:szCs w:val="22"/>
+        </w:rPr>
+        <w:t xml:space="preserve"> </w:t>
+      </w:r>
+      <w:r>
+        <w:rPr>
+          <w:rStyle w:val="a5"/>
+          <w:rFonts w:ascii="Yu Gothic UI" w:eastAsia="Yu Gothic UI" w:hAnsi="Yu Gothic UI" w:hint="eastAsia"/>
+          <w:color w:val="4C4F69"/>
+          <w:sz w:val="22"/>
+          <w:szCs w:val="22"/>
+        </w:rPr>
+        <w:t xml:space="preserve">API </w:t>
+      </w:r>
+      <w:r>
+        <w:rPr>
+          <w:rStyle w:val="a5"/>
+          <w:rFonts w:ascii="Yu Gothic UI" w:eastAsia="Yu Gothic UI" w:hAnsi="Yu Gothic UI" w:hint="eastAsia"/>
+          <w:color w:val="4C4F69"/>
+          <w:sz w:val="22"/>
+          <w:szCs w:val="22"/>
+        </w:rPr>
+        <w:t>キーが</w:t>
+      </w:r>
+      <w:r>
+        <w:rPr>
+          <w:rStyle w:val="a5"/>
+          <w:rFonts w:ascii="Yu Gothic UI" w:eastAsia="Yu Gothic UI" w:hAnsi="Yu Gothic UI" w:hint="eastAsia"/>
+          <w:color w:val="4C4F69"/>
+          <w:sz w:val="22"/>
+          <w:szCs w:val="22"/>
+        </w:rPr>
+        <w:t xml:space="preserve"> 403 </w:t>
+      </w:r>
+      <w:r>
+        <w:rPr>
+          <w:rStyle w:val="a5"/>
+          <w:rFonts w:ascii="Yu Gothic UI" w:eastAsia="Yu Gothic UI" w:hAnsi="Yu Gothic UI" w:hint="eastAsia"/>
+          <w:color w:val="4C4F69"/>
+          <w:sz w:val="22"/>
+          <w:szCs w:val="22"/>
+        </w:rPr>
+        <w:t>エラーで弾かれる場合</w:t>
+      </w:r>
+      <w:r>
+        <w:rPr>
+          <w:rStyle w:val="a5"/>
+          <w:rFonts w:ascii="Yu Gothic UI" w:eastAsia="Yu Gothic UI" w:hAnsi="Yu Gothic UI" w:hint="eastAsia"/>
+          <w:color w:val="4C4F69"/>
+          <w:sz w:val="22"/>
+          <w:szCs w:val="22"/>
+        </w:rPr>
+        <w:t>:</w:t>
+      </w:r>
+      <w:r>
+        <w:rPr>
+          <w:rFonts w:ascii="Yu Gothic UI" w:eastAsia="Yu Gothic UI" w:hAnsi="Yu Gothic UI" w:hint="eastAsia"/>
+          <w:color w:val="4C4F69"/>
+          <w:sz w:val="22"/>
+          <w:szCs w:val="22"/>
+        </w:rPr>
+        <w:t xml:space="preserve"> </w:t>
+      </w:r>
+      <w:r>
+        <w:rPr>
+          <w:rFonts w:ascii="Yu Gothic UI" w:eastAsia="Yu Gothic UI" w:hAnsi="Yu Gothic UI" w:hint="eastAsia"/>
+          <w:color w:val="4C4F69"/>
+          <w:sz w:val="22"/>
+          <w:szCs w:val="22"/>
+        </w:rPr>
+        <w:t>管理者パネル</w:t>
+      </w:r>
+      <w:r>
+        <w:rPr>
+          <w:rFonts w:ascii="Yu Gothic UI" w:eastAsia="Yu Gothic UI" w:hAnsi="Yu Gothic UI" w:hint="eastAsia"/>
+          <w:color w:val="4C4F69"/>
+          <w:sz w:val="22"/>
+          <w:szCs w:val="22"/>
+        </w:rPr>
+        <w:t xml:space="preserve"> </w:t>
+      </w:r>
+      <w:r>
+        <w:rPr>
+          <w:rFonts w:ascii="Yu Gothic UI" w:eastAsia="Yu Gothic UI" w:hAnsi="Yu Gothic UI" w:hint="eastAsia"/>
+          <w:color w:val="4C4F69"/>
+          <w:sz w:val="22"/>
+          <w:szCs w:val="22"/>
+        </w:rPr>
+        <w:t>→</w:t>
+      </w:r>
+      <w:r>
+        <w:rPr>
+          <w:rFonts w:ascii="Yu Gothic UI" w:eastAsia="Yu Gothic UI" w:hAnsi="Yu Gothic UI" w:hint="eastAsia"/>
+          <w:color w:val="4C4F69"/>
+          <w:sz w:val="22"/>
+          <w:szCs w:val="22"/>
+        </w:rPr>
+        <w:t xml:space="preserve"> </w:t>
+      </w:r>
+      <w:r>
+        <w:rPr>
+          <w:rFonts w:ascii="Yu Gothic UI" w:eastAsia="Yu Gothic UI" w:hAnsi="Yu Gothic UI" w:hint="eastAsia"/>
+          <w:color w:val="4C4F69"/>
+          <w:sz w:val="22"/>
+          <w:szCs w:val="22"/>
+        </w:rPr>
+        <w:t>設定</w:t>
+      </w:r>
+      <w:r>
+        <w:rPr>
+          <w:rFonts w:ascii="Yu Gothic UI" w:eastAsia="Yu Gothic UI" w:hAnsi="Yu Gothic UI" w:hint="eastAsia"/>
+          <w:color w:val="4C4F69"/>
+          <w:sz w:val="22"/>
+          <w:szCs w:val="22"/>
+        </w:rPr>
+        <w:t xml:space="preserve"> </w:t>
+      </w:r>
+      <w:r>
+        <w:rPr>
+          <w:rFonts w:ascii="Yu Gothic UI" w:eastAsia="Yu Gothic UI" w:hAnsi="Yu Gothic UI" w:hint="eastAsia"/>
+          <w:color w:val="4C4F69"/>
+          <w:sz w:val="22"/>
+          <w:szCs w:val="22"/>
+        </w:rPr>
+        <w:t>→</w:t>
+      </w:r>
+      <w:r>
+        <w:rPr>
+          <w:rFonts w:ascii="Yu Gothic UI" w:eastAsia="Yu Gothic UI" w:hAnsi="Yu Gothic UI" w:hint="eastAsia"/>
+          <w:color w:val="4C4F69"/>
+          <w:sz w:val="22"/>
+          <w:szCs w:val="22"/>
+        </w:rPr>
+        <w:t xml:space="preserve"> </w:t>
+      </w:r>
+      <w:r>
+        <w:rPr>
+          <w:rFonts w:ascii="Yu Gothic UI" w:eastAsia="Yu Gothic UI" w:hAnsi="Yu Gothic UI" w:hint="eastAsia"/>
+          <w:color w:val="4C4F69"/>
+          <w:sz w:val="22"/>
+          <w:szCs w:val="22"/>
+        </w:rPr>
+        <w:t>一般</w:t>
+      </w:r>
+      <w:r>
+        <w:rPr>
+          <w:rFonts w:ascii="Yu Gothic UI" w:eastAsia="Yu Gothic UI" w:hAnsi="Yu Gothic UI" w:hint="eastAsia"/>
+          <w:color w:val="4C4F69"/>
+          <w:sz w:val="22"/>
+          <w:szCs w:val="22"/>
+        </w:rPr>
+        <w:t xml:space="preserve"> </w:t>
+      </w:r>
+      <w:r>
+        <w:rPr>
+          <w:rFonts w:ascii="Yu Gothic UI" w:eastAsia="Yu Gothic UI" w:hAnsi="Yu Gothic UI" w:hint="eastAsia"/>
+          <w:color w:val="4C4F69"/>
+          <w:sz w:val="22"/>
+          <w:szCs w:val="22"/>
+        </w:rPr>
+        <w:t>の「</w:t>
+      </w:r>
+      <w:r>
+        <w:rPr>
+          <w:rStyle w:val="a5"/>
+          <w:rFonts w:ascii="Yu Gothic UI" w:eastAsia="Yu Gothic UI" w:hAnsi="Yu Gothic UI" w:hint="eastAsia"/>
+          <w:color w:val="4C4F69"/>
+          <w:sz w:val="22"/>
+          <w:szCs w:val="22"/>
+        </w:rPr>
+        <w:t xml:space="preserve">API </w:t>
+      </w:r>
+      <w:r>
+        <w:rPr>
+          <w:rStyle w:val="a5"/>
+          <w:rFonts w:ascii="Yu Gothic UI" w:eastAsia="Yu Gothic UI" w:hAnsi="Yu Gothic UI" w:hint="eastAsia"/>
+          <w:color w:val="4C4F69"/>
+          <w:sz w:val="22"/>
+          <w:szCs w:val="22"/>
+        </w:rPr>
+        <w:t>キーのエンドポイント制限</w:t>
+      </w:r>
+      <w:r>
+        <w:rPr>
+          <w:rFonts w:ascii="Yu Gothic UI" w:eastAsia="Yu Gothic UI" w:hAnsi="Yu Gothic UI" w:hint="eastAsia"/>
+          <w:color w:val="4C4F69"/>
+          <w:sz w:val="22"/>
+          <w:szCs w:val="22"/>
+        </w:rPr>
+        <w:t>」が</w:t>
+      </w:r>
+      <w:r>
+        <w:rPr>
+          <w:rFonts w:ascii="Yu Gothic UI" w:eastAsia="Yu Gothic UI" w:hAnsi="Yu Gothic UI" w:hint="eastAsia"/>
+          <w:color w:val="4C4F69"/>
+          <w:sz w:val="22"/>
+          <w:szCs w:val="22"/>
+        </w:rPr>
+        <w:t xml:space="preserve"> ON </w:t>
+      </w:r>
+      <w:r>
+        <w:rPr>
+          <w:rFonts w:ascii="Yu Gothic UI" w:eastAsia="Yu Gothic UI" w:hAnsi="Yu Gothic UI" w:hint="eastAsia"/>
+          <w:color w:val="4C4F69"/>
+          <w:sz w:val="22"/>
+          <w:szCs w:val="22"/>
+        </w:rPr>
+        <w:t>になっていないか確認してください。</w:t>
+      </w:r>
+      <w:r>
+        <w:rPr>
+          <w:rFonts w:ascii="Yu Gothic UI" w:eastAsia="Yu Gothic UI" w:hAnsi="Yu Gothic UI" w:hint="eastAsia"/>
+          <w:color w:val="4C4F69"/>
+          <w:sz w:val="22"/>
+          <w:szCs w:val="22"/>
+        </w:rPr>
+        <w:t xml:space="preserve"> ON </w:t>
+      </w:r>
+      <w:r>
+        <w:rPr>
+          <w:rFonts w:ascii="Yu Gothic UI" w:eastAsia="Yu Gothic UI" w:hAnsi="Yu Gothic UI" w:hint="eastAsia"/>
+          <w:color w:val="4C4F69"/>
+          <w:sz w:val="22"/>
+          <w:szCs w:val="22"/>
+        </w:rPr>
+        <w:t>だと外部からのアクセスが制限されます。</w:t>
+      </w:r>
+      <w:r>
+        <w:rPr>
+          <w:rFonts w:ascii="Yu Gothic UI" w:eastAsia="Yu Gothic UI" w:hAnsi="Yu Gothic UI" w:hint="eastAsia"/>
+          <w:color w:val="4C4F69"/>
+          <w:sz w:val="22"/>
+          <w:szCs w:val="22"/>
+        </w:rPr>
+        <w:t xml:space="preserve">OFF </w:t>
+      </w:r>
+      <w:r>
+        <w:rPr>
+          <w:rFonts w:ascii="Yu Gothic UI" w:eastAsia="Yu Gothic UI" w:hAnsi="Yu Gothic UI" w:hint="eastAsia"/>
+          <w:color w:val="4C4F69"/>
+          <w:sz w:val="22"/>
+          <w:szCs w:val="22"/>
+        </w:rPr>
+        <w:t>にすると解消します。</w:t>
       </w:r>
     </w:p>
     <w:p>
@@ -9062,289 +9328,7 @@
         <w:pStyle w:val="Web"/>
         <w:shd w:val="clear" w:color="auto" w:fill="FEF9F3"/>
         <w:ind w:left="540" w:right="540"/>
-        <w:divId w:val="1938520110"/>
-        <w:rPr>
-          <w:rFonts w:ascii="Yu Gothic UI" w:eastAsia="Yu Gothic UI" w:hAnsi="Yu Gothic UI" w:hint="eastAsia"/>
-          <w:color w:val="4C4F69"/>
-          <w:sz w:val="22"/>
-          <w:szCs w:val="22"/>
-        </w:rPr>
-      </w:pPr>
-      <w:r>
-        <w:rPr>
-          <w:rFonts w:ascii="Segoe UI Emoji" w:eastAsia="Yu Gothic UI" w:hAnsi="Segoe UI Emoji" w:cs="Segoe UI Emoji"/>
-          <w:color w:val="4C4F69"/>
-          <w:sz w:val="22"/>
-          <w:szCs w:val="22"/>
-        </w:rPr>
-        <w:t>⚠</w:t>
-      </w:r>
-      <w:r>
-        <w:rPr>
-          <w:rFonts w:ascii="Segoe UI Emoji" w:eastAsia="Yu Gothic UI" w:hAnsi="Segoe UI Emoji" w:cs="Segoe UI Emoji"/>
-          <w:color w:val="4C4F69"/>
-          <w:sz w:val="22"/>
-          <w:szCs w:val="22"/>
-        </w:rPr>
-        <w:t>️</w:t>
-      </w:r>
-      <w:r>
-        <w:rPr>
-          <w:rFonts w:ascii="Yu Gothic UI" w:eastAsia="Yu Gothic UI" w:hAnsi="Yu Gothic UI" w:hint="eastAsia"/>
-          <w:color w:val="4C4F69"/>
-          <w:sz w:val="22"/>
-          <w:szCs w:val="22"/>
-        </w:rPr>
-        <w:t xml:space="preserve"> </w:t>
-      </w:r>
-      <w:r>
-        <w:rPr>
-          <w:rStyle w:val="a5"/>
-          <w:rFonts w:ascii="Yu Gothic UI" w:eastAsia="Yu Gothic UI" w:hAnsi="Yu Gothic UI" w:hint="eastAsia"/>
-          <w:color w:val="4C4F69"/>
-          <w:sz w:val="22"/>
-          <w:szCs w:val="22"/>
-        </w:rPr>
-        <w:t xml:space="preserve">API </w:t>
-      </w:r>
-      <w:r>
-        <w:rPr>
-          <w:rStyle w:val="a5"/>
-          <w:rFonts w:ascii="Yu Gothic UI" w:eastAsia="Yu Gothic UI" w:hAnsi="Yu Gothic UI" w:hint="eastAsia"/>
-          <w:color w:val="4C4F69"/>
-          <w:sz w:val="22"/>
-          <w:szCs w:val="22"/>
-        </w:rPr>
-        <w:t>キーが</w:t>
-      </w:r>
-      <w:r>
-        <w:rPr>
-          <w:rStyle w:val="a5"/>
-          <w:rFonts w:ascii="Yu Gothic UI" w:eastAsia="Yu Gothic UI" w:hAnsi="Yu Gothic UI" w:hint="eastAsia"/>
-          <w:color w:val="4C4F69"/>
-          <w:sz w:val="22"/>
-          <w:szCs w:val="22"/>
-        </w:rPr>
-        <w:t xml:space="preserve"> 403 </w:t>
-      </w:r>
-      <w:r>
-        <w:rPr>
-          <w:rStyle w:val="a5"/>
-          <w:rFonts w:ascii="Yu Gothic UI" w:eastAsia="Yu Gothic UI" w:hAnsi="Yu Gothic UI" w:hint="eastAsia"/>
-          <w:color w:val="4C4F69"/>
-          <w:sz w:val="22"/>
-          <w:szCs w:val="22"/>
-        </w:rPr>
-        <w:t>エラーで弾かれる場合</w:t>
-      </w:r>
-      <w:r>
-        <w:rPr>
-          <w:rStyle w:val="a5"/>
-          <w:rFonts w:ascii="Yu Gothic UI" w:eastAsia="Yu Gothic UI" w:hAnsi="Yu Gothic UI" w:hint="eastAsia"/>
-          <w:color w:val="4C4F69"/>
-          <w:sz w:val="22"/>
-          <w:szCs w:val="22"/>
-        </w:rPr>
-        <w:t>:</w:t>
-      </w:r>
-      <w:r>
-        <w:rPr>
-          <w:rFonts w:ascii="Yu Gothic UI" w:eastAsia="Yu Gothic UI" w:hAnsi="Yu Gothic UI" w:hint="eastAsia"/>
-          <w:color w:val="4C4F69"/>
-          <w:sz w:val="22"/>
-          <w:szCs w:val="22"/>
-        </w:rPr>
-        <w:t xml:space="preserve"> </w:t>
-      </w:r>
-      <w:r>
-        <w:rPr>
-          <w:rFonts w:ascii="Yu Gothic UI" w:eastAsia="Yu Gothic UI" w:hAnsi="Yu Gothic UI" w:hint="eastAsia"/>
-          <w:color w:val="4C4F69"/>
-          <w:sz w:val="22"/>
-          <w:szCs w:val="22"/>
-        </w:rPr>
-        <w:t>管理者パネル</w:t>
-      </w:r>
-      <w:r>
-        <w:rPr>
-          <w:rFonts w:ascii="Yu Gothic UI" w:eastAsia="Yu Gothic UI" w:hAnsi="Yu Gothic UI" w:hint="eastAsia"/>
-          <w:color w:val="4C4F69"/>
-          <w:sz w:val="22"/>
-          <w:szCs w:val="22"/>
-        </w:rPr>
-        <w:t xml:space="preserve"> </w:t>
-      </w:r>
-      <w:r>
-        <w:rPr>
-          <w:rFonts w:ascii="Yu Gothic UI" w:eastAsia="Yu Gothic UI" w:hAnsi="Yu Gothic UI" w:hint="eastAsia"/>
-          <w:color w:val="4C4F69"/>
-          <w:sz w:val="22"/>
-          <w:szCs w:val="22"/>
-        </w:rPr>
-        <w:t>→</w:t>
-      </w:r>
-      <w:r>
-        <w:rPr>
-          <w:rFonts w:ascii="Yu Gothic UI" w:eastAsia="Yu Gothic UI" w:hAnsi="Yu Gothic UI" w:hint="eastAsia"/>
-          <w:color w:val="4C4F69"/>
-          <w:sz w:val="22"/>
-          <w:szCs w:val="22"/>
-        </w:rPr>
-        <w:t xml:space="preserve"> </w:t>
-      </w:r>
-      <w:r>
-        <w:rPr>
-          <w:rFonts w:ascii="Yu Gothic UI" w:eastAsia="Yu Gothic UI" w:hAnsi="Yu Gothic UI" w:hint="eastAsia"/>
-          <w:color w:val="4C4F69"/>
-          <w:sz w:val="22"/>
-          <w:szCs w:val="22"/>
-        </w:rPr>
-        <w:t>設定</w:t>
-      </w:r>
-      <w:r>
-        <w:rPr>
-          <w:rFonts w:ascii="Yu Gothic UI" w:eastAsia="Yu Gothic UI" w:hAnsi="Yu Gothic UI" w:hint="eastAsia"/>
-          <w:color w:val="4C4F69"/>
-          <w:sz w:val="22"/>
-          <w:szCs w:val="22"/>
-        </w:rPr>
-        <w:t xml:space="preserve"> </w:t>
-      </w:r>
-      <w:r>
-        <w:rPr>
-          <w:rFonts w:ascii="Yu Gothic UI" w:eastAsia="Yu Gothic UI" w:hAnsi="Yu Gothic UI" w:hint="eastAsia"/>
-          <w:color w:val="4C4F69"/>
-          <w:sz w:val="22"/>
-          <w:szCs w:val="22"/>
-        </w:rPr>
-        <w:t>→</w:t>
-      </w:r>
-      <w:r>
-        <w:rPr>
-          <w:rFonts w:ascii="Yu Gothic UI" w:eastAsia="Yu Gothic UI" w:hAnsi="Yu Gothic UI" w:hint="eastAsia"/>
-          <w:color w:val="4C4F69"/>
-          <w:sz w:val="22"/>
-          <w:szCs w:val="22"/>
-        </w:rPr>
-        <w:t xml:space="preserve"> </w:t>
-      </w:r>
-      <w:r>
-        <w:rPr>
-          <w:rFonts w:ascii="Yu Gothic UI" w:eastAsia="Yu Gothic UI" w:hAnsi="Yu Gothic UI" w:hint="eastAsia"/>
-          <w:color w:val="4C4F69"/>
-          <w:sz w:val="22"/>
-          <w:szCs w:val="22"/>
-        </w:rPr>
-        <w:t>一般</w:t>
-      </w:r>
-      <w:r>
-        <w:rPr>
-          <w:rFonts w:ascii="Yu Gothic UI" w:eastAsia="Yu Gothic UI" w:hAnsi="Yu Gothic UI" w:hint="eastAsia"/>
-          <w:color w:val="4C4F69"/>
-          <w:sz w:val="22"/>
-          <w:szCs w:val="22"/>
-        </w:rPr>
-        <w:t xml:space="preserve"> </w:t>
-      </w:r>
-      <w:r>
-        <w:rPr>
-          <w:rFonts w:ascii="Yu Gothic UI" w:eastAsia="Yu Gothic UI" w:hAnsi="Yu Gothic UI" w:hint="eastAsia"/>
-          <w:color w:val="4C4F69"/>
-          <w:sz w:val="22"/>
-          <w:szCs w:val="22"/>
-        </w:rPr>
-        <w:t>の「</w:t>
-      </w:r>
-      <w:r>
-        <w:rPr>
-          <w:rStyle w:val="a5"/>
-          <w:rFonts w:ascii="Yu Gothic UI" w:eastAsia="Yu Gothic UI" w:hAnsi="Yu Gothic UI" w:hint="eastAsia"/>
-          <w:color w:val="4C4F69"/>
-          <w:sz w:val="22"/>
-          <w:szCs w:val="22"/>
-        </w:rPr>
-        <w:t xml:space="preserve">API </w:t>
-      </w:r>
-      <w:r>
-        <w:rPr>
-          <w:rStyle w:val="a5"/>
-          <w:rFonts w:ascii="Yu Gothic UI" w:eastAsia="Yu Gothic UI" w:hAnsi="Yu Gothic UI" w:hint="eastAsia"/>
-          <w:color w:val="4C4F69"/>
-          <w:sz w:val="22"/>
-          <w:szCs w:val="22"/>
-        </w:rPr>
-        <w:t>キーのエンドポイント制限</w:t>
-      </w:r>
-      <w:r>
-        <w:rPr>
-          <w:rFonts w:ascii="Yu Gothic UI" w:eastAsia="Yu Gothic UI" w:hAnsi="Yu Gothic UI" w:hint="eastAsia"/>
-          <w:color w:val="4C4F69"/>
-          <w:sz w:val="22"/>
-          <w:szCs w:val="22"/>
-        </w:rPr>
-        <w:t>」が</w:t>
-      </w:r>
-      <w:r>
-        <w:rPr>
-          <w:rFonts w:ascii="Yu Gothic UI" w:eastAsia="Yu Gothic UI" w:hAnsi="Yu Gothic UI" w:hint="eastAsia"/>
-          <w:color w:val="4C4F69"/>
-          <w:sz w:val="22"/>
-          <w:szCs w:val="22"/>
-        </w:rPr>
-        <w:t xml:space="preserve"> ON </w:t>
-      </w:r>
-      <w:r>
-        <w:rPr>
-          <w:rFonts w:ascii="Yu Gothic UI" w:eastAsia="Yu Gothic UI" w:hAnsi="Yu Gothic UI" w:hint="eastAsia"/>
-          <w:color w:val="4C4F69"/>
-          <w:sz w:val="22"/>
-          <w:szCs w:val="22"/>
-        </w:rPr>
-        <w:t>になっていないか確認してください。</w:t>
-      </w:r>
-      <w:r>
-        <w:rPr>
-          <w:rFonts w:ascii="Yu Gothic UI" w:eastAsia="Yu Gothic UI" w:hAnsi="Yu Gothic UI" w:hint="eastAsia"/>
-          <w:color w:val="4C4F69"/>
-          <w:sz w:val="22"/>
-          <w:szCs w:val="22"/>
-        </w:rPr>
-        <w:t xml:space="preserve"> ON </w:t>
-      </w:r>
-      <w:r>
-        <w:rPr>
-          <w:rFonts w:ascii="Yu Gothic UI" w:eastAsia="Yu Gothic UI" w:hAnsi="Yu Gothic UI" w:hint="eastAsia"/>
-          <w:color w:val="4C4F69"/>
-          <w:sz w:val="22"/>
-          <w:szCs w:val="22"/>
-        </w:rPr>
-        <w:t>だと外部からのアクセスが制限されます。</w:t>
-      </w:r>
-      <w:r>
-        <w:rPr>
-          <w:rFonts w:ascii="Yu Gothic UI" w:eastAsia="Yu Gothic UI" w:hAnsi="Yu Gothic UI" w:hint="eastAsia"/>
-          <w:color w:val="4C4F69"/>
-          <w:sz w:val="22"/>
-          <w:szCs w:val="22"/>
-        </w:rPr>
-        <w:t xml:space="preserve">OFF </w:t>
-      </w:r>
-      <w:r>
-        <w:rPr>
-          <w:rFonts w:ascii="Yu Gothic UI" w:eastAsia="Yu Gothic UI" w:hAnsi="Yu Gothic UI" w:hint="eastAsia"/>
-          <w:color w:val="4C4F69"/>
-          <w:sz w:val="22"/>
-          <w:szCs w:val="22"/>
-        </w:rPr>
-        <w:t>にすると解消します。</w:t>
-      </w:r>
-    </w:p>
-    <w:p>
-      <w:pPr>
-        <w:pStyle w:val="Web"/>
-        <w:shd w:val="clear" w:color="auto" w:fill="FEF9F3"/>
-        <w:ind w:left="540" w:right="540"/>
-        <w:divId w:val="1938520110"/>
+        <w:divId w:val="210382312"/>
         <w:rPr>
           <w:rFonts w:ascii="Yu Gothic UI" w:eastAsia="Yu Gothic UI" w:hAnsi="Yu Gothic UI" w:hint="eastAsia"/>
           <w:color w:val="4C4F69"/>
@@ -9477,23 +9461,22 @@
     <w:p>
       <w:pPr>
         <w:spacing w:before="330" w:after="330"/>
-        <w:ind w:left="540" w:right="540"/>
-        <w:divId w:val="2030140560"/>
-        <w:rPr>
-          <w:rFonts w:ascii="Yu Gothic UI" w:eastAsia="Yu Gothic UI" w:hAnsi="Yu Gothic UI" w:hint="eastAsia"/>
-          <w:color w:val="1E1E2E"/>
-          <w:sz w:val="22"/>
-          <w:szCs w:val="22"/>
-        </w:rPr>
-      </w:pPr>
-      <w:r>
-        <w:rPr>
-          <w:rFonts w:ascii="Yu Gothic UI" w:eastAsia="Yu Gothic UI" w:hAnsi="Yu Gothic UI" w:hint="eastAsia"/>
-          <w:color w:val="1E1E2E"/>
-          <w:sz w:val="22"/>
-          <w:szCs w:val="22"/>
-        </w:rPr>
-        <w:pict w14:anchorId="484AF631">
+        <w:divId w:val="83376929"/>
+        <w:rPr>
+          <w:rFonts w:ascii="Yu Gothic UI" w:eastAsia="Yu Gothic UI" w:hAnsi="Yu Gothic UI" w:hint="eastAsia"/>
+          <w:color w:val="1E1E2E"/>
+          <w:sz w:val="22"/>
+          <w:szCs w:val="22"/>
+        </w:rPr>
+      </w:pPr>
+      <w:r>
+        <w:rPr>
+          <w:rFonts w:ascii="Yu Gothic UI" w:eastAsia="Yu Gothic UI" w:hAnsi="Yu Gothic UI" w:hint="eastAsia"/>
+          <w:color w:val="1E1E2E"/>
+          <w:sz w:val="22"/>
+          <w:szCs w:val="22"/>
+        </w:rPr>
+        <w:pict w14:anchorId="430356A5">
           <v:rect id="_x0000_i1034" style="width:0;height:1.5pt" o:hralign="center" o:hrstd="t" o:hr="t" fillcolor="#a0a0a0" stroked="f">
             <v:textbox inset="5.85pt,.7pt,5.85pt,.7pt"/>
           </v:rect>
@@ -9503,7 +9486,7 @@
     <w:p>
       <w:pPr>
         <w:pStyle w:val="2"/>
-        <w:divId w:val="2030140560"/>
+        <w:divId w:val="83376929"/>
         <w:rPr>
           <w:rFonts w:ascii="Yu Gothic UI" w:eastAsia="Yu Gothic UI" w:hAnsi="Yu Gothic UI" w:hint="eastAsia"/>
         </w:rPr>
@@ -9519,7 +9502,7 @@
       <w:pPr>
         <w:pStyle w:val="Web"/>
         <w:ind w:left="540" w:right="540"/>
-        <w:divId w:val="2030140560"/>
+        <w:divId w:val="83376929"/>
         <w:rPr>
           <w:rFonts w:ascii="Yu Gothic UI" w:eastAsia="Yu Gothic UI" w:hAnsi="Yu Gothic UI" w:hint="eastAsia"/>
           <w:color w:val="1E1E2E"/>
@@ -9577,7 +9560,7 @@
       <w:pPr>
         <w:pStyle w:val="Web"/>
         <w:ind w:left="540" w:right="540"/>
-        <w:divId w:val="2030140560"/>
+        <w:divId w:val="83376929"/>
         <w:rPr>
           <w:rFonts w:ascii="Yu Gothic UI" w:eastAsia="Yu Gothic UI" w:hAnsi="Yu Gothic UI" w:hint="eastAsia"/>
           <w:color w:val="1E1E2E"/>
@@ -9645,7 +9628,7 @@
       <w:pPr>
         <w:pStyle w:val="Web"/>
         <w:ind w:left="540" w:right="540"/>
-        <w:divId w:val="2030140560"/>
+        <w:divId w:val="83376929"/>
         <w:rPr>
           <w:rFonts w:ascii="Yu Gothic UI" w:eastAsia="Yu Gothic UI" w:hAnsi="Yu Gothic UI" w:hint="eastAsia"/>
           <w:color w:val="1E1E2E"/>
@@ -9684,22 +9667,22 @@
     <w:p>
       <w:pPr>
         <w:spacing w:before="330" w:after="330"/>
-        <w:divId w:val="2030140560"/>
-        <w:rPr>
-          <w:rFonts w:ascii="Yu Gothic UI" w:eastAsia="Yu Gothic UI" w:hAnsi="Yu Gothic UI" w:hint="eastAsia"/>
-          <w:color w:val="1E1E2E"/>
-          <w:sz w:val="22"/>
-          <w:szCs w:val="22"/>
-        </w:rPr>
-      </w:pPr>
-      <w:r>
-        <w:rPr>
-          <w:rFonts w:ascii="Yu Gothic UI" w:eastAsia="Yu Gothic UI" w:hAnsi="Yu Gothic UI" w:hint="eastAsia"/>
-          <w:color w:val="1E1E2E"/>
-          <w:sz w:val="22"/>
-          <w:szCs w:val="22"/>
-        </w:rPr>
-        <w:pict w14:anchorId="7ED38333">
+        <w:divId w:val="83376929"/>
+        <w:rPr>
+          <w:rFonts w:ascii="Yu Gothic UI" w:eastAsia="Yu Gothic UI" w:hAnsi="Yu Gothic UI" w:hint="eastAsia"/>
+          <w:color w:val="1E1E2E"/>
+          <w:sz w:val="22"/>
+          <w:szCs w:val="22"/>
+        </w:rPr>
+      </w:pPr>
+      <w:r>
+        <w:rPr>
+          <w:rFonts w:ascii="Yu Gothic UI" w:eastAsia="Yu Gothic UI" w:hAnsi="Yu Gothic UI" w:hint="eastAsia"/>
+          <w:color w:val="1E1E2E"/>
+          <w:sz w:val="22"/>
+          <w:szCs w:val="22"/>
+        </w:rPr>
+        <w:pict w14:anchorId="721FD2E7">
           <v:rect id="_x0000_i1035" style="width:0;height:1.5pt" o:hralign="center" o:hrstd="t" o:hr="t" fillcolor="#a0a0a0" stroked="f">
             <v:textbox inset="5.85pt,.7pt,5.85pt,.7pt"/>
           </v:rect>
@@ -9709,7 +9692,7 @@
     <w:p>
       <w:pPr>
         <w:pStyle w:val="2"/>
-        <w:divId w:val="2030140560"/>
+        <w:divId w:val="83376929"/>
         <w:rPr>
           <w:rFonts w:ascii="Yu Gothic UI" w:eastAsia="Yu Gothic UI" w:hAnsi="Yu Gothic UI" w:hint="eastAsia"/>
         </w:rPr>
@@ -9725,7 +9708,7 @@
       <w:pPr>
         <w:pStyle w:val="Web"/>
         <w:ind w:left="540" w:right="540"/>
-        <w:divId w:val="2030140560"/>
+        <w:divId w:val="83376929"/>
         <w:rPr>
           <w:rFonts w:ascii="Yu Gothic UI" w:eastAsia="Yu Gothic UI" w:hAnsi="Yu Gothic UI" w:hint="eastAsia"/>
           <w:color w:val="1E1E2E"/>
@@ -9860,7 +9843,7 @@
       <w:pPr>
         <w:pStyle w:val="Web"/>
         <w:ind w:left="540" w:right="540"/>
-        <w:divId w:val="2030140560"/>
+        <w:divId w:val="83376929"/>
         <w:rPr>
           <w:rFonts w:ascii="Yu Gothic UI" w:eastAsia="Yu Gothic UI" w:hAnsi="Yu Gothic UI" w:hint="eastAsia"/>
           <w:color w:val="1E1E2E"/>
@@ -9976,8 +9959,7 @@
     <w:p>
       <w:pPr>
         <w:pStyle w:val="Web"/>
-        <w:ind w:left="540" w:right="540"/>
-        <w:divId w:val="2030140560"/>
+        <w:divId w:val="83376929"/>
         <w:rPr>
           <w:rFonts w:ascii="Yu Gothic UI" w:eastAsia="Yu Gothic UI" w:hAnsi="Yu Gothic UI" w:hint="eastAsia"/>
           <w:color w:val="1E1E2E"/>
@@ -10042,7 +10024,8 @@
     <w:p>
       <w:pPr>
         <w:pStyle w:val="Web"/>
-        <w:divId w:val="2030140560"/>
+        <w:ind w:left="540" w:right="540"/>
+        <w:divId w:val="83376929"/>
         <w:rPr>
           <w:rFonts w:ascii="Yu Gothic UI" w:eastAsia="Yu Gothic UI" w:hAnsi="Yu Gothic UI" w:hint="eastAsia"/>
           <w:color w:val="1E1E2E"/>
@@ -10238,7 +10221,7 @@
       <w:pPr>
         <w:pStyle w:val="Web"/>
         <w:ind w:left="540" w:right="540"/>
-        <w:divId w:val="2030140560"/>
+        <w:divId w:val="83376929"/>
         <w:rPr>
           <w:rFonts w:ascii="Yu Gothic UI" w:eastAsia="Yu Gothic UI" w:hAnsi="Yu Gothic UI" w:hint="eastAsia"/>
           <w:color w:val="1E1E2E"/>
@@ -10480,7 +10463,7 @@
       <w:pPr>
         <w:pStyle w:val="Web"/>
         <w:ind w:left="540" w:right="540"/>
-        <w:divId w:val="2030140560"/>
+        <w:divId w:val="83376929"/>
         <w:rPr>
           <w:rFonts w:ascii="Yu Gothic UI" w:eastAsia="Yu Gothic UI" w:hAnsi="Yu Gothic UI" w:hint="eastAsia"/>
           <w:color w:val="1E1E2E"/>
@@ -10582,7 +10565,7 @@
       <w:pPr>
         <w:pStyle w:val="Web"/>
         <w:ind w:left="540" w:right="540"/>
-        <w:divId w:val="2030140560"/>
+        <w:divId w:val="83376929"/>
         <w:rPr>
           <w:rFonts w:ascii="Yu Gothic UI" w:eastAsia="Yu Gothic UI" w:hAnsi="Yu Gothic UI" w:hint="eastAsia"/>
           <w:color w:val="1E1E2E"/>
@@ -10671,23 +10654,22 @@
     <w:p>
       <w:pPr>
         <w:spacing w:before="330" w:after="330"/>
-        <w:ind w:left="540" w:right="540"/>
-        <w:divId w:val="2030140560"/>
-        <w:rPr>
-          <w:rFonts w:ascii="Yu Gothic UI" w:eastAsia="Yu Gothic UI" w:hAnsi="Yu Gothic UI" w:hint="eastAsia"/>
-          <w:color w:val="1E1E2E"/>
-          <w:sz w:val="22"/>
-          <w:szCs w:val="22"/>
-        </w:rPr>
-      </w:pPr>
-      <w:r>
-        <w:rPr>
-          <w:rFonts w:ascii="Yu Gothic UI" w:eastAsia="Yu Gothic UI" w:hAnsi="Yu Gothic UI" w:hint="eastAsia"/>
-          <w:color w:val="1E1E2E"/>
-          <w:sz w:val="22"/>
-          <w:szCs w:val="22"/>
-        </w:rPr>
-        <w:pict w14:anchorId="135D2DB9">
+        <w:divId w:val="83376929"/>
+        <w:rPr>
+          <w:rFonts w:ascii="Yu Gothic UI" w:eastAsia="Yu Gothic UI" w:hAnsi="Yu Gothic UI" w:hint="eastAsia"/>
+          <w:color w:val="1E1E2E"/>
+          <w:sz w:val="22"/>
+          <w:szCs w:val="22"/>
+        </w:rPr>
+      </w:pPr>
+      <w:r>
+        <w:rPr>
+          <w:rFonts w:ascii="Yu Gothic UI" w:eastAsia="Yu Gothic UI" w:hAnsi="Yu Gothic UI" w:hint="eastAsia"/>
+          <w:color w:val="1E1E2E"/>
+          <w:sz w:val="22"/>
+          <w:szCs w:val="22"/>
+        </w:rPr>
+        <w:pict w14:anchorId="49EAD563">
           <v:rect id="_x0000_i1036" style="width:0;height:1.5pt" o:hralign="center" o:hrstd="t" o:hr="t" fillcolor="#a0a0a0" stroked="f">
             <v:textbox inset="5.85pt,.7pt,5.85pt,.7pt"/>
           </v:rect>
@@ -10697,7 +10679,7 @@
     <w:p>
       <w:pPr>
         <w:pStyle w:val="2"/>
-        <w:divId w:val="2030140560"/>
+        <w:divId w:val="83376929"/>
         <w:rPr>
           <w:rFonts w:ascii="Yu Gothic UI" w:eastAsia="Yu Gothic UI" w:hAnsi="Yu Gothic UI" w:hint="eastAsia"/>
         </w:rPr>
@@ -10712,8 +10694,7 @@
     <w:p>
       <w:pPr>
         <w:pStyle w:val="Web"/>
-        <w:ind w:left="540" w:right="540"/>
-        <w:divId w:val="2030140560"/>
+        <w:divId w:val="83376929"/>
         <w:rPr>
           <w:rFonts w:ascii="Yu Gothic UI" w:eastAsia="Yu Gothic UI" w:hAnsi="Yu Gothic UI" w:hint="eastAsia"/>
           <w:color w:val="1E1E2E"/>
@@ -10749,7 +10730,7 @@
         </w:numPr>
         <w:spacing w:before="45" w:after="45"/>
         <w:ind w:left="1260" w:right="540"/>
-        <w:divId w:val="2030140560"/>
+        <w:divId w:val="83376929"/>
         <w:rPr>
           <w:rFonts w:ascii="Yu Gothic UI" w:eastAsia="Yu Gothic UI" w:hAnsi="Yu Gothic UI" w:hint="eastAsia"/>
           <w:color w:val="1E1E2E"/>
@@ -10890,7 +10871,7 @@
       <w:pPr>
         <w:pStyle w:val="Web"/>
         <w:ind w:left="540" w:right="540"/>
-        <w:divId w:val="2030140560"/>
+        <w:divId w:val="83376929"/>
         <w:rPr>
           <w:rFonts w:ascii="Yu Gothic UI" w:eastAsia="Yu Gothic UI" w:hAnsi="Yu Gothic UI" w:hint="eastAsia"/>
           <w:color w:val="1E1E2E"/>
@@ -11051,22 +11032,22 @@
       <w:pPr>
         <w:spacing w:before="330" w:after="330"/>
         <w:ind w:left="540" w:right="540"/>
-        <w:divId w:val="2030140560"/>
-        <w:rPr>
-          <w:rFonts w:ascii="Yu Gothic UI" w:eastAsia="Yu Gothic UI" w:hAnsi="Yu Gothic UI" w:hint="eastAsia"/>
-          <w:color w:val="1E1E2E"/>
-          <w:sz w:val="22"/>
-          <w:szCs w:val="22"/>
-        </w:rPr>
-      </w:pPr>
-      <w:r>
-        <w:rPr>
-          <w:rFonts w:ascii="Yu Gothic UI" w:eastAsia="Yu Gothic UI" w:hAnsi="Yu Gothic UI" w:hint="eastAsia"/>
-          <w:color w:val="1E1E2E"/>
-          <w:sz w:val="22"/>
-          <w:szCs w:val="22"/>
-        </w:rPr>
-        <w:pict w14:anchorId="78AFBEC9">
+        <w:divId w:val="83376929"/>
+        <w:rPr>
+          <w:rFonts w:ascii="Yu Gothic UI" w:eastAsia="Yu Gothic UI" w:hAnsi="Yu Gothic UI" w:hint="eastAsia"/>
+          <w:color w:val="1E1E2E"/>
+          <w:sz w:val="22"/>
+          <w:szCs w:val="22"/>
+        </w:rPr>
+      </w:pPr>
+      <w:r>
+        <w:rPr>
+          <w:rFonts w:ascii="Yu Gothic UI" w:eastAsia="Yu Gothic UI" w:hAnsi="Yu Gothic UI" w:hint="eastAsia"/>
+          <w:color w:val="1E1E2E"/>
+          <w:sz w:val="22"/>
+          <w:szCs w:val="22"/>
+        </w:rPr>
+        <w:pict w14:anchorId="51091F57">
           <v:rect id="_x0000_i1037" style="width:0;height:1.5pt" o:hralign="center" o:hrstd="t" o:hr="t" fillcolor="#a0a0a0" stroked="f">
             <v:textbox inset="5.85pt,.7pt,5.85pt,.7pt"/>
           </v:rect>
@@ -11076,7 +11057,8 @@
     <w:p>
       <w:pPr>
         <w:pStyle w:val="Web"/>
-        <w:divId w:val="2030140560"/>
+        <w:ind w:left="540" w:right="540"/>
+        <w:divId w:val="83376929"/>
         <w:rPr>
           <w:rFonts w:ascii="Yu Gothic UI" w:eastAsia="Yu Gothic UI" w:hAnsi="Yu Gothic UI" w:hint="eastAsia"/>
           <w:color w:val="1E1E2E"/>
@@ -11224,235 +11206,9 @@
 <file path=word/numbering.xml><?xml version="1.0" encoding="utf-8"?>
 <w:numbering xmlns:wpc="http://schemas.microsoft.com/office/word/2010/wordprocessingCanvas" xmlns:cx="http://schemas.microsoft.com/office/drawing/2014/chartex" xmlns:cx1="http://schemas.microsoft.com/office/drawing/2015/9/8/chartex" xmlns:cx2="http://schemas.microsoft.com/office/drawing/2015/10/21/chartex" xmlns:cx3="http://schemas.microsoft.com/office/drawing/2016/5/9/chartex" xmlns:cx4="http://schemas.microsoft.com/office/drawing/2016/5/10/chartex" xmlns:cx5="http://schemas.microsoft.com/office/drawing/2016/5/11/chartex" xmlns:cx6="http://schemas.microsoft.com/office/drawing/2016/5/12/chartex" xmlns:cx7="http://schemas.microsoft.com/office/drawing/2016/5/13/chartex" xmlns:cx8="http://schemas.microsoft.com/office/drawing/2016/5/14/chartex" xmlns:mc="http://schemas.openxmlformats.org/markup-compatibility/2006" xmlns:aink="http://schemas.microsoft.com/office/drawing/2016/ink" xmlns:am3d="http://schemas.microsoft.com/office/drawing/2017/model3d" xmlns:o="urn:schemas-microsoft-com:office:office" xmlns:oel="http://schemas.microsoft.com/office/2019/extlst" xmlns:r="http://schemas.openxmlformats.org/officeDocument/2006/relationships" xmlns:m="http://schemas.openxmlformats.org/officeDocument/2006/math" xmlns:v="urn:schemas-microsoft-com:vml" xmlns:wp14="http://schemas.microsoft.com/office/word/2010/wordprocessingDrawing" xmlns:wp="http://schemas.openxmlformats.org/drawingml/2006/wordprocessingDrawing" xmlns:w10="urn:schemas-microsoft-com:office:word" xmlns:w="http://schemas.openxmlformats.org/wordprocessingml/2006/main" xmlns:w14="http://schemas.microsoft.com/office/word/2010/wordml" xmlns:w15="http://schemas.microsoft.com/office/word/2012/wordml" xmlns:w16cex="http://schemas.microsoft.com/office/word/2018/wordml/cex" xmlns:w16cid="http://schemas.microsoft.com/office/word/2016/wordml/cid" xmlns:w16="http://schemas.microsoft.com/office/word/2018/wordml" xmlns:w16du="http://schemas.microsoft.com/office/word/2023/wordml/word16du" xmlns:w16sdtdh="http://schemas.microsoft.com/office/word/2020/wordml/sdtdatahash" xmlns:w16sdtfl="http://schemas.microsoft.com/office/word/2024/wordml/sdtformatlock" xmlns:w16se="http://schemas.microsoft.com/office/word/2015/wordml/symex" xmlns:wpg="http://schemas.microsoft.com/office/word/2010/wordprocessingGroup" xmlns:wpi="http://schemas.microsoft.com/office/word/2010/wordprocessingInk" xmlns:wne="http://schemas.microsoft.com/office/word/2006/wordml" xmlns:wps="http://schemas.microsoft.com/office/word/2010/wordprocessingShape" mc:Ignorable="w14 w15 w16se w16cid w16 w16cex w16sdtdh w16sdtfl w16du wp14">
   <w:abstractNum w:abstractNumId="0" w15:restartNumberingAfterBreak="0">
-    <w:nsid w:val="02302125"/>
+    <w:nsid w:val="1B6F362D"/>
     <w:multiLevelType w:val="multilevel"/>
-    <w:tmpl w:val="84A40CFC"/>
-    <w:lvl w:ilvl="0">
-      <w:start w:val="1"/>
-      <w:numFmt w:val="decimal"/>
-      <w:lvlText w:val="%1."/>
-      <w:lvlJc w:val="left"/>
-      <w:pPr>
-        <w:tabs>
-          <w:tab w:val="num" w:pos="720"/>
-        </w:tabs>
-        <w:ind w:left="720" w:hanging="360"/>
-      </w:pPr>
-    </w:lvl>
-    <w:lvl w:ilvl="1" w:tentative="1">
-      <w:start w:val="1"/>
-      <w:numFmt w:val="decimal"/>
-      <w:lvlText w:val="%2."/>
-      <w:lvlJc w:val="left"/>
-      <w:pPr>
-        <w:tabs>
-          <w:tab w:val="num" w:pos="1440"/>
-        </w:tabs>
-        <w:ind w:left="1440" w:hanging="360"/>
-      </w:pPr>
-    </w:lvl>
-    <w:lvl w:ilvl="2" w:tentative="1">
-      <w:start w:val="1"/>
-      <w:numFmt w:val="decimal"/>
-      <w:lvlText w:val="%3."/>
-      <w:lvlJc w:val="left"/>
-      <w:pPr>
-        <w:tabs>
-          <w:tab w:val="num" w:pos="2160"/>
-        </w:tabs>
-        <w:ind w:left="2160" w:hanging="360"/>
-      </w:pPr>
-    </w:lvl>
-    <w:lvl w:ilvl="3" w:tentative="1">
-      <w:start w:val="1"/>
-      <w:numFmt w:val="decimal"/>
-      <w:lvlText w:val="%4."/>
-      <w:lvlJc w:val="left"/>
-      <w:pPr>
-        <w:tabs>
-          <w:tab w:val="num" w:pos="2880"/>
-        </w:tabs>
-        <w:ind w:left="2880" w:hanging="360"/>
-      </w:pPr>
-    </w:lvl>
-    <w:lvl w:ilvl="4" w:tentative="1">
-      <w:start w:val="1"/>
-      <w:numFmt w:val="decimal"/>
-      <w:lvlText w:val="%5."/>
-      <w:lvlJc w:val="left"/>
-      <w:pPr>
-        <w:tabs>
-          <w:tab w:val="num" w:pos="3600"/>
-        </w:tabs>
-        <w:ind w:left="3600" w:hanging="360"/>
-      </w:pPr>
-    </w:lvl>
-    <w:lvl w:ilvl="5" w:tentative="1">
-      <w:start w:val="1"/>
-      <w:numFmt w:val="decimal"/>
-      <w:lvlText w:val="%6."/>
-      <w:lvlJc w:val="left"/>
-      <w:pPr>
-        <w:tabs>
-          <w:tab w:val="num" w:pos="4320"/>
-        </w:tabs>
-        <w:ind w:left="4320" w:hanging="360"/>
-      </w:pPr>
-    </w:lvl>
-    <w:lvl w:ilvl="6" w:tentative="1">
-      <w:start w:val="1"/>
-      <w:numFmt w:val="decimal"/>
-      <w:lvlText w:val="%7."/>
-      <w:lvlJc w:val="left"/>
-      <w:pPr>
-        <w:tabs>
-          <w:tab w:val="num" w:pos="5040"/>
-        </w:tabs>
-        <w:ind w:left="5040" w:hanging="360"/>
-      </w:pPr>
-    </w:lvl>
-    <w:lvl w:ilvl="7" w:tentative="1">
-      <w:start w:val="1"/>
-      <w:numFmt w:val="decimal"/>
-      <w:lvlText w:val="%8."/>
-      <w:lvlJc w:val="left"/>
-      <w:pPr>
-        <w:tabs>
-          <w:tab w:val="num" w:pos="5760"/>
-        </w:tabs>
-        <w:ind w:left="5760" w:hanging="360"/>
-      </w:pPr>
-    </w:lvl>
-    <w:lvl w:ilvl="8" w:tentative="1">
-      <w:start w:val="1"/>
-      <w:numFmt w:val="decimal"/>
-      <w:lvlText w:val="%9."/>
-      <w:lvlJc w:val="left"/>
-      <w:pPr>
-        <w:tabs>
-          <w:tab w:val="num" w:pos="6480"/>
-        </w:tabs>
-        <w:ind w:left="6480" w:hanging="360"/>
-      </w:pPr>
-    </w:lvl>
-  </w:abstractNum>
-  <w:abstractNum w:abstractNumId="1" w15:restartNumberingAfterBreak="0">
-    <w:nsid w:val="151C0271"/>
-    <w:multiLevelType w:val="multilevel"/>
-    <w:tmpl w:val="C1F67854"/>
-    <w:lvl w:ilvl="0">
-      <w:start w:val="1"/>
-      <w:numFmt w:val="decimal"/>
-      <w:lvlText w:val="%1."/>
-      <w:lvlJc w:val="left"/>
-      <w:pPr>
-        <w:tabs>
-          <w:tab w:val="num" w:pos="720"/>
-        </w:tabs>
-        <w:ind w:left="720" w:hanging="360"/>
-      </w:pPr>
-    </w:lvl>
-    <w:lvl w:ilvl="1" w:tentative="1">
-      <w:start w:val="1"/>
-      <w:numFmt w:val="decimal"/>
-      <w:lvlText w:val="%2."/>
-      <w:lvlJc w:val="left"/>
-      <w:pPr>
-        <w:tabs>
-          <w:tab w:val="num" w:pos="1440"/>
-        </w:tabs>
-        <w:ind w:left="1440" w:hanging="360"/>
-      </w:pPr>
-    </w:lvl>
-    <w:lvl w:ilvl="2" w:tentative="1">
-      <w:start w:val="1"/>
-      <w:numFmt w:val="decimal"/>
-      <w:lvlText w:val="%3."/>
-      <w:lvlJc w:val="left"/>
-      <w:pPr>
-        <w:tabs>
-          <w:tab w:val="num" w:pos="2160"/>
-        </w:tabs>
-        <w:ind w:left="2160" w:hanging="360"/>
-      </w:pPr>
-    </w:lvl>
-    <w:lvl w:ilvl="3" w:tentative="1">
-      <w:start w:val="1"/>
-      <w:numFmt w:val="decimal"/>
-      <w:lvlText w:val="%4."/>
-      <w:lvlJc w:val="left"/>
-      <w:pPr>
-        <w:tabs>
-          <w:tab w:val="num" w:pos="2880"/>
-        </w:tabs>
-        <w:ind w:left="2880" w:hanging="360"/>
-      </w:pPr>
-    </w:lvl>
-    <w:lvl w:ilvl="4" w:tentative="1">
-      <w:start w:val="1"/>
-      <w:numFmt w:val="decimal"/>
-      <w:lvlText w:val="%5."/>
-      <w:lvlJc w:val="left"/>
-      <w:pPr>
-        <w:tabs>
-          <w:tab w:val="num" w:pos="3600"/>
-        </w:tabs>
-        <w:ind w:left="3600" w:hanging="360"/>
-      </w:pPr>
-    </w:lvl>
-    <w:lvl w:ilvl="5" w:tentative="1">
-      <w:start w:val="1"/>
-      <w:numFmt w:val="decimal"/>
-      <w:lvlText w:val="%6."/>
-      <w:lvlJc w:val="left"/>
-      <w:pPr>
-        <w:tabs>
-          <w:tab w:val="num" w:pos="4320"/>
-        </w:tabs>
-        <w:ind w:left="4320" w:hanging="360"/>
-      </w:pPr>
-    </w:lvl>
-    <w:lvl w:ilvl="6" w:tentative="1">
-      <w:start w:val="1"/>
-      <w:numFmt w:val="decimal"/>
-      <w:lvlText w:val="%7."/>
-      <w:lvlJc w:val="left"/>
-      <w:pPr>
-        <w:tabs>
-          <w:tab w:val="num" w:pos="5040"/>
-        </w:tabs>
-        <w:ind w:left="5040" w:hanging="360"/>
-      </w:pPr>
-    </w:lvl>
-    <w:lvl w:ilvl="7" w:tentative="1">
-      <w:start w:val="1"/>
-      <w:numFmt w:val="decimal"/>
-      <w:lvlText w:val="%8."/>
-      <w:lvlJc w:val="left"/>
-      <w:pPr>
-        <w:tabs>
-          <w:tab w:val="num" w:pos="5760"/>
-        </w:tabs>
-        <w:ind w:left="5760" w:hanging="360"/>
-      </w:pPr>
-    </w:lvl>
-    <w:lvl w:ilvl="8" w:tentative="1">
-      <w:start w:val="1"/>
-      <w:numFmt w:val="decimal"/>
-      <w:lvlText w:val="%9."/>
-      <w:lvlJc w:val="left"/>
-      <w:pPr>
-        <w:tabs>
-          <w:tab w:val="num" w:pos="6480"/>
-        </w:tabs>
-        <w:ind w:left="6480" w:hanging="360"/>
-      </w:pPr>
-    </w:lvl>
-  </w:abstractNum>
-  <w:abstractNum w:abstractNumId="2" w15:restartNumberingAfterBreak="0">
-    <w:nsid w:val="22944760"/>
-    <w:multiLevelType w:val="multilevel"/>
-    <w:tmpl w:val="ECEEE744"/>
+    <w:tmpl w:val="3F668C40"/>
     <w:lvl w:ilvl="0">
       <w:start w:val="1"/>
       <w:numFmt w:val="bullet"/>
@@ -11598,10 +11354,10 @@
       </w:rPr>
     </w:lvl>
   </w:abstractNum>
-  <w:abstractNum w:abstractNumId="3" w15:restartNumberingAfterBreak="0">
-    <w:nsid w:val="2C200DC7"/>
+  <w:abstractNum w:abstractNumId="1" w15:restartNumberingAfterBreak="0">
+    <w:nsid w:val="1FFD53DF"/>
     <w:multiLevelType w:val="multilevel"/>
-    <w:tmpl w:val="5D781F5E"/>
+    <w:tmpl w:val="9BB28478"/>
     <w:lvl w:ilvl="0">
       <w:start w:val="1"/>
       <w:numFmt w:val="bullet"/>
@@ -11747,10 +11503,10 @@
       </w:rPr>
     </w:lvl>
   </w:abstractNum>
-  <w:abstractNum w:abstractNumId="4" w15:restartNumberingAfterBreak="0">
-    <w:nsid w:val="40D62676"/>
+  <w:abstractNum w:abstractNumId="2" w15:restartNumberingAfterBreak="0">
+    <w:nsid w:val="34067D5B"/>
     <w:multiLevelType w:val="multilevel"/>
-    <w:tmpl w:val="73389326"/>
+    <w:tmpl w:val="6424485E"/>
     <w:lvl w:ilvl="0">
       <w:start w:val="1"/>
       <w:numFmt w:val="bullet"/>
@@ -11896,10 +11652,10 @@
       </w:rPr>
     </w:lvl>
   </w:abstractNum>
-  <w:abstractNum w:abstractNumId="5" w15:restartNumberingAfterBreak="0">
-    <w:nsid w:val="48576511"/>
+  <w:abstractNum w:abstractNumId="3" w15:restartNumberingAfterBreak="0">
+    <w:nsid w:val="4081569E"/>
     <w:multiLevelType w:val="multilevel"/>
-    <w:tmpl w:val="EF089DB2"/>
+    <w:tmpl w:val="66927662"/>
     <w:lvl w:ilvl="0">
       <w:start w:val="1"/>
       <w:numFmt w:val="bullet"/>
@@ -12045,10 +11801,10 @@
       </w:rPr>
     </w:lvl>
   </w:abstractNum>
-  <w:abstractNum w:abstractNumId="6" w15:restartNumberingAfterBreak="0">
-    <w:nsid w:val="4D8705E9"/>
+  <w:abstractNum w:abstractNumId="4" w15:restartNumberingAfterBreak="0">
+    <w:nsid w:val="52D57523"/>
     <w:multiLevelType w:val="multilevel"/>
-    <w:tmpl w:val="FCBEA93E"/>
+    <w:tmpl w:val="051407EE"/>
     <w:lvl w:ilvl="0">
       <w:start w:val="1"/>
       <w:numFmt w:val="bullet"/>
@@ -12194,10 +11950,123 @@
       </w:rPr>
     </w:lvl>
   </w:abstractNum>
-  <w:abstractNum w:abstractNumId="7" w15:restartNumberingAfterBreak="0">
-    <w:nsid w:val="5E940FFE"/>
+  <w:abstractNum w:abstractNumId="5" w15:restartNumberingAfterBreak="0">
+    <w:nsid w:val="538677B7"/>
     <w:multiLevelType w:val="multilevel"/>
-    <w:tmpl w:val="87B6E10C"/>
+    <w:tmpl w:val="F392C396"/>
+    <w:lvl w:ilvl="0">
+      <w:start w:val="1"/>
+      <w:numFmt w:val="decimal"/>
+      <w:lvlText w:val="%1."/>
+      <w:lvlJc w:val="left"/>
+      <w:pPr>
+        <w:tabs>
+          <w:tab w:val="num" w:pos="720"/>
+        </w:tabs>
+        <w:ind w:left="720" w:hanging="360"/>
+      </w:pPr>
+    </w:lvl>
+    <w:lvl w:ilvl="1" w:tentative="1">
+      <w:start w:val="1"/>
+      <w:numFmt w:val="decimal"/>
+      <w:lvlText w:val="%2."/>
+      <w:lvlJc w:val="left"/>
+      <w:pPr>
+        <w:tabs>
+          <w:tab w:val="num" w:pos="1440"/>
+        </w:tabs>
+        <w:ind w:left="1440" w:hanging="360"/>
+      </w:pPr>
+    </w:lvl>
+    <w:lvl w:ilvl="2" w:tentative="1">
+      <w:start w:val="1"/>
+      <w:numFmt w:val="decimal"/>
+      <w:lvlText w:val="%3."/>
+      <w:lvlJc w:val="left"/>
+      <w:pPr>
+        <w:tabs>
+          <w:tab w:val="num" w:pos="2160"/>
+        </w:tabs>
+        <w:ind w:left="2160" w:hanging="360"/>
+      </w:pPr>
+    </w:lvl>
+    <w:lvl w:ilvl="3" w:tentative="1">
+      <w:start w:val="1"/>
+      <w:numFmt w:val="decimal"/>
+      <w:lvlText w:val="%4."/>
+      <w:lvlJc w:val="left"/>
+      <w:pPr>
+        <w:tabs>
+          <w:tab w:val="num" w:pos="2880"/>
+        </w:tabs>
+        <w:ind w:left="2880" w:hanging="360"/>
+      </w:pPr>
+    </w:lvl>
+    <w:lvl w:ilvl="4" w:tentative="1">
+      <w:start w:val="1"/>
+      <w:numFmt w:val="decimal"/>
+      <w:lvlText w:val="%5."/>
+      <w:lvlJc w:val="left"/>
+      <w:pPr>
+        <w:tabs>
+          <w:tab w:val="num" w:pos="3600"/>
+        </w:tabs>
+        <w:ind w:left="3600" w:hanging="360"/>
+      </w:pPr>
+    </w:lvl>
+    <w:lvl w:ilvl="5" w:tentative="1">
+      <w:start w:val="1"/>
+      <w:numFmt w:val="decimal"/>
+      <w:lvlText w:val="%6."/>
+      <w:lvlJc w:val="left"/>
+      <w:pPr>
+        <w:tabs>
+          <w:tab w:val="num" w:pos="4320"/>
+        </w:tabs>
+        <w:ind w:left="4320" w:hanging="360"/>
+      </w:pPr>
+    </w:lvl>
+    <w:lvl w:ilvl="6" w:tentative="1">
+      <w:start w:val="1"/>
+      <w:numFmt w:val="decimal"/>
+      <w:lvlText w:val="%7."/>
+      <w:lvlJc w:val="left"/>
+      <w:pPr>
+        <w:tabs>
+          <w:tab w:val="num" w:pos="5040"/>
+        </w:tabs>
+        <w:ind w:left="5040" w:hanging="360"/>
+      </w:pPr>
+    </w:lvl>
+    <w:lvl w:ilvl="7" w:tentative="1">
+      <w:start w:val="1"/>
+      <w:numFmt w:val="decimal"/>
+      <w:lvlText w:val="%8."/>
+      <w:lvlJc w:val="left"/>
+      <w:pPr>
+        <w:tabs>
+          <w:tab w:val="num" w:pos="5760"/>
+        </w:tabs>
+        <w:ind w:left="5760" w:hanging="360"/>
+      </w:pPr>
+    </w:lvl>
+    <w:lvl w:ilvl="8" w:tentative="1">
+      <w:start w:val="1"/>
+      <w:numFmt w:val="decimal"/>
+      <w:lvlText w:val="%9."/>
+      <w:lvlJc w:val="left"/>
+      <w:pPr>
+        <w:tabs>
+          <w:tab w:val="num" w:pos="6480"/>
+        </w:tabs>
+        <w:ind w:left="6480" w:hanging="360"/>
+      </w:pPr>
+    </w:lvl>
+  </w:abstractNum>
+  <w:abstractNum w:abstractNumId="6" w15:restartNumberingAfterBreak="0">
+    <w:nsid w:val="5BD25203"/>
+    <w:multiLevelType w:val="multilevel"/>
+    <w:tmpl w:val="02B89CC2"/>
     <w:lvl w:ilvl="0">
       <w:start w:val="1"/>
       <w:numFmt w:val="bullet"/>
@@ -12343,10 +12212,10 @@
       </w:rPr>
     </w:lvl>
   </w:abstractNum>
-  <w:abstractNum w:abstractNumId="8" w15:restartNumberingAfterBreak="0">
-    <w:nsid w:val="74D97D88"/>
+  <w:abstractNum w:abstractNumId="7" w15:restartNumberingAfterBreak="0">
+    <w:nsid w:val="5D857A7E"/>
     <w:multiLevelType w:val="multilevel"/>
-    <w:tmpl w:val="32903ACA"/>
+    <w:tmpl w:val="0BE81C92"/>
     <w:lvl w:ilvl="0">
       <w:start w:val="1"/>
       <w:numFmt w:val="bullet"/>
@@ -12492,32 +12361,145 @@
       </w:rPr>
     </w:lvl>
   </w:abstractNum>
-  <w:num w:numId="1" w16cid:durableId="389153622">
+  <w:abstractNum w:abstractNumId="8" w15:restartNumberingAfterBreak="0">
+    <w:nsid w:val="666218C2"/>
+    <w:multiLevelType w:val="multilevel"/>
+    <w:tmpl w:val="EDDCBBAE"/>
+    <w:lvl w:ilvl="0">
+      <w:start w:val="1"/>
+      <w:numFmt w:val="decimal"/>
+      <w:lvlText w:val="%1."/>
+      <w:lvlJc w:val="left"/>
+      <w:pPr>
+        <w:tabs>
+          <w:tab w:val="num" w:pos="720"/>
+        </w:tabs>
+        <w:ind w:left="720" w:hanging="360"/>
+      </w:pPr>
+    </w:lvl>
+    <w:lvl w:ilvl="1" w:tentative="1">
+      <w:start w:val="1"/>
+      <w:numFmt w:val="decimal"/>
+      <w:lvlText w:val="%2."/>
+      <w:lvlJc w:val="left"/>
+      <w:pPr>
+        <w:tabs>
+          <w:tab w:val="num" w:pos="1440"/>
+        </w:tabs>
+        <w:ind w:left="1440" w:hanging="360"/>
+      </w:pPr>
+    </w:lvl>
+    <w:lvl w:ilvl="2" w:tentative="1">
+      <w:start w:val="1"/>
+      <w:numFmt w:val="decimal"/>
+      <w:lvlText w:val="%3."/>
+      <w:lvlJc w:val="left"/>
+      <w:pPr>
+        <w:tabs>
+          <w:tab w:val="num" w:pos="2160"/>
+        </w:tabs>
+        <w:ind w:left="2160" w:hanging="360"/>
+      </w:pPr>
+    </w:lvl>
+    <w:lvl w:ilvl="3" w:tentative="1">
+      <w:start w:val="1"/>
+      <w:numFmt w:val="decimal"/>
+      <w:lvlText w:val="%4."/>
+      <w:lvlJc w:val="left"/>
+      <w:pPr>
+        <w:tabs>
+          <w:tab w:val="num" w:pos="2880"/>
+        </w:tabs>
+        <w:ind w:left="2880" w:hanging="360"/>
+      </w:pPr>
+    </w:lvl>
+    <w:lvl w:ilvl="4" w:tentative="1">
+      <w:start w:val="1"/>
+      <w:numFmt w:val="decimal"/>
+      <w:lvlText w:val="%5."/>
+      <w:lvlJc w:val="left"/>
+      <w:pPr>
+        <w:tabs>
+          <w:tab w:val="num" w:pos="3600"/>
+        </w:tabs>
+        <w:ind w:left="3600" w:hanging="360"/>
+      </w:pPr>
+    </w:lvl>
+    <w:lvl w:ilvl="5" w:tentative="1">
+      <w:start w:val="1"/>
+      <w:numFmt w:val="decimal"/>
+      <w:lvlText w:val="%6."/>
+      <w:lvlJc w:val="left"/>
+      <w:pPr>
+        <w:tabs>
+          <w:tab w:val="num" w:pos="4320"/>
+        </w:tabs>
+        <w:ind w:left="4320" w:hanging="360"/>
+      </w:pPr>
+    </w:lvl>
+    <w:lvl w:ilvl="6" w:tentative="1">
+      <w:start w:val="1"/>
+      <w:numFmt w:val="decimal"/>
+      <w:lvlText w:val="%7."/>
+      <w:lvlJc w:val="left"/>
+      <w:pPr>
+        <w:tabs>
+          <w:tab w:val="num" w:pos="5040"/>
+        </w:tabs>
+        <w:ind w:left="5040" w:hanging="360"/>
+      </w:pPr>
+    </w:lvl>
+    <w:lvl w:ilvl="7" w:tentative="1">
+      <w:start w:val="1"/>
+      <w:numFmt w:val="decimal"/>
+      <w:lvlText w:val="%8."/>
+      <w:lvlJc w:val="left"/>
+      <w:pPr>
+        <w:tabs>
+          <w:tab w:val="num" w:pos="5760"/>
+        </w:tabs>
+        <w:ind w:left="5760" w:hanging="360"/>
+      </w:pPr>
+    </w:lvl>
+    <w:lvl w:ilvl="8" w:tentative="1">
+      <w:start w:val="1"/>
+      <w:numFmt w:val="decimal"/>
+      <w:lvlText w:val="%9."/>
+      <w:lvlJc w:val="left"/>
+      <w:pPr>
+        <w:tabs>
+          <w:tab w:val="num" w:pos="6480"/>
+        </w:tabs>
+        <w:ind w:left="6480" w:hanging="360"/>
+      </w:pPr>
+    </w:lvl>
+  </w:abstractNum>
+  <w:num w:numId="1" w16cid:durableId="1609041610">
+    <w:abstractNumId w:val="2"/>
+  </w:num>
+  <w:num w:numId="2" w16cid:durableId="1943490547">
     <w:abstractNumId w:val="5"/>
   </w:num>
-  <w:num w:numId="2" w16cid:durableId="1624575468">
-    <w:abstractNumId w:val="1"/>
+  <w:num w:numId="3" w16cid:durableId="1541674510">
+    <w:abstractNumId w:val="4"/>
   </w:num>
-  <w:num w:numId="3" w16cid:durableId="632250198">
+  <w:num w:numId="4" w16cid:durableId="707607481">
+    <w:abstractNumId w:val="7"/>
+  </w:num>
+  <w:num w:numId="5" w16cid:durableId="1311792625">
+    <w:abstractNumId w:val="8"/>
+  </w:num>
+  <w:num w:numId="6" w16cid:durableId="2002657712">
+    <w:abstractNumId w:val="3"/>
+  </w:num>
+  <w:num w:numId="7" w16cid:durableId="124013158">
+    <w:abstractNumId w:val="0"/>
+  </w:num>
+  <w:num w:numId="8" w16cid:durableId="598947279">
     <w:abstractNumId w:val="6"/>
   </w:num>
-  <w:num w:numId="4" w16cid:durableId="1347826023">
-    <w:abstractNumId w:val="8"/>
-  </w:num>
-  <w:num w:numId="5" w16cid:durableId="1354720617">
-    <w:abstractNumId w:val="0"/>
-  </w:num>
-  <w:num w:numId="6" w16cid:durableId="1426876301">
-    <w:abstractNumId w:val="3"/>
-  </w:num>
-  <w:num w:numId="7" w16cid:durableId="410466612">
-    <w:abstractNumId w:val="7"/>
-  </w:num>
-  <w:num w:numId="8" w16cid:durableId="1408458570">
-    <w:abstractNumId w:val="4"/>
-  </w:num>
-  <w:num w:numId="9" w16cid:durableId="1267925381">
-    <w:abstractNumId w:val="2"/>
+  <w:num w:numId="9" w16cid:durableId="701512861">
+    <w:abstractNumId w:val="1"/>
   </w:num>
 </w:numbering>
 </file>
@@ -13174,7 +13156,7 @@
     <w:link w:val="a8"/>
     <w:uiPriority w:val="99"/>
     <w:unhideWhenUsed/>
-    <w:rsid w:val="008334A5"/>
+    <w:rsid w:val="00521678"/>
     <w:pPr>
       <w:tabs>
         <w:tab w:val="center" w:pos="4252"/>
@@ -13188,7 +13170,7 @@
     <w:basedOn w:val="a0"/>
     <w:link w:val="a7"/>
     <w:uiPriority w:val="99"/>
-    <w:rsid w:val="008334A5"/>
+    <w:rsid w:val="00521678"/>
     <w:rPr>
       <w:rFonts w:ascii="ＭＳ Ｐゴシック" w:eastAsia="ＭＳ Ｐゴシック" w:hAnsi="ＭＳ Ｐゴシック" w:cs="ＭＳ Ｐゴシック"/>
       <w:sz w:val="24"/>
@@ -13201,7 +13183,7 @@
     <w:link w:val="aa"/>
     <w:uiPriority w:val="99"/>
     <w:unhideWhenUsed/>
-    <w:rsid w:val="008334A5"/>
+    <w:rsid w:val="00521678"/>
     <w:pPr>
       <w:tabs>
         <w:tab w:val="center" w:pos="4252"/>
@@ -13215,7 +13197,7 @@
     <w:basedOn w:val="a0"/>
     <w:link w:val="a9"/>
     <w:uiPriority w:val="99"/>
-    <w:rsid w:val="008334A5"/>
+    <w:rsid w:val="00521678"/>
     <w:rPr>
       <w:rFonts w:ascii="ＭＳ Ｐゴシック" w:eastAsia="ＭＳ Ｐゴシック" w:hAnsi="ＭＳ Ｐゴシック" w:cs="ＭＳ Ｐゴシック"/>
       <w:sz w:val="24"/>

</xml_diff>